<commit_message>
BB84 toolset, measurement chain and user guide
docs/QAcraft-Guide.docx — the full English user guide.
src/main/java/com/qacraft/manager/ToolManager.java — named quantum tool
  sets (/qacraft tools, /qacraft item) and the right-click handlers that
  place apparatus in the world.
src/main/java/com/qacraft/manager/SenderManager.java — Alice's BB84
  transmitter: double-chest guides, filter and bit-pane rows, the
  27-photon transmission loop.
src/main/java/com/qacraft/manager/GateManager.java — Bob's BB84
  measurement gate: measures passing photons and writes the result
  panes into its double chest.
src/main/java/com/qacraft/manager/InteractiveTutorial.java — gated,
  step-by-step guided walkthrough inside the built tutorial hall.
</commit_message>
<xml_diff>
--- a/docs/QAcraft-Guide.docx
+++ b/docs/QAcraft-Guide.docx
@@ -150,7 +150,7 @@
       <w:r>
         <w:fldChar w:fldCharType="separate"/>
       </w:r>
-      <w:hyperlink w:anchor="_Toc234331100" w:history="1">
+      <w:hyperlink w:anchor="_Toc234332855" w:history="1">
         <w:r>
           <w:rPr>
             <w:rStyle w:val="Hypertextovodkaz"/>
@@ -177,7 +177,7 @@
             <w:noProof/>
             <w:webHidden/>
           </w:rPr>
-          <w:instrText xml:space="preserve"> PAGEREF _Toc234331100 \h </w:instrText>
+          <w:instrText xml:space="preserve"> PAGEREF _Toc234332855 \h </w:instrText>
         </w:r>
         <w:r>
           <w:rPr>
@@ -223,7 +223,7 @@
           <w14:ligatures w14:val="standardContextual"/>
         </w:rPr>
       </w:pPr>
-      <w:hyperlink w:anchor="_Toc234331101" w:history="1">
+      <w:hyperlink w:anchor="_Toc234332856" w:history="1">
         <w:r>
           <w:rPr>
             <w:rStyle w:val="Hypertextovodkaz"/>
@@ -250,7 +250,7 @@
             <w:noProof/>
             <w:webHidden/>
           </w:rPr>
-          <w:instrText xml:space="preserve"> PAGEREF _Toc234331101 \h </w:instrText>
+          <w:instrText xml:space="preserve"> PAGEREF _Toc234332856 \h </w:instrText>
         </w:r>
         <w:r>
           <w:rPr>
@@ -296,7 +296,7 @@
           <w14:ligatures w14:val="standardContextual"/>
         </w:rPr>
       </w:pPr>
-      <w:hyperlink w:anchor="_Toc234331102" w:history="1">
+      <w:hyperlink w:anchor="_Toc234332857" w:history="1">
         <w:r>
           <w:rPr>
             <w:rStyle w:val="Hypertextovodkaz"/>
@@ -323,7 +323,7 @@
             <w:noProof/>
             <w:webHidden/>
           </w:rPr>
-          <w:instrText xml:space="preserve"> PAGEREF _Toc234331102 \h </w:instrText>
+          <w:instrText xml:space="preserve"> PAGEREF _Toc234332857 \h </w:instrText>
         </w:r>
         <w:r>
           <w:rPr>
@@ -369,7 +369,7 @@
           <w14:ligatures w14:val="standardContextual"/>
         </w:rPr>
       </w:pPr>
-      <w:hyperlink w:anchor="_Toc234331103" w:history="1">
+      <w:hyperlink w:anchor="_Toc234332858" w:history="1">
         <w:r>
           <w:rPr>
             <w:rStyle w:val="Hypertextovodkaz"/>
@@ -396,7 +396,7 @@
             <w:noProof/>
             <w:webHidden/>
           </w:rPr>
-          <w:instrText xml:space="preserve"> PAGEREF _Toc234331103 \h </w:instrText>
+          <w:instrText xml:space="preserve"> PAGEREF _Toc234332858 \h </w:instrText>
         </w:r>
         <w:r>
           <w:rPr>
@@ -442,7 +442,7 @@
           <w14:ligatures w14:val="standardContextual"/>
         </w:rPr>
       </w:pPr>
-      <w:hyperlink w:anchor="_Toc234331104" w:history="1">
+      <w:hyperlink w:anchor="_Toc234332859" w:history="1">
         <w:r>
           <w:rPr>
             <w:rStyle w:val="Hypertextovodkaz"/>
@@ -469,7 +469,7 @@
             <w:noProof/>
             <w:webHidden/>
           </w:rPr>
-          <w:instrText xml:space="preserve"> PAGEREF _Toc234331104 \h </w:instrText>
+          <w:instrText xml:space="preserve"> PAGEREF _Toc234332859 \h </w:instrText>
         </w:r>
         <w:r>
           <w:rPr>
@@ -515,7 +515,7 @@
           <w14:ligatures w14:val="standardContextual"/>
         </w:rPr>
       </w:pPr>
-      <w:hyperlink w:anchor="_Toc234331105" w:history="1">
+      <w:hyperlink w:anchor="_Toc234332860" w:history="1">
         <w:r>
           <w:rPr>
             <w:rStyle w:val="Hypertextovodkaz"/>
@@ -542,7 +542,7 @@
             <w:noProof/>
             <w:webHidden/>
           </w:rPr>
-          <w:instrText xml:space="preserve"> PAGEREF _Toc234331105 \h </w:instrText>
+          <w:instrText xml:space="preserve"> PAGEREF _Toc234332860 \h </w:instrText>
         </w:r>
         <w:r>
           <w:rPr>
@@ -588,7 +588,7 @@
           <w14:ligatures w14:val="standardContextual"/>
         </w:rPr>
       </w:pPr>
-      <w:hyperlink w:anchor="_Toc234331106" w:history="1">
+      <w:hyperlink w:anchor="_Toc234332861" w:history="1">
         <w:r>
           <w:rPr>
             <w:rStyle w:val="Hypertextovodkaz"/>
@@ -615,7 +615,7 @@
             <w:noProof/>
             <w:webHidden/>
           </w:rPr>
-          <w:instrText xml:space="preserve"> PAGEREF _Toc234331106 \h </w:instrText>
+          <w:instrText xml:space="preserve"> PAGEREF _Toc234332861 \h </w:instrText>
         </w:r>
         <w:r>
           <w:rPr>
@@ -661,7 +661,7 @@
           <w14:ligatures w14:val="standardContextual"/>
         </w:rPr>
       </w:pPr>
-      <w:hyperlink w:anchor="_Toc234331107" w:history="1">
+      <w:hyperlink w:anchor="_Toc234332862" w:history="1">
         <w:r>
           <w:rPr>
             <w:rStyle w:val="Hypertextovodkaz"/>
@@ -688,7 +688,7 @@
             <w:noProof/>
             <w:webHidden/>
           </w:rPr>
-          <w:instrText xml:space="preserve"> PAGEREF _Toc234331107 \h </w:instrText>
+          <w:instrText xml:space="preserve"> PAGEREF _Toc234332862 \h </w:instrText>
         </w:r>
         <w:r>
           <w:rPr>
@@ -734,7 +734,7 @@
           <w14:ligatures w14:val="standardContextual"/>
         </w:rPr>
       </w:pPr>
-      <w:hyperlink w:anchor="_Toc234331108" w:history="1">
+      <w:hyperlink w:anchor="_Toc234332863" w:history="1">
         <w:r>
           <w:rPr>
             <w:rStyle w:val="Hypertextovodkaz"/>
@@ -761,7 +761,7 @@
             <w:noProof/>
             <w:webHidden/>
           </w:rPr>
-          <w:instrText xml:space="preserve"> PAGEREF _Toc234331108 \h </w:instrText>
+          <w:instrText xml:space="preserve"> PAGEREF _Toc234332863 \h </w:instrText>
         </w:r>
         <w:r>
           <w:rPr>
@@ -807,7 +807,7 @@
           <w14:ligatures w14:val="standardContextual"/>
         </w:rPr>
       </w:pPr>
-      <w:hyperlink w:anchor="_Toc234331109" w:history="1">
+      <w:hyperlink w:anchor="_Toc234332864" w:history="1">
         <w:r>
           <w:rPr>
             <w:rStyle w:val="Hypertextovodkaz"/>
@@ -834,7 +834,7 @@
             <w:noProof/>
             <w:webHidden/>
           </w:rPr>
-          <w:instrText xml:space="preserve"> PAGEREF _Toc234331109 \h </w:instrText>
+          <w:instrText xml:space="preserve"> PAGEREF _Toc234332864 \h </w:instrText>
         </w:r>
         <w:r>
           <w:rPr>
@@ -880,7 +880,7 @@
           <w14:ligatures w14:val="standardContextual"/>
         </w:rPr>
       </w:pPr>
-      <w:hyperlink w:anchor="_Toc234331110" w:history="1">
+      <w:hyperlink w:anchor="_Toc234332865" w:history="1">
         <w:r>
           <w:rPr>
             <w:rStyle w:val="Hypertextovodkaz"/>
@@ -907,7 +907,7 @@
             <w:noProof/>
             <w:webHidden/>
           </w:rPr>
-          <w:instrText xml:space="preserve"> PAGEREF _Toc234331110 \h </w:instrText>
+          <w:instrText xml:space="preserve"> PAGEREF _Toc234332865 \h </w:instrText>
         </w:r>
         <w:r>
           <w:rPr>
@@ -953,7 +953,7 @@
           <w14:ligatures w14:val="standardContextual"/>
         </w:rPr>
       </w:pPr>
-      <w:hyperlink w:anchor="_Toc234331111" w:history="1">
+      <w:hyperlink w:anchor="_Toc234332866" w:history="1">
         <w:r>
           <w:rPr>
             <w:rStyle w:val="Hypertextovodkaz"/>
@@ -980,7 +980,7 @@
             <w:noProof/>
             <w:webHidden/>
           </w:rPr>
-          <w:instrText xml:space="preserve"> PAGEREF _Toc234331111 \h </w:instrText>
+          <w:instrText xml:space="preserve"> PAGEREF _Toc234332866 \h </w:instrText>
         </w:r>
         <w:r>
           <w:rPr>
@@ -1026,7 +1026,7 @@
           <w14:ligatures w14:val="standardContextual"/>
         </w:rPr>
       </w:pPr>
-      <w:hyperlink w:anchor="_Toc234331112" w:history="1">
+      <w:hyperlink w:anchor="_Toc234332867" w:history="1">
         <w:r>
           <w:rPr>
             <w:rStyle w:val="Hypertextovodkaz"/>
@@ -1053,7 +1053,7 @@
             <w:noProof/>
             <w:webHidden/>
           </w:rPr>
-          <w:instrText xml:space="preserve"> PAGEREF _Toc234331112 \h </w:instrText>
+          <w:instrText xml:space="preserve"> PAGEREF _Toc234332867 \h </w:instrText>
         </w:r>
         <w:r>
           <w:rPr>
@@ -1099,7 +1099,7 @@
           <w14:ligatures w14:val="standardContextual"/>
         </w:rPr>
       </w:pPr>
-      <w:hyperlink w:anchor="_Toc234331113" w:history="1">
+      <w:hyperlink w:anchor="_Toc234332868" w:history="1">
         <w:r>
           <w:rPr>
             <w:rStyle w:val="Hypertextovodkaz"/>
@@ -1126,7 +1126,7 @@
             <w:noProof/>
             <w:webHidden/>
           </w:rPr>
-          <w:instrText xml:space="preserve"> PAGEREF _Toc234331113 \h </w:instrText>
+          <w:instrText xml:space="preserve"> PAGEREF _Toc234332868 \h </w:instrText>
         </w:r>
         <w:r>
           <w:rPr>
@@ -1172,7 +1172,7 @@
           <w14:ligatures w14:val="standardContextual"/>
         </w:rPr>
       </w:pPr>
-      <w:hyperlink w:anchor="_Toc234331114" w:history="1">
+      <w:hyperlink w:anchor="_Toc234332869" w:history="1">
         <w:r>
           <w:rPr>
             <w:rStyle w:val="Hypertextovodkaz"/>
@@ -1199,7 +1199,7 @@
             <w:noProof/>
             <w:webHidden/>
           </w:rPr>
-          <w:instrText xml:space="preserve"> PAGEREF _Toc234331114 \h </w:instrText>
+          <w:instrText xml:space="preserve"> PAGEREF _Toc234332869 \h </w:instrText>
         </w:r>
         <w:r>
           <w:rPr>
@@ -1245,7 +1245,7 @@
           <w14:ligatures w14:val="standardContextual"/>
         </w:rPr>
       </w:pPr>
-      <w:hyperlink w:anchor="_Toc234331115" w:history="1">
+      <w:hyperlink w:anchor="_Toc234332870" w:history="1">
         <w:r>
           <w:rPr>
             <w:rStyle w:val="Hypertextovodkaz"/>
@@ -1272,7 +1272,7 @@
             <w:noProof/>
             <w:webHidden/>
           </w:rPr>
-          <w:instrText xml:space="preserve"> PAGEREF _Toc234331115 \h </w:instrText>
+          <w:instrText xml:space="preserve"> PAGEREF _Toc234332870 \h </w:instrText>
         </w:r>
         <w:r>
           <w:rPr>
@@ -1318,7 +1318,7 @@
           <w14:ligatures w14:val="standardContextual"/>
         </w:rPr>
       </w:pPr>
-      <w:hyperlink w:anchor="_Toc234331116" w:history="1">
+      <w:hyperlink w:anchor="_Toc234332871" w:history="1">
         <w:r>
           <w:rPr>
             <w:rStyle w:val="Hypertextovodkaz"/>
@@ -1345,7 +1345,7 @@
             <w:noProof/>
             <w:webHidden/>
           </w:rPr>
-          <w:instrText xml:space="preserve"> PAGEREF _Toc234331116 \h </w:instrText>
+          <w:instrText xml:space="preserve"> PAGEREF _Toc234332871 \h </w:instrText>
         </w:r>
         <w:r>
           <w:rPr>
@@ -1391,7 +1391,7 @@
           <w14:ligatures w14:val="standardContextual"/>
         </w:rPr>
       </w:pPr>
-      <w:hyperlink w:anchor="_Toc234331117" w:history="1">
+      <w:hyperlink w:anchor="_Toc234332872" w:history="1">
         <w:r>
           <w:rPr>
             <w:rStyle w:val="Hypertextovodkaz"/>
@@ -1418,7 +1418,7 @@
             <w:noProof/>
             <w:webHidden/>
           </w:rPr>
-          <w:instrText xml:space="preserve"> PAGEREF _Toc234331117 \h </w:instrText>
+          <w:instrText xml:space="preserve"> PAGEREF _Toc234332872 \h </w:instrText>
         </w:r>
         <w:r>
           <w:rPr>
@@ -1464,7 +1464,7 @@
           <w14:ligatures w14:val="standardContextual"/>
         </w:rPr>
       </w:pPr>
-      <w:hyperlink w:anchor="_Toc234331118" w:history="1">
+      <w:hyperlink w:anchor="_Toc234332873" w:history="1">
         <w:r>
           <w:rPr>
             <w:rStyle w:val="Hypertextovodkaz"/>
@@ -1491,7 +1491,7 @@
             <w:noProof/>
             <w:webHidden/>
           </w:rPr>
-          <w:instrText xml:space="preserve"> PAGEREF _Toc234331118 \h </w:instrText>
+          <w:instrText xml:space="preserve"> PAGEREF _Toc234332873 \h </w:instrText>
         </w:r>
         <w:r>
           <w:rPr>
@@ -1537,7 +1537,7 @@
           <w14:ligatures w14:val="standardContextual"/>
         </w:rPr>
       </w:pPr>
-      <w:hyperlink w:anchor="_Toc234331119" w:history="1">
+      <w:hyperlink w:anchor="_Toc234332874" w:history="1">
         <w:r>
           <w:rPr>
             <w:rStyle w:val="Hypertextovodkaz"/>
@@ -1564,7 +1564,7 @@
             <w:noProof/>
             <w:webHidden/>
           </w:rPr>
-          <w:instrText xml:space="preserve"> PAGEREF _Toc234331119 \h </w:instrText>
+          <w:instrText xml:space="preserve"> PAGEREF _Toc234332874 \h </w:instrText>
         </w:r>
         <w:r>
           <w:rPr>
@@ -1610,7 +1610,7 @@
           <w14:ligatures w14:val="standardContextual"/>
         </w:rPr>
       </w:pPr>
-      <w:hyperlink w:anchor="_Toc234331120" w:history="1">
+      <w:hyperlink w:anchor="_Toc234332875" w:history="1">
         <w:r>
           <w:rPr>
             <w:rStyle w:val="Hypertextovodkaz"/>
@@ -1637,7 +1637,7 @@
             <w:noProof/>
             <w:webHidden/>
           </w:rPr>
-          <w:instrText xml:space="preserve"> PAGEREF _Toc234331120 \h </w:instrText>
+          <w:instrText xml:space="preserve"> PAGEREF _Toc234332875 \h </w:instrText>
         </w:r>
         <w:r>
           <w:rPr>
@@ -1683,7 +1683,7 @@
           <w14:ligatures w14:val="standardContextual"/>
         </w:rPr>
       </w:pPr>
-      <w:hyperlink w:anchor="_Toc234331121" w:history="1">
+      <w:hyperlink w:anchor="_Toc234332876" w:history="1">
         <w:r>
           <w:rPr>
             <w:rStyle w:val="Hypertextovodkaz"/>
@@ -1710,7 +1710,7 @@
             <w:noProof/>
             <w:webHidden/>
           </w:rPr>
-          <w:instrText xml:space="preserve"> PAGEREF _Toc234331121 \h </w:instrText>
+          <w:instrText xml:space="preserve"> PAGEREF _Toc234332876 \h </w:instrText>
         </w:r>
         <w:r>
           <w:rPr>
@@ -1756,7 +1756,7 @@
           <w14:ligatures w14:val="standardContextual"/>
         </w:rPr>
       </w:pPr>
-      <w:hyperlink w:anchor="_Toc234331122" w:history="1">
+      <w:hyperlink w:anchor="_Toc234332877" w:history="1">
         <w:r>
           <w:rPr>
             <w:rStyle w:val="Hypertextovodkaz"/>
@@ -1783,7 +1783,7 @@
             <w:noProof/>
             <w:webHidden/>
           </w:rPr>
-          <w:instrText xml:space="preserve"> PAGEREF _Toc234331122 \h </w:instrText>
+          <w:instrText xml:space="preserve"> PAGEREF _Toc234332877 \h </w:instrText>
         </w:r>
         <w:r>
           <w:rPr>
@@ -1829,7 +1829,7 @@
           <w14:ligatures w14:val="standardContextual"/>
         </w:rPr>
       </w:pPr>
-      <w:hyperlink w:anchor="_Toc234331123" w:history="1">
+      <w:hyperlink w:anchor="_Toc234332878" w:history="1">
         <w:r>
           <w:rPr>
             <w:rStyle w:val="Hypertextovodkaz"/>
@@ -1856,7 +1856,7 @@
             <w:noProof/>
             <w:webHidden/>
           </w:rPr>
-          <w:instrText xml:space="preserve"> PAGEREF _Toc234331123 \h </w:instrText>
+          <w:instrText xml:space="preserve"> PAGEREF _Toc234332878 \h </w:instrText>
         </w:r>
         <w:r>
           <w:rPr>
@@ -1902,7 +1902,7 @@
           <w14:ligatures w14:val="standardContextual"/>
         </w:rPr>
       </w:pPr>
-      <w:hyperlink w:anchor="_Toc234331124" w:history="1">
+      <w:hyperlink w:anchor="_Toc234332879" w:history="1">
         <w:r>
           <w:rPr>
             <w:rStyle w:val="Hypertextovodkaz"/>
@@ -1929,7 +1929,7 @@
             <w:noProof/>
             <w:webHidden/>
           </w:rPr>
-          <w:instrText xml:space="preserve"> PAGEREF _Toc234331124 \h </w:instrText>
+          <w:instrText xml:space="preserve"> PAGEREF _Toc234332879 \h </w:instrText>
         </w:r>
         <w:r>
           <w:rPr>
@@ -1975,7 +1975,7 @@
           <w14:ligatures w14:val="standardContextual"/>
         </w:rPr>
       </w:pPr>
-      <w:hyperlink w:anchor="_Toc234331125" w:history="1">
+      <w:hyperlink w:anchor="_Toc234332880" w:history="1">
         <w:r>
           <w:rPr>
             <w:rStyle w:val="Hypertextovodkaz"/>
@@ -2002,7 +2002,7 @@
             <w:noProof/>
             <w:webHidden/>
           </w:rPr>
-          <w:instrText xml:space="preserve"> PAGEREF _Toc234331125 \h </w:instrText>
+          <w:instrText xml:space="preserve"> PAGEREF _Toc234332880 \h </w:instrText>
         </w:r>
         <w:r>
           <w:rPr>
@@ -2048,7 +2048,7 @@
           <w14:ligatures w14:val="standardContextual"/>
         </w:rPr>
       </w:pPr>
-      <w:hyperlink w:anchor="_Toc234331126" w:history="1">
+      <w:hyperlink w:anchor="_Toc234332881" w:history="1">
         <w:r>
           <w:rPr>
             <w:rStyle w:val="Hypertextovodkaz"/>
@@ -2075,7 +2075,7 @@
             <w:noProof/>
             <w:webHidden/>
           </w:rPr>
-          <w:instrText xml:space="preserve"> PAGEREF _Toc234331126 \h </w:instrText>
+          <w:instrText xml:space="preserve"> PAGEREF _Toc234332881 \h </w:instrText>
         </w:r>
         <w:r>
           <w:rPr>
@@ -2121,7 +2121,7 @@
           <w14:ligatures w14:val="standardContextual"/>
         </w:rPr>
       </w:pPr>
-      <w:hyperlink w:anchor="_Toc234331127" w:history="1">
+      <w:hyperlink w:anchor="_Toc234332882" w:history="1">
         <w:r>
           <w:rPr>
             <w:rStyle w:val="Hypertextovodkaz"/>
@@ -2148,7 +2148,7 @@
             <w:noProof/>
             <w:webHidden/>
           </w:rPr>
-          <w:instrText xml:space="preserve"> PAGEREF _Toc234331127 \h </w:instrText>
+          <w:instrText xml:space="preserve"> PAGEREF _Toc234332882 \h </w:instrText>
         </w:r>
         <w:r>
           <w:rPr>
@@ -2194,7 +2194,7 @@
           <w14:ligatures w14:val="standardContextual"/>
         </w:rPr>
       </w:pPr>
-      <w:hyperlink w:anchor="_Toc234331128" w:history="1">
+      <w:hyperlink w:anchor="_Toc234332883" w:history="1">
         <w:r>
           <w:rPr>
             <w:rStyle w:val="Hypertextovodkaz"/>
@@ -2221,7 +2221,7 @@
             <w:noProof/>
             <w:webHidden/>
           </w:rPr>
-          <w:instrText xml:space="preserve"> PAGEREF _Toc234331128 \h </w:instrText>
+          <w:instrText xml:space="preserve"> PAGEREF _Toc234332883 \h </w:instrText>
         </w:r>
         <w:r>
           <w:rPr>
@@ -2267,7 +2267,7 @@
           <w14:ligatures w14:val="standardContextual"/>
         </w:rPr>
       </w:pPr>
-      <w:hyperlink w:anchor="_Toc234331129" w:history="1">
+      <w:hyperlink w:anchor="_Toc234332884" w:history="1">
         <w:r>
           <w:rPr>
             <w:rStyle w:val="Hypertextovodkaz"/>
@@ -2294,7 +2294,7 @@
             <w:noProof/>
             <w:webHidden/>
           </w:rPr>
-          <w:instrText xml:space="preserve"> PAGEREF _Toc234331129 \h </w:instrText>
+          <w:instrText xml:space="preserve"> PAGEREF _Toc234332884 \h </w:instrText>
         </w:r>
         <w:r>
           <w:rPr>
@@ -2340,7 +2340,7 @@
           <w14:ligatures w14:val="standardContextual"/>
         </w:rPr>
       </w:pPr>
-      <w:hyperlink w:anchor="_Toc234331130" w:history="1">
+      <w:hyperlink w:anchor="_Toc234332885" w:history="1">
         <w:r>
           <w:rPr>
             <w:rStyle w:val="Hypertextovodkaz"/>
@@ -2367,7 +2367,7 @@
             <w:noProof/>
             <w:webHidden/>
           </w:rPr>
-          <w:instrText xml:space="preserve"> PAGEREF _Toc234331130 \h </w:instrText>
+          <w:instrText xml:space="preserve"> PAGEREF _Toc234332885 \h </w:instrText>
         </w:r>
         <w:r>
           <w:rPr>
@@ -2413,7 +2413,7 @@
           <w14:ligatures w14:val="standardContextual"/>
         </w:rPr>
       </w:pPr>
-      <w:hyperlink w:anchor="_Toc234331131" w:history="1">
+      <w:hyperlink w:anchor="_Toc234332886" w:history="1">
         <w:r>
           <w:rPr>
             <w:rStyle w:val="Hypertextovodkaz"/>
@@ -2440,7 +2440,7 @@
             <w:noProof/>
             <w:webHidden/>
           </w:rPr>
-          <w:instrText xml:space="preserve"> PAGEREF _Toc234331131 \h </w:instrText>
+          <w:instrText xml:space="preserve"> PAGEREF _Toc234332886 \h </w:instrText>
         </w:r>
         <w:r>
           <w:rPr>
@@ -2486,7 +2486,7 @@
           <w14:ligatures w14:val="standardContextual"/>
         </w:rPr>
       </w:pPr>
-      <w:hyperlink w:anchor="_Toc234331132" w:history="1">
+      <w:hyperlink w:anchor="_Toc234332887" w:history="1">
         <w:r>
           <w:rPr>
             <w:rStyle w:val="Hypertextovodkaz"/>
@@ -2513,7 +2513,7 @@
             <w:noProof/>
             <w:webHidden/>
           </w:rPr>
-          <w:instrText xml:space="preserve"> PAGEREF _Toc234331132 \h </w:instrText>
+          <w:instrText xml:space="preserve"> PAGEREF _Toc234332887 \h </w:instrText>
         </w:r>
         <w:r>
           <w:rPr>
@@ -2559,7 +2559,7 @@
           <w14:ligatures w14:val="standardContextual"/>
         </w:rPr>
       </w:pPr>
-      <w:hyperlink w:anchor="_Toc234331133" w:history="1">
+      <w:hyperlink w:anchor="_Toc234332888" w:history="1">
         <w:r>
           <w:rPr>
             <w:rStyle w:val="Hypertextovodkaz"/>
@@ -2586,7 +2586,7 @@
             <w:noProof/>
             <w:webHidden/>
           </w:rPr>
-          <w:instrText xml:space="preserve"> PAGEREF _Toc234331133 \h </w:instrText>
+          <w:instrText xml:space="preserve"> PAGEREF _Toc234332888 \h </w:instrText>
         </w:r>
         <w:r>
           <w:rPr>
@@ -2626,7 +2626,7 @@
       <w:pPr>
         <w:pStyle w:val="Nadpis1"/>
       </w:pPr>
-      <w:bookmarkStart w:id="0" w:name="_Toc234331100"/>
+      <w:bookmarkStart w:id="0" w:name="_Toc234332855"/>
       <w:r>
         <w:t>1. Introduction</w:t>
       </w:r>
@@ -2697,7 +2697,7 @@
       <w:pPr>
         <w:pStyle w:val="Nadpis2"/>
       </w:pPr>
-      <w:bookmarkStart w:id="1" w:name="_Toc234331101"/>
+      <w:bookmarkStart w:id="1" w:name="_Toc234332856"/>
       <w:r>
         <w:t>1.1 Requirements and installation</w:t>
       </w:r>
@@ -2828,7 +2828,7 @@
       <w:pPr>
         <w:pStyle w:val="Nadpis2"/>
       </w:pPr>
-      <w:bookmarkStart w:id="2" w:name="_Toc234331102"/>
+      <w:bookmarkStart w:id="2" w:name="_Toc234332857"/>
       <w:r>
         <w:t>1.2 Commands, aliases and permissions</w:t>
       </w:r>
@@ -2986,7 +2986,7 @@
       <w:pPr>
         <w:pStyle w:val="Nadpis1"/>
       </w:pPr>
-      <w:bookmarkStart w:id="3" w:name="_Toc234331103"/>
+      <w:bookmarkStart w:id="3" w:name="_Toc234332858"/>
       <w:r>
         <w:t>2. Getting Tools and Items</w:t>
       </w:r>
@@ -3010,7 +3010,7 @@
       <w:pPr>
         <w:pStyle w:val="Nadpis2"/>
       </w:pPr>
-      <w:bookmarkStart w:id="4" w:name="_Toc234331104"/>
+      <w:bookmarkStart w:id="4" w:name="_Toc234332859"/>
       <w:r>
         <w:t>2.1 Tool sets</w:t>
       </w:r>
@@ -3110,14 +3110,14 @@
         <w:t>Every tool-set command first clears your entire inventory</w:t>
       </w:r>
       <w:r>
-        <w:t xml:space="preserve"> and then adds the set. The BB84 set additionally puts 64 blue + 64 red stained glass and a stack of each spare filter into the main inventory.</w:t>
+        <w:t xml:space="preserve"> and then adds the set. The BB84 set additionally puts 64 blue + 64 red stained glass panes and a stack of each spare filter into the main inventory.</w:t>
       </w:r>
     </w:p>
     <w:p>
       <w:pPr>
         <w:pStyle w:val="Nadpis2"/>
       </w:pPr>
-      <w:bookmarkStart w:id="5" w:name="_Toc234331105"/>
+      <w:bookmarkStart w:id="5" w:name="_Toc234332860"/>
       <w:r>
         <w:t>2.2 Single items — keep your inventory</w:t>
       </w:r>
@@ -3166,7 +3166,7 @@
       <w:pPr>
         <w:pStyle w:val="Nadpis2"/>
       </w:pPr>
-      <w:bookmarkStart w:id="6" w:name="_Toc234331106"/>
+      <w:bookmarkStart w:id="6" w:name="_Toc234332861"/>
       <w:r>
         <w:t>2.3 The Quantum Eraser</w:t>
       </w:r>
@@ -3273,7 +3273,7 @@
                 <w:noProof/>
               </w:rPr>
               <w:drawing>
-                <wp:inline distT="0" distB="0" distL="0" distR="0" wp14:anchorId="0CB34C90" wp14:editId="558CE31D">
+                <wp:inline distT="0" distB="0" distL="0" distR="0" wp14:anchorId="7623C307" wp14:editId="54FDE29F">
                   <wp:extent cx="457200" cy="457200"/>
                   <wp:effectExtent l="0" t="0" r="0" b="0"/>
                   <wp:docPr id="1001" name="brush.png"/>
@@ -3355,7 +3355,7 @@
       <w:pPr>
         <w:pStyle w:val="Nadpis1"/>
       </w:pPr>
-      <w:bookmarkStart w:id="7" w:name="_Toc234331107"/>
+      <w:bookmarkStart w:id="7" w:name="_Toc234332862"/>
       <w:r>
         <w:t>3. BB84 — Quantum Key Distribution</w:t>
       </w:r>
@@ -3411,7 +3411,7 @@
       <w:pPr>
         <w:pStyle w:val="Nadpis2"/>
       </w:pPr>
-      <w:bookmarkStart w:id="8" w:name="_Toc234331108"/>
+      <w:bookmarkStart w:id="8" w:name="_Toc234332863"/>
       <w:r>
         <w:t>3.1 Tools and items</w:t>
       </w:r>
@@ -3518,7 +3518,7 @@
                 <w:noProof/>
               </w:rPr>
               <w:drawing>
-                <wp:inline distT="0" distB="0" distL="0" distR="0" wp14:anchorId="18F1AF39" wp14:editId="0ADBCF77">
+                <wp:inline distT="0" distB="0" distL="0" distR="0" wp14:anchorId="2AEBCA00" wp14:editId="32B12C7B">
                   <wp:extent cx="457200" cy="457200"/>
                   <wp:effectExtent l="0" t="0" r="0" b="0"/>
                   <wp:docPr id="1002" name="compass.png"/>
@@ -3606,7 +3606,7 @@
                 <w:noProof/>
               </w:rPr>
               <w:drawing>
-                <wp:inline distT="0" distB="0" distL="0" distR="0" wp14:anchorId="2DB2ACB9" wp14:editId="3A98FA4B">
+                <wp:inline distT="0" distB="0" distL="0" distR="0" wp14:anchorId="5204334A" wp14:editId="0630781A">
                   <wp:extent cx="457200" cy="457200"/>
                   <wp:effectExtent l="0" t="0" r="0" b="0"/>
                   <wp:docPr id="1003" name="recovery_compass.png"/>
@@ -3694,7 +3694,7 @@
                 <w:noProof/>
               </w:rPr>
               <w:drawing>
-                <wp:inline distT="0" distB="0" distL="0" distR="0" wp14:anchorId="19C6D4DB" wp14:editId="7BE0A594">
+                <wp:inline distT="0" distB="0" distL="0" distR="0" wp14:anchorId="0C7C253C" wp14:editId="11AD3396">
                   <wp:extent cx="457200" cy="457200"/>
                   <wp:effectExtent l="0" t="0" r="0" b="0"/>
                   <wp:docPr id="1004" name="snowball.png"/>
@@ -3782,7 +3782,7 @@
                 <w:noProof/>
               </w:rPr>
               <w:drawing>
-                <wp:inline distT="0" distB="0" distL="0" distR="0" wp14:anchorId="743D1EAA" wp14:editId="67CE625B">
+                <wp:inline distT="0" distB="0" distL="0" distR="0" wp14:anchorId="3CA0AB3A" wp14:editId="7AD5B093">
                   <wp:extent cx="457200" cy="457200"/>
                   <wp:effectExtent l="0" t="0" r="0" b="0"/>
                   <wp:docPr id="1005" name="carrot_on_a_stick.png"/>
@@ -3870,7 +3870,7 @@
                 <w:noProof/>
               </w:rPr>
               <w:drawing>
-                <wp:inline distT="0" distB="0" distL="0" distR="0" wp14:anchorId="73A02DF9" wp14:editId="63109F64">
+                <wp:inline distT="0" distB="0" distL="0" distR="0" wp14:anchorId="72E3F5CE" wp14:editId="2E59CA29">
                   <wp:extent cx="457200" cy="457200"/>
                   <wp:effectExtent l="0" t="0" r="0" b="0"/>
                   <wp:docPr id="1006" name="warped_fungus_on_a_stick.png"/>
@@ -3958,7 +3958,7 @@
                 <w:noProof/>
               </w:rPr>
               <w:drawing>
-                <wp:inline distT="0" distB="0" distL="0" distR="0" wp14:anchorId="0FBFBBF0" wp14:editId="49999C49">
+                <wp:inline distT="0" distB="0" distL="0" distR="0" wp14:anchorId="45AD5725" wp14:editId="25F4EE86">
                   <wp:extent cx="457200" cy="457200"/>
                   <wp:effectExtent l="0" t="0" r="0" b="0"/>
                   <wp:docPr id="1007" name="nether_star.png"/>
@@ -4046,7 +4046,7 @@
                 <w:noProof/>
               </w:rPr>
               <w:drawing>
-                <wp:inline distT="0" distB="0" distL="0" distR="0" wp14:anchorId="250D7BE8" wp14:editId="11572F87">
+                <wp:inline distT="0" distB="0" distL="0" distR="0" wp14:anchorId="406F5A7B" wp14:editId="0AEEE552">
                   <wp:extent cx="457200" cy="457200"/>
                   <wp:effectExtent l="0" t="0" r="0" b="0"/>
                   <wp:docPr id="1008" name="ender_eye.png"/>
@@ -4134,7 +4134,7 @@
                 <w:noProof/>
               </w:rPr>
               <w:drawing>
-                <wp:inline distT="0" distB="0" distL="0" distR="0" wp14:anchorId="58C70304" wp14:editId="65CB9A66">
+                <wp:inline distT="0" distB="0" distL="0" distR="0" wp14:anchorId="09E03CF4" wp14:editId="7A8F1F06">
                   <wp:extent cx="457200" cy="457200"/>
                   <wp:effectExtent l="0" t="0" r="0" b="0"/>
                   <wp:docPr id="1009" name="chest.png"/>
@@ -4216,7 +4216,7 @@
                 <w:noProof/>
               </w:rPr>
               <w:drawing>
-                <wp:inline distT="0" distB="0" distL="0" distR="0" wp14:anchorId="4EEF351D" wp14:editId="49D56F41">
+                <wp:inline distT="0" distB="0" distL="0" distR="0" wp14:anchorId="5FA626D5" wp14:editId="042CAAC0">
                   <wp:extent cx="457200" cy="457200"/>
                   <wp:effectExtent l="0" t="0" r="0" b="0"/>
                   <wp:docPr id="1010" name="blue_glass.png"/>
@@ -4263,7 +4263,7 @@
               <w:spacing w:after="0"/>
             </w:pPr>
             <w:r>
-              <w:t>Blue Stained Glass (64×)</w:t>
+              <w:t>Blue Stained Glass Pane (64×)</w:t>
             </w:r>
           </w:p>
         </w:tc>
@@ -4307,7 +4307,7 @@
                 <w:noProof/>
               </w:rPr>
               <w:drawing>
-                <wp:inline distT="0" distB="0" distL="0" distR="0" wp14:anchorId="1C19E2AA" wp14:editId="28194344">
+                <wp:inline distT="0" distB="0" distL="0" distR="0" wp14:anchorId="409F3468" wp14:editId="36AA5D83">
                   <wp:extent cx="457200" cy="457200"/>
                   <wp:effectExtent l="0" t="0" r="0" b="0"/>
                   <wp:docPr id="1011" name="red_glass.png"/>
@@ -4354,7 +4354,7 @@
               <w:spacing w:after="0"/>
             </w:pPr>
             <w:r>
-              <w:t>Red Stained Glass (64×)</w:t>
+              <w:t>Red Stained Glass Pane (64×)</w:t>
             </w:r>
           </w:p>
         </w:tc>
@@ -4398,7 +4398,7 @@
                 <w:noProof/>
               </w:rPr>
               <w:drawing>
-                <wp:inline distT="0" distB="0" distL="0" distR="0" wp14:anchorId="6C364152" wp14:editId="7874DAC6">
+                <wp:inline distT="0" distB="0" distL="0" distR="0" wp14:anchorId="40D23B5D" wp14:editId="5C3C3148">
                   <wp:extent cx="457200" cy="457200"/>
                   <wp:effectExtent l="0" t="0" r="0" b="0"/>
                   <wp:docPr id="1012" name="brush.png"/>
@@ -4480,7 +4480,7 @@
       <w:pPr>
         <w:pStyle w:val="Nadpis2"/>
       </w:pPr>
-      <w:bookmarkStart w:id="9" w:name="_Toc234331109"/>
+      <w:bookmarkStart w:id="9" w:name="_Toc234332864"/>
       <w:r>
         <w:t>3.2 How the double chests work</w:t>
       </w:r>
@@ -4512,7 +4512,7 @@
         <w:t>bits</w:t>
       </w:r>
       <w:r>
-        <w:t>: put Blue (0) or Red (1) Stained Glass under a filter to choose the bit yourself, or leave the slot empty for a random bit. A floating red text above the chest shows what is still missing ("Missing: filters, photons").</w:t>
+        <w:t>: put a Blue (0) or Red (1) Stained Glass Pane under a filter to choose the bit yourself, or leave the slot empty for a random bit. A floating red text above the chest shows what is still missing ("Missing: filters, photons").</w:t>
       </w:r>
     </w:p>
     <w:p>
@@ -4525,7 +4525,7 @@
           <w:noProof/>
         </w:rPr>
         <w:drawing>
-          <wp:inline distT="0" distB="0" distL="0" distR="0" wp14:anchorId="35F9E507" wp14:editId="4ED40433">
+          <wp:inline distT="0" distB="0" distL="0" distR="0" wp14:anchorId="0C3B7079" wp14:editId="5F569936">
             <wp:extent cx="3352800" cy="2590800"/>
             <wp:effectExtent l="0" t="0" r="0" b="0"/>
             <wp:docPr id="1013" name="sender_chest.png"/>
@@ -4573,7 +4573,7 @@
           <w:sz w:val="18"/>
           <w:szCs w:val="18"/>
         </w:rPr>
-        <w:t>Sender chest — Alice's filters in rows 1, 3, 5; her bit glass in rows 2, 4, 6</w:t>
+        <w:t>Sender chest — Alice's filters in rows 1, 3, 5; her bit glass panes in rows 2, 4, 6</w:t>
       </w:r>
     </w:p>
     <w:p>
@@ -4593,7 +4593,7 @@
         <w:t>measured results</w:t>
       </w:r>
       <w:r>
-        <w:t xml:space="preserve"> into rows 2, 4 and 6 as blue/red glass, into the slot matching the photon's number.</w:t>
+        <w:t xml:space="preserve"> into rows 2, 4 and 6 as blue/red glass panes, into the slot matching the photon's number.</w:t>
       </w:r>
     </w:p>
     <w:p>
@@ -4606,7 +4606,7 @@
           <w:noProof/>
         </w:rPr>
         <w:drawing>
-          <wp:inline distT="0" distB="0" distL="0" distR="0" wp14:anchorId="36B1FD62" wp14:editId="65525ECF">
+          <wp:inline distT="0" distB="0" distL="0" distR="0" wp14:anchorId="1840A2DB" wp14:editId="02B4772A">
             <wp:extent cx="3352800" cy="2590800"/>
             <wp:effectExtent l="0" t="0" r="0" b="0"/>
             <wp:docPr id="1014" name="gate_chest.png"/>
@@ -4661,7 +4661,7 @@
       <w:pPr>
         <w:pStyle w:val="Nadpis2"/>
       </w:pPr>
-      <w:bookmarkStart w:id="10" w:name="_Toc234331110"/>
+      <w:bookmarkStart w:id="10" w:name="_Toc234332865"/>
       <w:r>
         <w:t>3.3 Step by step</w:t>
       </w:r>
@@ -4759,7 +4759,7 @@
         <w:t>/qacraft sender fill</w:t>
       </w:r>
       <w:r>
-        <w:t xml:space="preserve"> — rows 1/3/5 receive 27 random filters, rows 2/4/6 are cleared. Optionally lay blue/red glass into rows 2/4/6 to choose Alice's bits yourself.</w:t>
+        <w:t xml:space="preserve"> — rows 1/3/5 receive 27 random filters, rows 2/4/6 are cleared. Optionally lay blue/red glass panes into rows 2/4/6 to choose Alice's bits yourself.</w:t>
       </w:r>
     </w:p>
     <w:p>
@@ -4907,7 +4907,7 @@
         </w:numPr>
       </w:pPr>
       <w:r>
-        <w:t xml:space="preserve">Watch the measurements: when photon F#n passes within 1.5 blocks of a gate, it flashes blue or red and the gate writes the result glass into </w:t>
+        <w:t xml:space="preserve">Watch the measurements: when photon F#n passes within 1.5 blocks of a gate, it flashes blue or red and the gate writes the result glass pane into </w:t>
       </w:r>
       <w:r>
         <w:rPr>
@@ -4927,14 +4927,14 @@
         </w:numPr>
       </w:pPr>
       <w:r>
-        <w:t>Sift the key: compare the two chests and keep only the positions where both filters match — those glass bits are the shared secret key.</w:t>
+        <w:t>Sift the key: compare the two chests and keep only the positions where both filters match — those glass-pane bits are the shared secret key.</w:t>
       </w:r>
     </w:p>
     <w:p>
       <w:pPr>
         <w:pStyle w:val="Nadpis2"/>
       </w:pPr>
-      <w:bookmarkStart w:id="11" w:name="_Toc234331111"/>
+      <w:bookmarkStart w:id="11" w:name="_Toc234332866"/>
       <w:r>
         <w:t>3.4 Manual experiments</w:t>
       </w:r>
@@ -5112,7 +5112,7 @@
       <w:pPr>
         <w:pStyle w:val="Nadpis1"/>
       </w:pPr>
-      <w:bookmarkStart w:id="12" w:name="_Toc234331112"/>
+      <w:bookmarkStart w:id="12" w:name="_Toc234332867"/>
       <w:r>
         <w:t>4. Grover's Search Algorithm</w:t>
       </w:r>
@@ -5349,7 +5349,7 @@
       <w:pPr>
         <w:pStyle w:val="Nadpis2"/>
       </w:pPr>
-      <w:bookmarkStart w:id="13" w:name="_Toc234331113"/>
+      <w:bookmarkStart w:id="13" w:name="_Toc234332868"/>
       <w:r>
         <w:t>4.1 Tools and items</w:t>
       </w:r>
@@ -5456,7 +5456,7 @@
                 <w:noProof/>
               </w:rPr>
               <w:drawing>
-                <wp:inline distT="0" distB="0" distL="0" distR="0" wp14:anchorId="240C0C9C" wp14:editId="7D4C753D">
+                <wp:inline distT="0" distB="0" distL="0" distR="0" wp14:anchorId="604C444C" wp14:editId="68E500BC">
                   <wp:extent cx="457200" cy="457200"/>
                   <wp:effectExtent l="0" t="0" r="0" b="0"/>
                   <wp:docPr id="1015" name="fire_charge.png"/>
@@ -5544,7 +5544,7 @@
                 <w:noProof/>
               </w:rPr>
               <w:drawing>
-                <wp:inline distT="0" distB="0" distL="0" distR="0" wp14:anchorId="793AAAAE" wp14:editId="5AB2C96C">
+                <wp:inline distT="0" distB="0" distL="0" distR="0" wp14:anchorId="345A1712" wp14:editId="7F33E128">
                   <wp:extent cx="457200" cy="457200"/>
                   <wp:effectExtent l="0" t="0" r="0" b="0"/>
                   <wp:docPr id="1016" name="conduit.png"/>
@@ -5632,7 +5632,7 @@
                 <w:noProof/>
               </w:rPr>
               <w:drawing>
-                <wp:inline distT="0" distB="0" distL="0" distR="0" wp14:anchorId="17E629F3" wp14:editId="73E41076">
+                <wp:inline distT="0" distB="0" distL="0" distR="0" wp14:anchorId="0451B0A6" wp14:editId="4CF2802F">
                   <wp:extent cx="457200" cy="457200"/>
                   <wp:effectExtent l="0" t="0" r="0" b="0"/>
                   <wp:docPr id="1017" name="wind_charge.png"/>
@@ -5720,7 +5720,7 @@
                 <w:noProof/>
               </w:rPr>
               <w:drawing>
-                <wp:inline distT="0" distB="0" distL="0" distR="0" wp14:anchorId="0F58801F" wp14:editId="5137E579">
+                <wp:inline distT="0" distB="0" distL="0" distR="0" wp14:anchorId="0E2C678A" wp14:editId="588CD227">
                   <wp:extent cx="457200" cy="457200"/>
                   <wp:effectExtent l="0" t="0" r="0" b="0"/>
                   <wp:docPr id="1018" name="spyglass.png"/>
@@ -5808,7 +5808,7 @@
                 <w:noProof/>
               </w:rPr>
               <w:drawing>
-                <wp:inline distT="0" distB="0" distL="0" distR="0" wp14:anchorId="686B4658" wp14:editId="767693AE">
+                <wp:inline distT="0" distB="0" distL="0" distR="0" wp14:anchorId="2D6704C6" wp14:editId="642EFB44">
                   <wp:extent cx="457200" cy="457200"/>
                   <wp:effectExtent l="0" t="0" r="0" b="0"/>
                   <wp:docPr id="1019" name="tnt.png"/>
@@ -5896,7 +5896,7 @@
                 <w:noProof/>
               </w:rPr>
               <w:drawing>
-                <wp:inline distT="0" distB="0" distL="0" distR="0" wp14:anchorId="3E0C61C3" wp14:editId="7C0F50E0">
+                <wp:inline distT="0" distB="0" distL="0" distR="0" wp14:anchorId="796A49A6" wp14:editId="7D985F5C">
                   <wp:extent cx="457200" cy="457200"/>
                   <wp:effectExtent l="0" t="0" r="0" b="0"/>
                   <wp:docPr id="1020" name="brush.png"/>
@@ -5978,7 +5978,7 @@
       <w:pPr>
         <w:pStyle w:val="Nadpis2"/>
       </w:pPr>
-      <w:bookmarkStart w:id="14" w:name="_Toc234331114"/>
+      <w:bookmarkStart w:id="14" w:name="_Toc234332869"/>
       <w:r>
         <w:t>4.2 Multiple grids at once</w:t>
       </w:r>
@@ -6035,7 +6035,7 @@
       <w:pPr>
         <w:pStyle w:val="Nadpis2"/>
       </w:pPr>
-      <w:bookmarkStart w:id="15" w:name="_Toc234331115"/>
+      <w:bookmarkStart w:id="15" w:name="_Toc234332870"/>
       <w:r>
         <w:t>4.3 Step by step</w:t>
       </w:r>
@@ -6288,7 +6288,7 @@
       <w:pPr>
         <w:pStyle w:val="Nadpis2"/>
       </w:pPr>
-      <w:bookmarkStart w:id="16" w:name="_Toc234331116"/>
+      <w:bookmarkStart w:id="16" w:name="_Toc234332871"/>
       <w:r>
         <w:t>4.4 Visualisation rules</w:t>
       </w:r>
@@ -6365,7 +6365,7 @@
       <w:pPr>
         <w:pStyle w:val="Nadpis1"/>
       </w:pPr>
-      <w:bookmarkStart w:id="17" w:name="_Toc234331117"/>
+      <w:bookmarkStart w:id="17" w:name="_Toc234332872"/>
       <w:r>
         <w:t>5. E91 — Entanglement Protocol</w:t>
       </w:r>
@@ -6457,7 +6457,7 @@
       <w:pPr>
         <w:pStyle w:val="Nadpis2"/>
       </w:pPr>
-      <w:bookmarkStart w:id="18" w:name="_Toc234331118"/>
+      <w:bookmarkStart w:id="18" w:name="_Toc234332873"/>
       <w:r>
         <w:t>5.1 Tools and items</w:t>
       </w:r>
@@ -6564,7 +6564,7 @@
                 <w:noProof/>
               </w:rPr>
               <w:drawing>
-                <wp:inline distT="0" distB="0" distL="0" distR="0" wp14:anchorId="729E95D0" wp14:editId="48E630E4">
+                <wp:inline distT="0" distB="0" distL="0" distR="0" wp14:anchorId="598F4894" wp14:editId="68E02EDA">
                   <wp:extent cx="457200" cy="457200"/>
                   <wp:effectExtent l="0" t="0" r="0" b="0"/>
                   <wp:docPr id="1021" name="amethyst_shard.png"/>
@@ -6652,7 +6652,7 @@
                 <w:noProof/>
               </w:rPr>
               <w:drawing>
-                <wp:inline distT="0" distB="0" distL="0" distR="0" wp14:anchorId="41EE7D0F" wp14:editId="7540874E">
+                <wp:inline distT="0" distB="0" distL="0" distR="0" wp14:anchorId="7B726045" wp14:editId="6DE439AA">
                   <wp:extent cx="457200" cy="457200"/>
                   <wp:effectExtent l="0" t="0" r="0" b="0"/>
                   <wp:docPr id="1022" name="compass.png"/>
@@ -6740,7 +6740,7 @@
                 <w:noProof/>
               </w:rPr>
               <w:drawing>
-                <wp:inline distT="0" distB="0" distL="0" distR="0" wp14:anchorId="4793B9E4" wp14:editId="094F31BA">
+                <wp:inline distT="0" distB="0" distL="0" distR="0" wp14:anchorId="67851FAC" wp14:editId="791CFF7E">
                   <wp:extent cx="457200" cy="457200"/>
                   <wp:effectExtent l="0" t="0" r="0" b="0"/>
                   <wp:docPr id="1023" name="recovery_compass.png"/>
@@ -6828,7 +6828,7 @@
                 <w:noProof/>
               </w:rPr>
               <w:drawing>
-                <wp:inline distT="0" distB="0" distL="0" distR="0" wp14:anchorId="3E337480" wp14:editId="57093AB9">
+                <wp:inline distT="0" distB="0" distL="0" distR="0" wp14:anchorId="68828832" wp14:editId="72AFD714">
                   <wp:extent cx="457200" cy="457200"/>
                   <wp:effectExtent l="0" t="0" r="0" b="0"/>
                   <wp:docPr id="1024" name="clock.png"/>
@@ -6916,7 +6916,7 @@
                 <w:noProof/>
               </w:rPr>
               <w:drawing>
-                <wp:inline distT="0" distB="0" distL="0" distR="0" wp14:anchorId="181EBE73" wp14:editId="6E7D0330">
+                <wp:inline distT="0" distB="0" distL="0" distR="0" wp14:anchorId="5EDB1034" wp14:editId="15097123">
                   <wp:extent cx="457200" cy="457200"/>
                   <wp:effectExtent l="0" t="0" r="0" b="0"/>
                   <wp:docPr id="1025" name="diamond_axe.png"/>
@@ -7004,7 +7004,7 @@
                 <w:noProof/>
               </w:rPr>
               <w:drawing>
-                <wp:inline distT="0" distB="0" distL="0" distR="0" wp14:anchorId="4CF0383B" wp14:editId="36AA0993">
+                <wp:inline distT="0" distB="0" distL="0" distR="0" wp14:anchorId="264601D1" wp14:editId="66C067F2">
                   <wp:extent cx="457200" cy="457200"/>
                   <wp:effectExtent l="0" t="0" r="0" b="0"/>
                   <wp:docPr id="1026" name="golden_axe.png"/>
@@ -7092,7 +7092,7 @@
                 <w:noProof/>
               </w:rPr>
               <w:drawing>
-                <wp:inline distT="0" distB="0" distL="0" distR="0" wp14:anchorId="343E1396" wp14:editId="4C822A66">
+                <wp:inline distT="0" distB="0" distL="0" distR="0" wp14:anchorId="7E609184" wp14:editId="59BB76A7">
                   <wp:extent cx="457200" cy="457200"/>
                   <wp:effectExtent l="0" t="0" r="0" b="0"/>
                   <wp:docPr id="1027" name="brush.png"/>
@@ -7174,7 +7174,7 @@
       <w:pPr>
         <w:pStyle w:val="Nadpis2"/>
       </w:pPr>
-      <w:bookmarkStart w:id="19" w:name="_Toc234331119"/>
+      <w:bookmarkStart w:id="19" w:name="_Toc234332874"/>
       <w:r>
         <w:t>5.2 Step by step</w:t>
       </w:r>
@@ -7504,7 +7504,7 @@
       <w:pPr>
         <w:pStyle w:val="Nadpis2"/>
       </w:pPr>
-      <w:bookmarkStart w:id="20" w:name="_Toc234331120"/>
+      <w:bookmarkStart w:id="20" w:name="_Toc234332875"/>
       <w:r>
         <w:t>5.3 The physics behind it</w:t>
       </w:r>
@@ -7558,7 +7558,7 @@
       <w:pPr>
         <w:pStyle w:val="Nadpis1"/>
       </w:pPr>
-      <w:bookmarkStart w:id="21" w:name="_Toc234331121"/>
+      <w:bookmarkStart w:id="21" w:name="_Toc234332876"/>
       <w:r>
         <w:t>6. Plasma — the Lobby Effect</w:t>
       </w:r>
@@ -7573,7 +7573,7 @@
       <w:pPr>
         <w:pStyle w:val="Nadpis2"/>
       </w:pPr>
-      <w:bookmarkStart w:id="22" w:name="_Toc234331122"/>
+      <w:bookmarkStart w:id="22" w:name="_Toc234332877"/>
       <w:r>
         <w:t>6.1 Tools and commands</w:t>
       </w:r>
@@ -7680,7 +7680,7 @@
                 <w:noProof/>
               </w:rPr>
               <w:drawing>
-                <wp:inline distT="0" distB="0" distL="0" distR="0" wp14:anchorId="38A15AC7" wp14:editId="21246853">
+                <wp:inline distT="0" distB="0" distL="0" distR="0" wp14:anchorId="07C3CEB2" wp14:editId="7DDD36F6">
                   <wp:extent cx="457200" cy="457200"/>
                   <wp:effectExtent l="0" t="0" r="0" b="0"/>
                   <wp:docPr id="1028" name="heart_of_the_sea.png"/>
@@ -7768,7 +7768,7 @@
                 <w:noProof/>
               </w:rPr>
               <w:drawing>
-                <wp:inline distT="0" distB="0" distL="0" distR="0" wp14:anchorId="0CC2FE70" wp14:editId="2FA7D0B3">
+                <wp:inline distT="0" distB="0" distL="0" distR="0" wp14:anchorId="2A927354" wp14:editId="4F5F3003">
                   <wp:extent cx="457200" cy="457200"/>
                   <wp:effectExtent l="0" t="0" r="0" b="0"/>
                   <wp:docPr id="1029" name="echo_shard.png"/>
@@ -7882,7 +7882,7 @@
       <w:pPr>
         <w:pStyle w:val="Nadpis1"/>
       </w:pPr>
-      <w:bookmarkStart w:id="23" w:name="_Toc234331123"/>
+      <w:bookmarkStart w:id="23" w:name="_Toc234332878"/>
       <w:r>
         <w:t>7. Tutorial Hall and Guided Walkthrough</w:t>
       </w:r>
@@ -7915,7 +7915,7 @@
       <w:pPr>
         <w:pStyle w:val="Nadpis2"/>
       </w:pPr>
-      <w:bookmarkStart w:id="24" w:name="_Toc234331124"/>
+      <w:bookmarkStart w:id="24" w:name="_Toc234332879"/>
       <w:r>
         <w:t>7.1 Building the hall</w:t>
       </w:r>
@@ -8007,7 +8007,7 @@
       <w:pPr>
         <w:pStyle w:val="Nadpis2"/>
       </w:pPr>
-      <w:bookmarkStart w:id="25" w:name="_Toc234331125"/>
+      <w:bookmarkStart w:id="25" w:name="_Toc234332880"/>
       <w:r>
         <w:t>7.2 Running the tutorial</w:t>
       </w:r>
@@ -8147,7 +8147,7 @@
       <w:pPr>
         <w:pStyle w:val="Nadpis2"/>
       </w:pPr>
-      <w:bookmarkStart w:id="26" w:name="_Toc234331126"/>
+      <w:bookmarkStart w:id="26" w:name="_Toc234332881"/>
       <w:r>
         <w:t>7.3 What you will do in each room</w:t>
       </w:r>
@@ -8179,7 +8179,7 @@
         <w:t>/q sender fill</w:t>
       </w:r>
       <w:r>
-        <w:t xml:space="preserve"> + lay result glass → place the Gate → build its chest → fill it with Compasses → place the Quantum Cable → </w:t>
+        <w:t xml:space="preserve"> + lay bit glass panes → place the Gate → build its chest → fill it with Compasses → place the Quantum Cable → </w:t>
       </w:r>
       <w:r>
         <w:rPr>
@@ -8280,7 +8280,7 @@
       <w:pPr>
         <w:pStyle w:val="Nadpis1"/>
       </w:pPr>
-      <w:bookmarkStart w:id="27" w:name="_Toc234331127"/>
+      <w:bookmarkStart w:id="27" w:name="_Toc234332882"/>
       <w:r>
         <w:t>8. Command Reference</w:t>
       </w:r>
@@ -8343,7 +8343,7 @@
       <w:pPr>
         <w:pStyle w:val="Nadpis2"/>
       </w:pPr>
-      <w:bookmarkStart w:id="28" w:name="_Toc234331128"/>
+      <w:bookmarkStart w:id="28" w:name="_Toc234332883"/>
       <w:r>
         <w:t>8.1 General</w:t>
       </w:r>
@@ -8561,7 +8561,7 @@
       <w:pPr>
         <w:pStyle w:val="Nadpis2"/>
       </w:pPr>
-      <w:bookmarkStart w:id="29" w:name="_Toc234331129"/>
+      <w:bookmarkStart w:id="29" w:name="_Toc234332884"/>
       <w:r>
         <w:t>8.2 BB84</w:t>
       </w:r>
@@ -9063,7 +9063,7 @@
       <w:pPr>
         <w:pStyle w:val="Nadpis2"/>
       </w:pPr>
-      <w:bookmarkStart w:id="30" w:name="_Toc234331130"/>
+      <w:bookmarkStart w:id="30" w:name="_Toc234332885"/>
       <w:r>
         <w:t>8.3 Grover ([id] optional with a single grid)</w:t>
       </w:r>
@@ -9419,7 +9419,7 @@
       <w:pPr>
         <w:pStyle w:val="Nadpis2"/>
       </w:pPr>
-      <w:bookmarkStart w:id="31" w:name="_Toc234331131"/>
+      <w:bookmarkStart w:id="31" w:name="_Toc234332886"/>
       <w:r>
         <w:t>8.4 E91</w:t>
       </w:r>
@@ -9785,7 +9785,7 @@
       <w:pPr>
         <w:pStyle w:val="Nadpis2"/>
       </w:pPr>
-      <w:bookmarkStart w:id="32" w:name="_Toc234331132"/>
+      <w:bookmarkStart w:id="32" w:name="_Toc234332887"/>
       <w:r>
         <w:t>8.5 Plasma, hall and tutorial</w:t>
       </w:r>
@@ -10071,7 +10071,7 @@
       <w:pPr>
         <w:pStyle w:val="Nadpis1"/>
       </w:pPr>
-      <w:bookmarkStart w:id="33" w:name="_Toc234331133"/>
+      <w:bookmarkStart w:id="33" w:name="_Toc234332888"/>
       <w:r>
         <w:t>9. Technical Notes</w:t>
       </w:r>
@@ -10389,9 +10389,9 @@
 <file path=word/numbering.xml><?xml version="1.0" encoding="utf-8"?>
 <w:numbering xmlns:wpc="http://schemas.microsoft.com/office/word/2010/wordprocessingCanvas" xmlns:cx="http://schemas.microsoft.com/office/drawing/2014/chartex" xmlns:cx1="http://schemas.microsoft.com/office/drawing/2015/9/8/chartex" xmlns:cx2="http://schemas.microsoft.com/office/drawing/2015/10/21/chartex" xmlns:cx3="http://schemas.microsoft.com/office/drawing/2016/5/9/chartex" xmlns:cx4="http://schemas.microsoft.com/office/drawing/2016/5/10/chartex" xmlns:cx5="http://schemas.microsoft.com/office/drawing/2016/5/11/chartex" xmlns:cx6="http://schemas.microsoft.com/office/drawing/2016/5/12/chartex" xmlns:cx7="http://schemas.microsoft.com/office/drawing/2016/5/13/chartex" xmlns:cx8="http://schemas.microsoft.com/office/drawing/2016/5/14/chartex" xmlns:mc="http://schemas.openxmlformats.org/markup-compatibility/2006" xmlns:aink="http://schemas.microsoft.com/office/drawing/2016/ink" xmlns:am3d="http://schemas.microsoft.com/office/drawing/2017/model3d" xmlns:o="urn:schemas-microsoft-com:office:office" xmlns:oel="http://schemas.microsoft.com/office/2019/extlst" xmlns:r="http://schemas.openxmlformats.org/officeDocument/2006/relationships" xmlns:m="http://schemas.openxmlformats.org/officeDocument/2006/math" xmlns:v="urn:schemas-microsoft-com:vml" xmlns:wp14="http://schemas.microsoft.com/office/word/2010/wordprocessingDrawing" xmlns:wp="http://schemas.openxmlformats.org/drawingml/2006/wordprocessingDrawing" xmlns:w10="urn:schemas-microsoft-com:office:word" xmlns:w="http://schemas.openxmlformats.org/wordprocessingml/2006/main" xmlns:w14="http://schemas.microsoft.com/office/word/2010/wordml" xmlns:w15="http://schemas.microsoft.com/office/word/2012/wordml" xmlns:w16cex="http://schemas.microsoft.com/office/word/2018/wordml/cex" xmlns:w16cid="http://schemas.microsoft.com/office/word/2016/wordml/cid" xmlns:w16="http://schemas.microsoft.com/office/word/2018/wordml" xmlns:w16du="http://schemas.microsoft.com/office/word/2023/wordml/word16du" xmlns:w16sdtdh="http://schemas.microsoft.com/office/word/2020/wordml/sdtdatahash" xmlns:w16sdtfl="http://schemas.microsoft.com/office/word/2024/wordml/sdtformatlock" xmlns:w16se="http://schemas.microsoft.com/office/word/2015/wordml/symex" xmlns:wpg="http://schemas.microsoft.com/office/word/2010/wordprocessingGroup" xmlns:wpi="http://schemas.microsoft.com/office/word/2010/wordprocessingInk" xmlns:wne="http://schemas.microsoft.com/office/word/2006/wordml" xmlns:wps="http://schemas.microsoft.com/office/word/2010/wordprocessingShape" mc:Ignorable="w14 w15 w16se w16cid w16 w16cex w16sdtdh w16sdtfl w16du wp14">
   <w:abstractNum w:abstractNumId="0" w15:restartNumberingAfterBreak="0">
-    <w:nsid w:val="06BB61C0"/>
+    <w:nsid w:val="0C7F0C20"/>
     <w:multiLevelType w:val="singleLevel"/>
-    <w:tmpl w:val="C2826684"/>
+    <w:tmpl w:val="D1EE121E"/>
     <w:lvl w:ilvl="0">
       <w:start w:val="1"/>
       <w:numFmt w:val="decimal"/>
@@ -10403,9 +10403,9 @@
     </w:lvl>
   </w:abstractNum>
   <w:abstractNum w:abstractNumId="1" w15:restartNumberingAfterBreak="0">
-    <w:nsid w:val="44E37890"/>
+    <w:nsid w:val="35C15A76"/>
     <w:multiLevelType w:val="singleLevel"/>
-    <w:tmpl w:val="BF3E1FFE"/>
+    <w:tmpl w:val="F37EE5FE"/>
     <w:lvl w:ilvl="0">
       <w:start w:val="1"/>
       <w:numFmt w:val="bullet"/>
@@ -10419,22 +10419,22 @@
       </w:rPr>
     </w:lvl>
   </w:abstractNum>
-  <w:num w:numId="1" w16cid:durableId="1825507542">
+  <w:num w:numId="1" w16cid:durableId="488979101">
     <w:abstractNumId w:val="1"/>
   </w:num>
-  <w:num w:numId="2" w16cid:durableId="614217008">
+  <w:num w:numId="2" w16cid:durableId="1105923522">
     <w:abstractNumId w:val="0"/>
     <w:lvlOverride w:ilvl="0">
       <w:startOverride w:val="1"/>
     </w:lvlOverride>
   </w:num>
-  <w:num w:numId="3" w16cid:durableId="1730378769">
+  <w:num w:numId="3" w16cid:durableId="1155024343">
     <w:abstractNumId w:val="0"/>
     <w:lvlOverride w:ilvl="0">
       <w:startOverride w:val="1"/>
     </w:lvlOverride>
   </w:num>
-  <w:num w:numId="4" w16cid:durableId="926966304">
+  <w:num w:numId="4" w16cid:durableId="461192657">
     <w:abstractNumId w:val="0"/>
     <w:lvlOverride w:ilvl="0">
       <w:startOverride w:val="1"/>

</xml_diff>

<commit_message>
User guide and project README
docs/QAcraft-Guide.docx — the full English user guide; the guided
  tutorial (chapter 2, Try the Plugin on Your Own) comes right after
  the introduction, followed by tools, the three protocol chapters,
  the plasma effect, the command reference and technical notes.
README.md — project overview: requirements, build and install, a
  try-it-on-your-own quickstart, command tables, tools and
  documentation.
</commit_message>
<xml_diff>
--- a/docs/QAcraft-Guide.docx
+++ b/docs/QAcraft-Guide.docx
@@ -150,7 +150,7 @@
       <w:r>
         <w:fldChar w:fldCharType="separate"/>
       </w:r>
-      <w:hyperlink w:anchor="_Toc234332855" w:history="1">
+      <w:hyperlink w:anchor="_Toc234365179" w:history="1">
         <w:r>
           <w:rPr>
             <w:rStyle w:val="Hypertextovodkaz"/>
@@ -177,7 +177,7 @@
             <w:noProof/>
             <w:webHidden/>
           </w:rPr>
-          <w:instrText xml:space="preserve"> PAGEREF _Toc234332855 \h </w:instrText>
+          <w:instrText xml:space="preserve"> PAGEREF _Toc234365179 \h </w:instrText>
         </w:r>
         <w:r>
           <w:rPr>
@@ -223,7 +223,7 @@
           <w14:ligatures w14:val="standardContextual"/>
         </w:rPr>
       </w:pPr>
-      <w:hyperlink w:anchor="_Toc234332856" w:history="1">
+      <w:hyperlink w:anchor="_Toc234365180" w:history="1">
         <w:r>
           <w:rPr>
             <w:rStyle w:val="Hypertextovodkaz"/>
@@ -250,7 +250,7 @@
             <w:noProof/>
             <w:webHidden/>
           </w:rPr>
-          <w:instrText xml:space="preserve"> PAGEREF _Toc234332856 \h </w:instrText>
+          <w:instrText xml:space="preserve"> PAGEREF _Toc234365180 \h </w:instrText>
         </w:r>
         <w:r>
           <w:rPr>
@@ -296,7 +296,7 @@
           <w14:ligatures w14:val="standardContextual"/>
         </w:rPr>
       </w:pPr>
-      <w:hyperlink w:anchor="_Toc234332857" w:history="1">
+      <w:hyperlink w:anchor="_Toc234365181" w:history="1">
         <w:r>
           <w:rPr>
             <w:rStyle w:val="Hypertextovodkaz"/>
@@ -323,7 +323,7 @@
             <w:noProof/>
             <w:webHidden/>
           </w:rPr>
-          <w:instrText xml:space="preserve"> PAGEREF _Toc234332857 \h </w:instrText>
+          <w:instrText xml:space="preserve"> PAGEREF _Toc234365181 \h </w:instrText>
         </w:r>
         <w:r>
           <w:rPr>
@@ -369,13 +369,13 @@
           <w14:ligatures w14:val="standardContextual"/>
         </w:rPr>
       </w:pPr>
-      <w:hyperlink w:anchor="_Toc234332858" w:history="1">
+      <w:hyperlink w:anchor="_Toc234365182" w:history="1">
         <w:r>
           <w:rPr>
             <w:rStyle w:val="Hypertextovodkaz"/>
             <w:noProof/>
           </w:rPr>
-          <w:t>2. Getting Tools and Items</w:t>
+          <w:t>2. Try the Plugin on Your Own — the Tutorial Hall</w:t>
         </w:r>
         <w:r>
           <w:rPr>
@@ -396,7 +396,7 @@
             <w:noProof/>
             <w:webHidden/>
           </w:rPr>
-          <w:instrText xml:space="preserve"> PAGEREF _Toc234332858 \h </w:instrText>
+          <w:instrText xml:space="preserve"> PAGEREF _Toc234365182 \h </w:instrText>
         </w:r>
         <w:r>
           <w:rPr>
@@ -442,13 +442,13 @@
           <w14:ligatures w14:val="standardContextual"/>
         </w:rPr>
       </w:pPr>
-      <w:hyperlink w:anchor="_Toc234332859" w:history="1">
+      <w:hyperlink w:anchor="_Toc234365183" w:history="1">
         <w:r>
           <w:rPr>
             <w:rStyle w:val="Hypertextovodkaz"/>
             <w:noProof/>
           </w:rPr>
-          <w:t>2.1 Tool sets</w:t>
+          <w:t>2.1 Building the hall</w:t>
         </w:r>
         <w:r>
           <w:rPr>
@@ -469,7 +469,7 @@
             <w:noProof/>
             <w:webHidden/>
           </w:rPr>
-          <w:instrText xml:space="preserve"> PAGEREF _Toc234332859 \h </w:instrText>
+          <w:instrText xml:space="preserve"> PAGEREF _Toc234365183 \h </w:instrText>
         </w:r>
         <w:r>
           <w:rPr>
@@ -515,13 +515,13 @@
           <w14:ligatures w14:val="standardContextual"/>
         </w:rPr>
       </w:pPr>
-      <w:hyperlink w:anchor="_Toc234332860" w:history="1">
+      <w:hyperlink w:anchor="_Toc234365184" w:history="1">
         <w:r>
           <w:rPr>
             <w:rStyle w:val="Hypertextovodkaz"/>
             <w:noProof/>
           </w:rPr>
-          <w:t>2.2 Single items — keep your inventory</w:t>
+          <w:t>2.2 Running the tutorial</w:t>
         </w:r>
         <w:r>
           <w:rPr>
@@ -542,7 +542,7 @@
             <w:noProof/>
             <w:webHidden/>
           </w:rPr>
-          <w:instrText xml:space="preserve"> PAGEREF _Toc234332860 \h </w:instrText>
+          <w:instrText xml:space="preserve"> PAGEREF _Toc234365184 \h </w:instrText>
         </w:r>
         <w:r>
           <w:rPr>
@@ -588,13 +588,13 @@
           <w14:ligatures w14:val="standardContextual"/>
         </w:rPr>
       </w:pPr>
-      <w:hyperlink w:anchor="_Toc234332861" w:history="1">
+      <w:hyperlink w:anchor="_Toc234365185" w:history="1">
         <w:r>
           <w:rPr>
             <w:rStyle w:val="Hypertextovodkaz"/>
             <w:noProof/>
           </w:rPr>
-          <w:t>2.3 The Quantum Eraser</w:t>
+          <w:t>2.3 What you will do in each room</w:t>
         </w:r>
         <w:r>
           <w:rPr>
@@ -615,7 +615,7 @@
             <w:noProof/>
             <w:webHidden/>
           </w:rPr>
-          <w:instrText xml:space="preserve"> PAGEREF _Toc234332861 \h </w:instrText>
+          <w:instrText xml:space="preserve"> PAGEREF _Toc234365185 \h </w:instrText>
         </w:r>
         <w:r>
           <w:rPr>
@@ -661,13 +661,13 @@
           <w14:ligatures w14:val="standardContextual"/>
         </w:rPr>
       </w:pPr>
-      <w:hyperlink w:anchor="_Toc234332862" w:history="1">
+      <w:hyperlink w:anchor="_Toc234365186" w:history="1">
         <w:r>
           <w:rPr>
             <w:rStyle w:val="Hypertextovodkaz"/>
             <w:noProof/>
           </w:rPr>
-          <w:t>3. BB84 — Quantum Key Distribution</w:t>
+          <w:t>3. Getting Tools and Items</w:t>
         </w:r>
         <w:r>
           <w:rPr>
@@ -688,7 +688,7 @@
             <w:noProof/>
             <w:webHidden/>
           </w:rPr>
-          <w:instrText xml:space="preserve"> PAGEREF _Toc234332862 \h </w:instrText>
+          <w:instrText xml:space="preserve"> PAGEREF _Toc234365186 \h </w:instrText>
         </w:r>
         <w:r>
           <w:rPr>
@@ -734,13 +734,13 @@
           <w14:ligatures w14:val="standardContextual"/>
         </w:rPr>
       </w:pPr>
-      <w:hyperlink w:anchor="_Toc234332863" w:history="1">
+      <w:hyperlink w:anchor="_Toc234365187" w:history="1">
         <w:r>
           <w:rPr>
             <w:rStyle w:val="Hypertextovodkaz"/>
             <w:noProof/>
           </w:rPr>
-          <w:t>3.1 Tools and items</w:t>
+          <w:t>3.1 Tool sets</w:t>
         </w:r>
         <w:r>
           <w:rPr>
@@ -761,7 +761,7 @@
             <w:noProof/>
             <w:webHidden/>
           </w:rPr>
-          <w:instrText xml:space="preserve"> PAGEREF _Toc234332863 \h </w:instrText>
+          <w:instrText xml:space="preserve"> PAGEREF _Toc234365187 \h </w:instrText>
         </w:r>
         <w:r>
           <w:rPr>
@@ -807,13 +807,13 @@
           <w14:ligatures w14:val="standardContextual"/>
         </w:rPr>
       </w:pPr>
-      <w:hyperlink w:anchor="_Toc234332864" w:history="1">
+      <w:hyperlink w:anchor="_Toc234365188" w:history="1">
         <w:r>
           <w:rPr>
             <w:rStyle w:val="Hypertextovodkaz"/>
             <w:noProof/>
           </w:rPr>
-          <w:t>3.2 How the double chests work</w:t>
+          <w:t>3.2 Single items — keep your inventory</w:t>
         </w:r>
         <w:r>
           <w:rPr>
@@ -834,7 +834,7 @@
             <w:noProof/>
             <w:webHidden/>
           </w:rPr>
-          <w:instrText xml:space="preserve"> PAGEREF _Toc234332864 \h </w:instrText>
+          <w:instrText xml:space="preserve"> PAGEREF _Toc234365188 \h </w:instrText>
         </w:r>
         <w:r>
           <w:rPr>
@@ -854,7 +854,7 @@
             <w:noProof/>
             <w:webHidden/>
           </w:rPr>
-          <w:t>6</w:t>
+          <w:t>5</w:t>
         </w:r>
         <w:r>
           <w:rPr>
@@ -880,13 +880,13 @@
           <w14:ligatures w14:val="standardContextual"/>
         </w:rPr>
       </w:pPr>
-      <w:hyperlink w:anchor="_Toc234332865" w:history="1">
+      <w:hyperlink w:anchor="_Toc234365189" w:history="1">
         <w:r>
           <w:rPr>
             <w:rStyle w:val="Hypertextovodkaz"/>
             <w:noProof/>
           </w:rPr>
-          <w:t>3.3 Step by step</w:t>
+          <w:t>3.3 The Quantum Eraser</w:t>
         </w:r>
         <w:r>
           <w:rPr>
@@ -907,7 +907,7 @@
             <w:noProof/>
             <w:webHidden/>
           </w:rPr>
-          <w:instrText xml:space="preserve"> PAGEREF _Toc234332865 \h </w:instrText>
+          <w:instrText xml:space="preserve"> PAGEREF _Toc234365189 \h </w:instrText>
         </w:r>
         <w:r>
           <w:rPr>
@@ -927,7 +927,7 @@
             <w:noProof/>
             <w:webHidden/>
           </w:rPr>
-          <w:t>6</w:t>
+          <w:t>5</w:t>
         </w:r>
         <w:r>
           <w:rPr>
@@ -940,7 +940,7 @@
     </w:p>
     <w:p>
       <w:pPr>
-        <w:pStyle w:val="Obsah2"/>
+        <w:pStyle w:val="Obsah1"/>
         <w:tabs>
           <w:tab w:val="right" w:leader="dot" w:pos="9628"/>
         </w:tabs>
@@ -953,13 +953,13 @@
           <w14:ligatures w14:val="standardContextual"/>
         </w:rPr>
       </w:pPr>
-      <w:hyperlink w:anchor="_Toc234332866" w:history="1">
+      <w:hyperlink w:anchor="_Toc234365190" w:history="1">
         <w:r>
           <w:rPr>
             <w:rStyle w:val="Hypertextovodkaz"/>
             <w:noProof/>
           </w:rPr>
-          <w:t>3.4 Manual experiments</w:t>
+          <w:t>4. BB84 — Quantum Key Distribution</w:t>
         </w:r>
         <w:r>
           <w:rPr>
@@ -980,7 +980,7 @@
             <w:noProof/>
             <w:webHidden/>
           </w:rPr>
-          <w:instrText xml:space="preserve"> PAGEREF _Toc234332866 \h </w:instrText>
+          <w:instrText xml:space="preserve"> PAGEREF _Toc234365190 \h </w:instrText>
         </w:r>
         <w:r>
           <w:rPr>
@@ -1000,7 +1000,7 @@
             <w:noProof/>
             <w:webHidden/>
           </w:rPr>
-          <w:t>7</w:t>
+          <w:t>6</w:t>
         </w:r>
         <w:r>
           <w:rPr>
@@ -1013,7 +1013,7 @@
     </w:p>
     <w:p>
       <w:pPr>
-        <w:pStyle w:val="Obsah1"/>
+        <w:pStyle w:val="Obsah2"/>
         <w:tabs>
           <w:tab w:val="right" w:leader="dot" w:pos="9628"/>
         </w:tabs>
@@ -1026,13 +1026,13 @@
           <w14:ligatures w14:val="standardContextual"/>
         </w:rPr>
       </w:pPr>
-      <w:hyperlink w:anchor="_Toc234332867" w:history="1">
+      <w:hyperlink w:anchor="_Toc234365191" w:history="1">
         <w:r>
           <w:rPr>
             <w:rStyle w:val="Hypertextovodkaz"/>
             <w:noProof/>
           </w:rPr>
-          <w:t>4. Grover's Search Algorithm</w:t>
+          <w:t>4.1 Tools and items</w:t>
         </w:r>
         <w:r>
           <w:rPr>
@@ -1053,7 +1053,7 @@
             <w:noProof/>
             <w:webHidden/>
           </w:rPr>
-          <w:instrText xml:space="preserve"> PAGEREF _Toc234332867 \h </w:instrText>
+          <w:instrText xml:space="preserve"> PAGEREF _Toc234365191 \h </w:instrText>
         </w:r>
         <w:r>
           <w:rPr>
@@ -1073,7 +1073,7 @@
             <w:noProof/>
             <w:webHidden/>
           </w:rPr>
-          <w:t>8</w:t>
+          <w:t>6</w:t>
         </w:r>
         <w:r>
           <w:rPr>
@@ -1099,13 +1099,13 @@
           <w14:ligatures w14:val="standardContextual"/>
         </w:rPr>
       </w:pPr>
-      <w:hyperlink w:anchor="_Toc234332868" w:history="1">
+      <w:hyperlink w:anchor="_Toc234365192" w:history="1">
         <w:r>
           <w:rPr>
             <w:rStyle w:val="Hypertextovodkaz"/>
             <w:noProof/>
           </w:rPr>
-          <w:t>4.1 Tools and items</w:t>
+          <w:t>4.2 How the double chests work</w:t>
         </w:r>
         <w:r>
           <w:rPr>
@@ -1126,7 +1126,7 @@
             <w:noProof/>
             <w:webHidden/>
           </w:rPr>
-          <w:instrText xml:space="preserve"> PAGEREF _Toc234332868 \h </w:instrText>
+          <w:instrText xml:space="preserve"> PAGEREF _Toc234365192 \h </w:instrText>
         </w:r>
         <w:r>
           <w:rPr>
@@ -1146,7 +1146,7 @@
             <w:noProof/>
             <w:webHidden/>
           </w:rPr>
-          <w:t>8</w:t>
+          <w:t>7</w:t>
         </w:r>
         <w:r>
           <w:rPr>
@@ -1172,13 +1172,13 @@
           <w14:ligatures w14:val="standardContextual"/>
         </w:rPr>
       </w:pPr>
-      <w:hyperlink w:anchor="_Toc234332869" w:history="1">
+      <w:hyperlink w:anchor="_Toc234365193" w:history="1">
         <w:r>
           <w:rPr>
             <w:rStyle w:val="Hypertextovodkaz"/>
             <w:noProof/>
           </w:rPr>
-          <w:t>4.2 Multiple grids at once</w:t>
+          <w:t>4.3 Step by step</w:t>
         </w:r>
         <w:r>
           <w:rPr>
@@ -1199,7 +1199,7 @@
             <w:noProof/>
             <w:webHidden/>
           </w:rPr>
-          <w:instrText xml:space="preserve"> PAGEREF _Toc234332869 \h </w:instrText>
+          <w:instrText xml:space="preserve"> PAGEREF _Toc234365193 \h </w:instrText>
         </w:r>
         <w:r>
           <w:rPr>
@@ -1219,7 +1219,7 @@
             <w:noProof/>
             <w:webHidden/>
           </w:rPr>
-          <w:t>8</w:t>
+          <w:t>7</w:t>
         </w:r>
         <w:r>
           <w:rPr>
@@ -1245,13 +1245,13 @@
           <w14:ligatures w14:val="standardContextual"/>
         </w:rPr>
       </w:pPr>
-      <w:hyperlink w:anchor="_Toc234332870" w:history="1">
+      <w:hyperlink w:anchor="_Toc234365194" w:history="1">
         <w:r>
           <w:rPr>
             <w:rStyle w:val="Hypertextovodkaz"/>
             <w:noProof/>
           </w:rPr>
-          <w:t>4.3 Step by step</w:t>
+          <w:t>4.4 Manual experiments</w:t>
         </w:r>
         <w:r>
           <w:rPr>
@@ -1272,7 +1272,7 @@
             <w:noProof/>
             <w:webHidden/>
           </w:rPr>
-          <w:instrText xml:space="preserve"> PAGEREF _Toc234332870 \h </w:instrText>
+          <w:instrText xml:space="preserve"> PAGEREF _Toc234365194 \h </w:instrText>
         </w:r>
         <w:r>
           <w:rPr>
@@ -1305,7 +1305,7 @@
     </w:p>
     <w:p>
       <w:pPr>
-        <w:pStyle w:val="Obsah2"/>
+        <w:pStyle w:val="Obsah1"/>
         <w:tabs>
           <w:tab w:val="right" w:leader="dot" w:pos="9628"/>
         </w:tabs>
@@ -1318,13 +1318,13 @@
           <w14:ligatures w14:val="standardContextual"/>
         </w:rPr>
       </w:pPr>
-      <w:hyperlink w:anchor="_Toc234332871" w:history="1">
+      <w:hyperlink w:anchor="_Toc234365195" w:history="1">
         <w:r>
           <w:rPr>
             <w:rStyle w:val="Hypertextovodkaz"/>
             <w:noProof/>
           </w:rPr>
-          <w:t>4.4 Visualisation rules</w:t>
+          <w:t>5. Grover's Search Algorithm</w:t>
         </w:r>
         <w:r>
           <w:rPr>
@@ -1345,7 +1345,7 @@
             <w:noProof/>
             <w:webHidden/>
           </w:rPr>
-          <w:instrText xml:space="preserve"> PAGEREF _Toc234332871 \h </w:instrText>
+          <w:instrText xml:space="preserve"> PAGEREF _Toc234365195 \h </w:instrText>
         </w:r>
         <w:r>
           <w:rPr>
@@ -1378,7 +1378,7 @@
     </w:p>
     <w:p>
       <w:pPr>
-        <w:pStyle w:val="Obsah1"/>
+        <w:pStyle w:val="Obsah2"/>
         <w:tabs>
           <w:tab w:val="right" w:leader="dot" w:pos="9628"/>
         </w:tabs>
@@ -1391,13 +1391,13 @@
           <w14:ligatures w14:val="standardContextual"/>
         </w:rPr>
       </w:pPr>
-      <w:hyperlink w:anchor="_Toc234332872" w:history="1">
+      <w:hyperlink w:anchor="_Toc234365196" w:history="1">
         <w:r>
           <w:rPr>
             <w:rStyle w:val="Hypertextovodkaz"/>
             <w:noProof/>
           </w:rPr>
-          <w:t>5. E91 — Entanglement Protocol</w:t>
+          <w:t>5.1 Tools and items</w:t>
         </w:r>
         <w:r>
           <w:rPr>
@@ -1418,7 +1418,7 @@
             <w:noProof/>
             <w:webHidden/>
           </w:rPr>
-          <w:instrText xml:space="preserve"> PAGEREF _Toc234332872 \h </w:instrText>
+          <w:instrText xml:space="preserve"> PAGEREF _Toc234365196 \h </w:instrText>
         </w:r>
         <w:r>
           <w:rPr>
@@ -1438,7 +1438,7 @@
             <w:noProof/>
             <w:webHidden/>
           </w:rPr>
-          <w:t>10</w:t>
+          <w:t>9</w:t>
         </w:r>
         <w:r>
           <w:rPr>
@@ -1464,13 +1464,13 @@
           <w14:ligatures w14:val="standardContextual"/>
         </w:rPr>
       </w:pPr>
-      <w:hyperlink w:anchor="_Toc234332873" w:history="1">
+      <w:hyperlink w:anchor="_Toc234365197" w:history="1">
         <w:r>
           <w:rPr>
             <w:rStyle w:val="Hypertextovodkaz"/>
             <w:noProof/>
           </w:rPr>
-          <w:t>5.1 Tools and items</w:t>
+          <w:t>5.2 Multiple grids at once</w:t>
         </w:r>
         <w:r>
           <w:rPr>
@@ -1491,7 +1491,7 @@
             <w:noProof/>
             <w:webHidden/>
           </w:rPr>
-          <w:instrText xml:space="preserve"> PAGEREF _Toc234332873 \h </w:instrText>
+          <w:instrText xml:space="preserve"> PAGEREF _Toc234365197 \h </w:instrText>
         </w:r>
         <w:r>
           <w:rPr>
@@ -1511,7 +1511,7 @@
             <w:noProof/>
             <w:webHidden/>
           </w:rPr>
-          <w:t>10</w:t>
+          <w:t>9</w:t>
         </w:r>
         <w:r>
           <w:rPr>
@@ -1537,13 +1537,13 @@
           <w14:ligatures w14:val="standardContextual"/>
         </w:rPr>
       </w:pPr>
-      <w:hyperlink w:anchor="_Toc234332874" w:history="1">
+      <w:hyperlink w:anchor="_Toc234365198" w:history="1">
         <w:r>
           <w:rPr>
             <w:rStyle w:val="Hypertextovodkaz"/>
             <w:noProof/>
           </w:rPr>
-          <w:t>5.2 Step by step</w:t>
+          <w:t>5.3 Step by step</w:t>
         </w:r>
         <w:r>
           <w:rPr>
@@ -1564,7 +1564,7 @@
             <w:noProof/>
             <w:webHidden/>
           </w:rPr>
-          <w:instrText xml:space="preserve"> PAGEREF _Toc234332874 \h </w:instrText>
+          <w:instrText xml:space="preserve"> PAGEREF _Toc234365198 \h </w:instrText>
         </w:r>
         <w:r>
           <w:rPr>
@@ -1584,7 +1584,7 @@
             <w:noProof/>
             <w:webHidden/>
           </w:rPr>
-          <w:t>10</w:t>
+          <w:t>9</w:t>
         </w:r>
         <w:r>
           <w:rPr>
@@ -1610,13 +1610,13 @@
           <w14:ligatures w14:val="standardContextual"/>
         </w:rPr>
       </w:pPr>
-      <w:hyperlink w:anchor="_Toc234332875" w:history="1">
+      <w:hyperlink w:anchor="_Toc234365199" w:history="1">
         <w:r>
           <w:rPr>
             <w:rStyle w:val="Hypertextovodkaz"/>
             <w:noProof/>
           </w:rPr>
-          <w:t>5.3 The physics behind it</w:t>
+          <w:t>5.4 Visualisation rules</w:t>
         </w:r>
         <w:r>
           <w:rPr>
@@ -1637,7 +1637,7 @@
             <w:noProof/>
             <w:webHidden/>
           </w:rPr>
-          <w:instrText xml:space="preserve"> PAGEREF _Toc234332875 \h </w:instrText>
+          <w:instrText xml:space="preserve"> PAGEREF _Toc234365199 \h </w:instrText>
         </w:r>
         <w:r>
           <w:rPr>
@@ -1657,7 +1657,7 @@
             <w:noProof/>
             <w:webHidden/>
           </w:rPr>
-          <w:t>11</w:t>
+          <w:t>10</w:t>
         </w:r>
         <w:r>
           <w:rPr>
@@ -1683,13 +1683,13 @@
           <w14:ligatures w14:val="standardContextual"/>
         </w:rPr>
       </w:pPr>
-      <w:hyperlink w:anchor="_Toc234332876" w:history="1">
+      <w:hyperlink w:anchor="_Toc234365200" w:history="1">
         <w:r>
           <w:rPr>
             <w:rStyle w:val="Hypertextovodkaz"/>
             <w:noProof/>
           </w:rPr>
-          <w:t>6. Plasma — the Lobby Effect</w:t>
+          <w:t>6. E91 — Entanglement Protocol</w:t>
         </w:r>
         <w:r>
           <w:rPr>
@@ -1710,7 +1710,7 @@
             <w:noProof/>
             <w:webHidden/>
           </w:rPr>
-          <w:instrText xml:space="preserve"> PAGEREF _Toc234332876 \h </w:instrText>
+          <w:instrText xml:space="preserve"> PAGEREF _Toc234365200 \h </w:instrText>
         </w:r>
         <w:r>
           <w:rPr>
@@ -1730,7 +1730,7 @@
             <w:noProof/>
             <w:webHidden/>
           </w:rPr>
-          <w:t>12</w:t>
+          <w:t>11</w:t>
         </w:r>
         <w:r>
           <w:rPr>
@@ -1756,13 +1756,13 @@
           <w14:ligatures w14:val="standardContextual"/>
         </w:rPr>
       </w:pPr>
-      <w:hyperlink w:anchor="_Toc234332877" w:history="1">
+      <w:hyperlink w:anchor="_Toc234365201" w:history="1">
         <w:r>
           <w:rPr>
             <w:rStyle w:val="Hypertextovodkaz"/>
             <w:noProof/>
           </w:rPr>
-          <w:t>6.1 Tools and commands</w:t>
+          <w:t>6.1 Tools and items</w:t>
         </w:r>
         <w:r>
           <w:rPr>
@@ -1783,7 +1783,7 @@
             <w:noProof/>
             <w:webHidden/>
           </w:rPr>
-          <w:instrText xml:space="preserve"> PAGEREF _Toc234332877 \h </w:instrText>
+          <w:instrText xml:space="preserve"> PAGEREF _Toc234365201 \h </w:instrText>
         </w:r>
         <w:r>
           <w:rPr>
@@ -1803,7 +1803,7 @@
             <w:noProof/>
             <w:webHidden/>
           </w:rPr>
-          <w:t>12</w:t>
+          <w:t>11</w:t>
         </w:r>
         <w:r>
           <w:rPr>
@@ -1816,7 +1816,7 @@
     </w:p>
     <w:p>
       <w:pPr>
-        <w:pStyle w:val="Obsah1"/>
+        <w:pStyle w:val="Obsah2"/>
         <w:tabs>
           <w:tab w:val="right" w:leader="dot" w:pos="9628"/>
         </w:tabs>
@@ -1829,13 +1829,13 @@
           <w14:ligatures w14:val="standardContextual"/>
         </w:rPr>
       </w:pPr>
-      <w:hyperlink w:anchor="_Toc234332878" w:history="1">
+      <w:hyperlink w:anchor="_Toc234365202" w:history="1">
         <w:r>
           <w:rPr>
             <w:rStyle w:val="Hypertextovodkaz"/>
             <w:noProof/>
           </w:rPr>
-          <w:t>7. Tutorial Hall and Guided Walkthrough</w:t>
+          <w:t>6.2 Step by step</w:t>
         </w:r>
         <w:r>
           <w:rPr>
@@ -1856,7 +1856,7 @@
             <w:noProof/>
             <w:webHidden/>
           </w:rPr>
-          <w:instrText xml:space="preserve"> PAGEREF _Toc234332878 \h </w:instrText>
+          <w:instrText xml:space="preserve"> PAGEREF _Toc234365202 \h </w:instrText>
         </w:r>
         <w:r>
           <w:rPr>
@@ -1876,7 +1876,7 @@
             <w:noProof/>
             <w:webHidden/>
           </w:rPr>
-          <w:t>13</w:t>
+          <w:t>11</w:t>
         </w:r>
         <w:r>
           <w:rPr>
@@ -1902,13 +1902,13 @@
           <w14:ligatures w14:val="standardContextual"/>
         </w:rPr>
       </w:pPr>
-      <w:hyperlink w:anchor="_Toc234332879" w:history="1">
+      <w:hyperlink w:anchor="_Toc234365203" w:history="1">
         <w:r>
           <w:rPr>
             <w:rStyle w:val="Hypertextovodkaz"/>
             <w:noProof/>
           </w:rPr>
-          <w:t>7.1 Building the hall</w:t>
+          <w:t>6.3 The physics behind it</w:t>
         </w:r>
         <w:r>
           <w:rPr>
@@ -1929,7 +1929,7 @@
             <w:noProof/>
             <w:webHidden/>
           </w:rPr>
-          <w:instrText xml:space="preserve"> PAGEREF _Toc234332879 \h </w:instrText>
+          <w:instrText xml:space="preserve"> PAGEREF _Toc234365203 \h </w:instrText>
         </w:r>
         <w:r>
           <w:rPr>
@@ -1949,7 +1949,7 @@
             <w:noProof/>
             <w:webHidden/>
           </w:rPr>
-          <w:t>13</w:t>
+          <w:t>12</w:t>
         </w:r>
         <w:r>
           <w:rPr>
@@ -1962,7 +1962,7 @@
     </w:p>
     <w:p>
       <w:pPr>
-        <w:pStyle w:val="Obsah2"/>
+        <w:pStyle w:val="Obsah1"/>
         <w:tabs>
           <w:tab w:val="right" w:leader="dot" w:pos="9628"/>
         </w:tabs>
@@ -1975,13 +1975,13 @@
           <w14:ligatures w14:val="standardContextual"/>
         </w:rPr>
       </w:pPr>
-      <w:hyperlink w:anchor="_Toc234332880" w:history="1">
+      <w:hyperlink w:anchor="_Toc234365204" w:history="1">
         <w:r>
           <w:rPr>
             <w:rStyle w:val="Hypertextovodkaz"/>
             <w:noProof/>
           </w:rPr>
-          <w:t>7.2 Running the tutorial</w:t>
+          <w:t>7. Plasma — the Lobby Effect</w:t>
         </w:r>
         <w:r>
           <w:rPr>
@@ -2002,7 +2002,7 @@
             <w:noProof/>
             <w:webHidden/>
           </w:rPr>
-          <w:instrText xml:space="preserve"> PAGEREF _Toc234332880 \h </w:instrText>
+          <w:instrText xml:space="preserve"> PAGEREF _Toc234365204 \h </w:instrText>
         </w:r>
         <w:r>
           <w:rPr>
@@ -2048,13 +2048,13 @@
           <w14:ligatures w14:val="standardContextual"/>
         </w:rPr>
       </w:pPr>
-      <w:hyperlink w:anchor="_Toc234332881" w:history="1">
+      <w:hyperlink w:anchor="_Toc234365205" w:history="1">
         <w:r>
           <w:rPr>
             <w:rStyle w:val="Hypertextovodkaz"/>
             <w:noProof/>
           </w:rPr>
-          <w:t>7.3 What you will do in each room</w:t>
+          <w:t>7.1 Tools and commands</w:t>
         </w:r>
         <w:r>
           <w:rPr>
@@ -2075,7 +2075,7 @@
             <w:noProof/>
             <w:webHidden/>
           </w:rPr>
-          <w:instrText xml:space="preserve"> PAGEREF _Toc234332881 \h </w:instrText>
+          <w:instrText xml:space="preserve"> PAGEREF _Toc234365205 \h </w:instrText>
         </w:r>
         <w:r>
           <w:rPr>
@@ -2121,7 +2121,7 @@
           <w14:ligatures w14:val="standardContextual"/>
         </w:rPr>
       </w:pPr>
-      <w:hyperlink w:anchor="_Toc234332882" w:history="1">
+      <w:hyperlink w:anchor="_Toc234365206" w:history="1">
         <w:r>
           <w:rPr>
             <w:rStyle w:val="Hypertextovodkaz"/>
@@ -2148,7 +2148,7 @@
             <w:noProof/>
             <w:webHidden/>
           </w:rPr>
-          <w:instrText xml:space="preserve"> PAGEREF _Toc234332882 \h </w:instrText>
+          <w:instrText xml:space="preserve"> PAGEREF _Toc234365206 \h </w:instrText>
         </w:r>
         <w:r>
           <w:rPr>
@@ -2194,7 +2194,7 @@
           <w14:ligatures w14:val="standardContextual"/>
         </w:rPr>
       </w:pPr>
-      <w:hyperlink w:anchor="_Toc234332883" w:history="1">
+      <w:hyperlink w:anchor="_Toc234365207" w:history="1">
         <w:r>
           <w:rPr>
             <w:rStyle w:val="Hypertextovodkaz"/>
@@ -2221,7 +2221,7 @@
             <w:noProof/>
             <w:webHidden/>
           </w:rPr>
-          <w:instrText xml:space="preserve"> PAGEREF _Toc234332883 \h </w:instrText>
+          <w:instrText xml:space="preserve"> PAGEREF _Toc234365207 \h </w:instrText>
         </w:r>
         <w:r>
           <w:rPr>
@@ -2267,7 +2267,7 @@
           <w14:ligatures w14:val="standardContextual"/>
         </w:rPr>
       </w:pPr>
-      <w:hyperlink w:anchor="_Toc234332884" w:history="1">
+      <w:hyperlink w:anchor="_Toc234365208" w:history="1">
         <w:r>
           <w:rPr>
             <w:rStyle w:val="Hypertextovodkaz"/>
@@ -2294,7 +2294,7 @@
             <w:noProof/>
             <w:webHidden/>
           </w:rPr>
-          <w:instrText xml:space="preserve"> PAGEREF _Toc234332884 \h </w:instrText>
+          <w:instrText xml:space="preserve"> PAGEREF _Toc234365208 \h </w:instrText>
         </w:r>
         <w:r>
           <w:rPr>
@@ -2340,7 +2340,7 @@
           <w14:ligatures w14:val="standardContextual"/>
         </w:rPr>
       </w:pPr>
-      <w:hyperlink w:anchor="_Toc234332885" w:history="1">
+      <w:hyperlink w:anchor="_Toc234365209" w:history="1">
         <w:r>
           <w:rPr>
             <w:rStyle w:val="Hypertextovodkaz"/>
@@ -2367,7 +2367,7 @@
             <w:noProof/>
             <w:webHidden/>
           </w:rPr>
-          <w:instrText xml:space="preserve"> PAGEREF _Toc234332885 \h </w:instrText>
+          <w:instrText xml:space="preserve"> PAGEREF _Toc234365209 \h </w:instrText>
         </w:r>
         <w:r>
           <w:rPr>
@@ -2413,7 +2413,7 @@
           <w14:ligatures w14:val="standardContextual"/>
         </w:rPr>
       </w:pPr>
-      <w:hyperlink w:anchor="_Toc234332886" w:history="1">
+      <w:hyperlink w:anchor="_Toc234365210" w:history="1">
         <w:r>
           <w:rPr>
             <w:rStyle w:val="Hypertextovodkaz"/>
@@ -2440,7 +2440,7 @@
             <w:noProof/>
             <w:webHidden/>
           </w:rPr>
-          <w:instrText xml:space="preserve"> PAGEREF _Toc234332886 \h </w:instrText>
+          <w:instrText xml:space="preserve"> PAGEREF _Toc234365210 \h </w:instrText>
         </w:r>
         <w:r>
           <w:rPr>
@@ -2486,7 +2486,7 @@
           <w14:ligatures w14:val="standardContextual"/>
         </w:rPr>
       </w:pPr>
-      <w:hyperlink w:anchor="_Toc234332887" w:history="1">
+      <w:hyperlink w:anchor="_Toc234365211" w:history="1">
         <w:r>
           <w:rPr>
             <w:rStyle w:val="Hypertextovodkaz"/>
@@ -2513,7 +2513,7 @@
             <w:noProof/>
             <w:webHidden/>
           </w:rPr>
-          <w:instrText xml:space="preserve"> PAGEREF _Toc234332887 \h </w:instrText>
+          <w:instrText xml:space="preserve"> PAGEREF _Toc234365211 \h </w:instrText>
         </w:r>
         <w:r>
           <w:rPr>
@@ -2559,7 +2559,7 @@
           <w14:ligatures w14:val="standardContextual"/>
         </w:rPr>
       </w:pPr>
-      <w:hyperlink w:anchor="_Toc234332888" w:history="1">
+      <w:hyperlink w:anchor="_Toc234365212" w:history="1">
         <w:r>
           <w:rPr>
             <w:rStyle w:val="Hypertextovodkaz"/>
@@ -2586,7 +2586,7 @@
             <w:noProof/>
             <w:webHidden/>
           </w:rPr>
-          <w:instrText xml:space="preserve"> PAGEREF _Toc234332888 \h </w:instrText>
+          <w:instrText xml:space="preserve"> PAGEREF _Toc234365212 \h </w:instrText>
         </w:r>
         <w:r>
           <w:rPr>
@@ -2626,7 +2626,7 @@
       <w:pPr>
         <w:pStyle w:val="Nadpis1"/>
       </w:pPr>
-      <w:bookmarkStart w:id="0" w:name="_Toc234332855"/>
+      <w:bookmarkStart w:id="0" w:name="_Toc234365179"/>
       <w:r>
         <w:t>1. Introduction</w:t>
       </w:r>
@@ -2697,7 +2697,7 @@
       <w:pPr>
         <w:pStyle w:val="Nadpis2"/>
       </w:pPr>
-      <w:bookmarkStart w:id="1" w:name="_Toc234332856"/>
+      <w:bookmarkStart w:id="1" w:name="_Toc234365180"/>
       <w:r>
         <w:t>1.1 Requirements and installation</w:t>
       </w:r>
@@ -2828,7 +2828,7 @@
       <w:pPr>
         <w:pStyle w:val="Nadpis2"/>
       </w:pPr>
-      <w:bookmarkStart w:id="2" w:name="_Toc234332857"/>
+      <w:bookmarkStart w:id="2" w:name="_Toc234365181"/>
       <w:r>
         <w:t>1.2 Commands, aliases and permissions</w:t>
       </w:r>
@@ -2952,6 +2952,11 @@
     <w:p>
       <w:r>
         <w:t>Chapter 8 contains the complete command reference; each protocol chapter lists its own commands as well.</w:t>
+      </w:r>
+    </w:p>
+    <w:p>
+      <w:r>
+        <w:t>New to QAcraft? Start with chapter 2 — the guided tutorial walks you through all three protocols hands-on.</w:t>
       </w:r>
     </w:p>
     <w:p>
@@ -2986,33 +2991,42 @@
       <w:pPr>
         <w:pStyle w:val="Nadpis1"/>
       </w:pPr>
-      <w:bookmarkStart w:id="3" w:name="_Toc234332858"/>
-      <w:r>
-        <w:t>2. Getting Tools and Items</w:t>
+      <w:bookmarkStart w:id="3" w:name="_Toc234365182"/>
+      <w:r>
+        <w:t>2. Try the Plugin on Your Own — the Tutorial Hall</w:t>
       </w:r>
       <w:bookmarkEnd w:id="3"/>
     </w:p>
     <w:p>
       <w:r>
-        <w:t xml:space="preserve">All QAcraft tools are </w:t>
+        <w:t xml:space="preserve">The fastest way to try the plugin on your own: let it build a complete, decorated </w:t>
       </w:r>
       <w:r>
         <w:rPr>
           <w:b/>
         </w:rPr>
-        <w:t>named Minecraft items</w:t>
-      </w:r>
-      <w:r>
-        <w:t xml:space="preserve"> — the coloured name is what makes an item a quantum tool. A plain Nether Star from the creative inventory does nothing; the named "Quantum Sender" does. There are two ways to get tools:</w:t>
+        <w:t>tutorial hall</w:t>
+      </w:r>
+      <w:r>
+        <w:t xml:space="preserve"> and take the gated, step-by-step </w:t>
+      </w:r>
+      <w:r>
+        <w:rPr>
+          <w:b/>
+        </w:rPr>
+        <w:t>interactive tutorial</w:t>
+      </w:r>
+      <w:r>
+        <w:t xml:space="preserve"> inside it — ideal for a first encounter as well as for workshops with students.</w:t>
       </w:r>
     </w:p>
     <w:p>
       <w:pPr>
         <w:pStyle w:val="Nadpis2"/>
       </w:pPr>
-      <w:bookmarkStart w:id="4" w:name="_Toc234332859"/>
-      <w:r>
-        <w:t>2.1 Tool sets</w:t>
+      <w:bookmarkStart w:id="4" w:name="_Toc234365183"/>
+      <w:r>
+        <w:t>2.1 Building the hall</w:t>
       </w:r>
       <w:bookmarkEnd w:id="4"/>
     </w:p>
@@ -3029,7 +3043,7 @@
           <w:sz w:val="20"/>
           <w:szCs w:val="20"/>
         </w:rPr>
-        <w:t>/qacraft tools bb84      — BB84 set (photons, filters, sender, gate…)</w:t>
+        <w:t>/qacraft world build    — builds the hall in front of you (needs flat space ≈64×11 blocks)</w:t>
       </w:r>
     </w:p>
     <w:p>
@@ -3045,8 +3059,68 @@
           <w:sz w:val="20"/>
           <w:szCs w:val="20"/>
         </w:rPr>
-        <w:t>/qacraft tools grover    — Grover set (setup, chests, operator, observer, reset)</w:t>
-      </w:r>
+        <w:t>/qacraft world clear    — removes the hall and restores the terrain</w:t>
+      </w:r>
+    </w:p>
+    <w:p>
+      <w:r>
+        <w:t xml:space="preserve">The hall has four zones in a row: </w:t>
+      </w:r>
+      <w:r>
+        <w:rPr>
+          <w:b/>
+        </w:rPr>
+        <w:t>Lobby</w:t>
+      </w:r>
+      <w:r>
+        <w:t xml:space="preserve">, </w:t>
+      </w:r>
+      <w:r>
+        <w:rPr>
+          <w:b/>
+        </w:rPr>
+        <w:t>BB84</w:t>
+      </w:r>
+      <w:r>
+        <w:t xml:space="preserve">, </w:t>
+      </w:r>
+      <w:r>
+        <w:rPr>
+          <w:b/>
+        </w:rPr>
+        <w:t>Grover</w:t>
+      </w:r>
+      <w:r>
+        <w:t xml:space="preserve"> and </w:t>
+      </w:r>
+      <w:r>
+        <w:rPr>
+          <w:b/>
+        </w:rPr>
+        <w:t>E91</w:t>
+      </w:r>
+      <w:r>
+        <w:t xml:space="preserve">. Every protocol room contains: coloured floor and wall panels with explanations, item showcases on quartz pillars (the room's tools with name plaques), marked floor spots for the apparatus, and a glowing </w:t>
+      </w:r>
+      <w:r>
+        <w:rPr>
+          <w:b/>
+        </w:rPr>
+        <w:t>Tools button</w:t>
+      </w:r>
+      <w:r>
+        <w:t xml:space="preserve"> that hands out the room's tool set. The E91 room has Alice / Bob billboards.</w:t>
+      </w:r>
+    </w:p>
+    <w:p>
+      <w:pPr>
+        <w:pStyle w:val="Nadpis2"/>
+      </w:pPr>
+      <w:bookmarkStart w:id="5" w:name="_Toc234365184"/>
+      <w:r>
+        <w:t>2.2 Running the tutorial</w:t>
+      </w:r>
+      <w:bookmarkEnd w:id="5"/>
     </w:p>
     <w:p>
       <w:pPr>
@@ -3061,7 +3135,7 @@
           <w:sz w:val="20"/>
           <w:szCs w:val="20"/>
         </w:rPr>
-        <w:t>/qacraft tools e91       — E91 set (source, filters, Alice/Bob pads)</w:t>
+        <w:t>/qacraft tutorial start — starts the guided run (one run at a time, for the whole server)</w:t>
       </w:r>
     </w:p>
     <w:p>
@@ -3077,15 +3151,133 @@
           <w:sz w:val="20"/>
           <w:szCs w:val="20"/>
         </w:rPr>
-        <w:t>/qacraft tools all       — everything at once</w:t>
-      </w:r>
-    </w:p>
-    <w:p>
-      <w:pPr>
-        <w:shd w:val="clear" w:color="auto" w:fill="F2F2F2"/>
-        <w:spacing w:before="20" w:after="20"/>
-        <w:ind w:left="284"/>
-      </w:pPr>
+        <w:t>/qacraft tutorial stop  — aborts it</w:t>
+      </w:r>
+    </w:p>
+    <w:p>
+      <w:r>
+        <w:t>What the tutorial does:</w:t>
+      </w:r>
+    </w:p>
+    <w:p>
+      <w:pPr>
+        <w:numPr>
+          <w:ilvl w:val="0"/>
+          <w:numId w:val="1"/>
+        </w:numPr>
+      </w:pPr>
+      <w:r>
+        <w:t>Teleports you to the lobby, empties your hands and bars the entrance — the rooms are connected by iron-bar doors that open only as you progress.</w:t>
+      </w:r>
+    </w:p>
+    <w:p>
+      <w:pPr>
+        <w:numPr>
+          <w:ilvl w:val="0"/>
+          <w:numId w:val="1"/>
+        </w:numPr>
+      </w:pPr>
+      <w:r>
+        <w:t>Each room shows floating instructions, one step at a time, with the exact target spot highlighted ("Sender here", "Double chest here" …).</w:t>
+      </w:r>
+    </w:p>
+    <w:p>
+      <w:pPr>
+        <w:numPr>
+          <w:ilvl w:val="0"/>
+          <w:numId w:val="1"/>
+        </w:numPr>
+      </w:pPr>
+      <w:r>
+        <w:t xml:space="preserve">Steps complete </w:t>
+      </w:r>
+      <w:r>
+        <w:rPr>
+          <w:b/>
+        </w:rPr>
+        <w:t>automatically</w:t>
+      </w:r>
+      <w:r>
+        <w:t xml:space="preserve"> when the world matches (apparatus placed, chest filled…). Undoing a step brings its instruction back — the tutorial constantly re-checks everything.</w:t>
+      </w:r>
+    </w:p>
+    <w:p>
+      <w:pPr>
+        <w:numPr>
+          <w:ilvl w:val="0"/>
+          <w:numId w:val="1"/>
+        </w:numPr>
+      </w:pPr>
+      <w:r>
+        <w:t xml:space="preserve">When a room is complete, a </w:t>
+      </w:r>
+      <w:r>
+        <w:rPr>
+          <w:b/>
+        </w:rPr>
+        <w:t>Next room</w:t>
+      </w:r>
+      <w:r>
+        <w:t xml:space="preserve"> button appears; only pressing it opens the door. Walls and doors are indestructible while the tutorial runs.</w:t>
+      </w:r>
+    </w:p>
+    <w:p>
+      <w:pPr>
+        <w:numPr>
+          <w:ilvl w:val="0"/>
+          <w:numId w:val="1"/>
+        </w:numPr>
+      </w:pPr>
+      <w:r>
+        <w:t>The last step of every room has a ~10-second pause so you can watch the result (the 27 photons, the probability columns, the entangled flash).</w:t>
+      </w:r>
+    </w:p>
+    <w:p>
+      <w:pPr>
+        <w:numPr>
+          <w:ilvl w:val="0"/>
+          <w:numId w:val="1"/>
+        </w:numPr>
+      </w:pPr>
+      <w:r>
+        <w:t xml:space="preserve">The E91 room ends with a </w:t>
+      </w:r>
+      <w:r>
+        <w:rPr>
+          <w:b/>
+        </w:rPr>
+        <w:t>Finish</w:t>
+      </w:r>
+      <w:r>
+        <w:t xml:space="preserve"> button: it teleports you back to the lobby, launches fireworks and cleans up the apparatus.</w:t>
+      </w:r>
+    </w:p>
+    <w:p>
+      <w:pPr>
+        <w:pStyle w:val="Nadpis2"/>
+      </w:pPr>
+      <w:bookmarkStart w:id="6" w:name="_Toc234365185"/>
+      <w:r>
+        <w:t>2.3 What you will do in each room</w:t>
+      </w:r>
+      <w:bookmarkEnd w:id="6"/>
+    </w:p>
+    <w:p>
+      <w:pPr>
+        <w:numPr>
+          <w:ilvl w:val="0"/>
+          <w:numId w:val="1"/>
+        </w:numPr>
+      </w:pPr>
+      <w:r>
+        <w:rPr>
+          <w:b/>
+        </w:rPr>
+        <w:t>BB84:</w:t>
+      </w:r>
+      <w:r>
+        <w:t xml:space="preserve"> place the Sender on the marked spot → build its double chest → </w:t>
+      </w:r>
       <w:r>
         <w:rPr>
           <w:rFonts w:ascii="Consolas" w:hAnsi="Consolas" w:cs="Consolas"/>
@@ -3093,37 +3285,11 @@
           <w:sz w:val="20"/>
           <w:szCs w:val="20"/>
         </w:rPr>
-        <w:t>/qacraft plasma          — plasma tools (summoner + remover)</w:t>
-      </w:r>
-    </w:p>
-    <w:p>
-      <w:r>
-        <w:t>⚠</w:t>
-      </w:r>
-      <w:r>
-        <w:t xml:space="preserve"> </w:t>
-      </w:r>
-      <w:r>
-        <w:rPr>
-          <w:b/>
-        </w:rPr>
-        <w:t>Every tool-set command first clears your entire inventory</w:t>
-      </w:r>
-      <w:r>
-        <w:t xml:space="preserve"> and then adds the set. The BB84 set additionally puts 64 blue + 64 red stained glass panes and a stack of each spare filter into the main inventory.</w:t>
-      </w:r>
-    </w:p>
-    <w:p>
-      <w:pPr>
-        <w:pStyle w:val="Nadpis2"/>
-      </w:pPr>
-      <w:bookmarkStart w:id="5" w:name="_Toc234332860"/>
-      <w:r>
-        <w:t>2.2 Single items — keep your inventory</w:t>
-      </w:r>
-      <w:bookmarkEnd w:id="5"/>
-    </w:p>
-    <w:p>
+        <w:t>/q sender fill</w:t>
+      </w:r>
+      <w:r>
+        <w:t xml:space="preserve"> + lay bit glass panes → place the Gate → build its chest → fill it with Compasses → place the Quantum Cable → </w:t>
+      </w:r>
       <w:r>
         <w:rPr>
           <w:rFonts w:ascii="Consolas" w:hAnsi="Consolas" w:cs="Consolas"/>
@@ -3131,27 +3297,28 @@
           <w:sz w:val="20"/>
           <w:szCs w:val="20"/>
         </w:rPr>
-        <w:t>/qacraft item &lt;name&gt;</w:t>
-      </w:r>
-      <w:r>
-        <w:t xml:space="preserve"> adds one tool </w:t>
-      </w:r>
+        <w:t>/q sender start</w:t>
+      </w:r>
+      <w:r>
+        <w:t xml:space="preserve"> and watch all 27 photons.</w:t>
+      </w:r>
+    </w:p>
+    <w:p>
+      <w:pPr>
+        <w:numPr>
+          <w:ilvl w:val="0"/>
+          <w:numId w:val="1"/>
+        </w:numPr>
+      </w:pPr>
       <w:r>
         <w:rPr>
           <w:b/>
         </w:rPr>
-        <w:t>without clearing anything</w:t>
-      </w:r>
-      <w:r>
-        <w:t xml:space="preserve"> (tab-completion suggests the names):</w:t>
-      </w:r>
-    </w:p>
-    <w:p>
-      <w:pPr>
-        <w:shd w:val="clear" w:color="auto" w:fill="F2F2F2"/>
-        <w:spacing w:before="20" w:after="20"/>
-        <w:ind w:left="284"/>
-      </w:pPr>
+        <w:t>Grover:</w:t>
+      </w:r>
+      <w:r>
+        <w:t xml:space="preserve"> stand on the centre spot → </w:t>
+      </w:r>
       <w:r>
         <w:rPr>
           <w:rFonts w:ascii="Consolas" w:hAnsi="Consolas" w:cs="Consolas"/>
@@ -3159,6 +3326,242 @@
           <w:sz w:val="20"/>
           <w:szCs w:val="20"/>
         </w:rPr>
+        <w:t>/q grover setup 1</w:t>
+      </w:r>
+      <w:r>
+        <w:t xml:space="preserve"> → </w:t>
+      </w:r>
+      <w:r>
+        <w:rPr>
+          <w:rFonts w:ascii="Consolas" w:hAnsi="Consolas" w:cs="Consolas"/>
+          <w:color w:val="1F4E79"/>
+          <w:sz w:val="20"/>
+          <w:szCs w:val="20"/>
+        </w:rPr>
+        <w:t>/q grover placechests 1</w:t>
+      </w:r>
+      <w:r>
+        <w:t xml:space="preserve"> → </w:t>
+      </w:r>
+      <w:r>
+        <w:rPr>
+          <w:rFonts w:ascii="Consolas" w:hAnsi="Consolas" w:cs="Consolas"/>
+          <w:color w:val="1F4E79"/>
+          <w:sz w:val="20"/>
+          <w:szCs w:val="20"/>
+        </w:rPr>
+        <w:t>/q grover fillwool 1</w:t>
+      </w:r>
+      <w:r>
+        <w:t xml:space="preserve"> → spyglass + wool in offhand, throw the Wind Charge and watch the columns.</w:t>
+      </w:r>
+    </w:p>
+    <w:p>
+      <w:pPr>
+        <w:numPr>
+          <w:ilvl w:val="0"/>
+          <w:numId w:val="1"/>
+        </w:numPr>
+      </w:pPr>
+      <w:r>
+        <w:rPr>
+          <w:b/>
+        </w:rPr>
+        <w:t>E91:</w:t>
+      </w:r>
+      <w:r>
+        <w:t xml:space="preserve"> place the EPR Source on the marked spot → place Alice's and Bob's pads on the cyan/orange spots → </w:t>
+      </w:r>
+      <w:r>
+        <w:rPr>
+          <w:rFonts w:ascii="Consolas" w:hAnsi="Consolas" w:cs="Consolas"/>
+          <w:color w:val="1F4E79"/>
+          <w:sz w:val="20"/>
+          <w:szCs w:val="20"/>
+        </w:rPr>
+        <w:t>/q e91 generate</w:t>
+      </w:r>
+      <w:r>
+        <w:t xml:space="preserve"> → measure a photon with a filter.</w:t>
+      </w:r>
+    </w:p>
+    <w:p>
+      <w:pPr>
+        <w:pStyle w:val="Nadpis1"/>
+      </w:pPr>
+      <w:bookmarkStart w:id="7" w:name="_Toc234365186"/>
+      <w:r>
+        <w:t>3. Getting Tools and Items</w:t>
+      </w:r>
+      <w:bookmarkEnd w:id="7"/>
+    </w:p>
+    <w:p>
+      <w:r>
+        <w:t xml:space="preserve">All QAcraft tools are </w:t>
+      </w:r>
+      <w:r>
+        <w:rPr>
+          <w:b/>
+        </w:rPr>
+        <w:t>named Minecraft items</w:t>
+      </w:r>
+      <w:r>
+        <w:t xml:space="preserve"> — the coloured name is what makes an item a quantum tool. A plain Nether Star from the creative inventory does nothing; the named "Quantum Sender" does. There are two ways to get tools:</w:t>
+      </w:r>
+    </w:p>
+    <w:p>
+      <w:pPr>
+        <w:pStyle w:val="Nadpis2"/>
+      </w:pPr>
+      <w:bookmarkStart w:id="8" w:name="_Toc234365187"/>
+      <w:r>
+        <w:t>3.1 Tool sets</w:t>
+      </w:r>
+      <w:bookmarkEnd w:id="8"/>
+    </w:p>
+    <w:p>
+      <w:pPr>
+        <w:shd w:val="clear" w:color="auto" w:fill="F2F2F2"/>
+        <w:spacing w:before="20" w:after="20"/>
+        <w:ind w:left="284"/>
+      </w:pPr>
+      <w:r>
+        <w:rPr>
+          <w:rFonts w:ascii="Consolas" w:hAnsi="Consolas" w:cs="Consolas"/>
+          <w:color w:val="1F4E79"/>
+          <w:sz w:val="20"/>
+          <w:szCs w:val="20"/>
+        </w:rPr>
+        <w:t>/qacraft tools bb84      — BB84 set (photons, filters, sender, gate…)</w:t>
+      </w:r>
+    </w:p>
+    <w:p>
+      <w:pPr>
+        <w:shd w:val="clear" w:color="auto" w:fill="F2F2F2"/>
+        <w:spacing w:before="20" w:after="20"/>
+        <w:ind w:left="284"/>
+      </w:pPr>
+      <w:r>
+        <w:rPr>
+          <w:rFonts w:ascii="Consolas" w:hAnsi="Consolas" w:cs="Consolas"/>
+          <w:color w:val="1F4E79"/>
+          <w:sz w:val="20"/>
+          <w:szCs w:val="20"/>
+        </w:rPr>
+        <w:t>/qacraft tools grover    — Grover set (setup, chests, operator, observer, reset)</w:t>
+      </w:r>
+    </w:p>
+    <w:p>
+      <w:pPr>
+        <w:shd w:val="clear" w:color="auto" w:fill="F2F2F2"/>
+        <w:spacing w:before="20" w:after="20"/>
+        <w:ind w:left="284"/>
+      </w:pPr>
+      <w:r>
+        <w:rPr>
+          <w:rFonts w:ascii="Consolas" w:hAnsi="Consolas" w:cs="Consolas"/>
+          <w:color w:val="1F4E79"/>
+          <w:sz w:val="20"/>
+          <w:szCs w:val="20"/>
+        </w:rPr>
+        <w:t>/qacraft tools e91       — E91 set (source, filters, Alice/Bob pads)</w:t>
+      </w:r>
+    </w:p>
+    <w:p>
+      <w:pPr>
+        <w:shd w:val="clear" w:color="auto" w:fill="F2F2F2"/>
+        <w:spacing w:before="20" w:after="20"/>
+        <w:ind w:left="284"/>
+      </w:pPr>
+      <w:r>
+        <w:rPr>
+          <w:rFonts w:ascii="Consolas" w:hAnsi="Consolas" w:cs="Consolas"/>
+          <w:color w:val="1F4E79"/>
+          <w:sz w:val="20"/>
+          <w:szCs w:val="20"/>
+        </w:rPr>
+        <w:t>/qacraft tools all       — everything at once</w:t>
+      </w:r>
+    </w:p>
+    <w:p>
+      <w:pPr>
+        <w:shd w:val="clear" w:color="auto" w:fill="F2F2F2"/>
+        <w:spacing w:before="20" w:after="20"/>
+        <w:ind w:left="284"/>
+      </w:pPr>
+      <w:r>
+        <w:rPr>
+          <w:rFonts w:ascii="Consolas" w:hAnsi="Consolas" w:cs="Consolas"/>
+          <w:color w:val="1F4E79"/>
+          <w:sz w:val="20"/>
+          <w:szCs w:val="20"/>
+        </w:rPr>
+        <w:t>/qacraft plasma          — plasma tools (summoner + remover)</w:t>
+      </w:r>
+    </w:p>
+    <w:p>
+      <w:r>
+        <w:t>⚠</w:t>
+      </w:r>
+      <w:r>
+        <w:t xml:space="preserve"> </w:t>
+      </w:r>
+      <w:r>
+        <w:rPr>
+          <w:b/>
+        </w:rPr>
+        <w:t>Every tool-set command first clears your entire inventory</w:t>
+      </w:r>
+      <w:r>
+        <w:t xml:space="preserve"> and then adds the set. The BB84 set additionally puts 64 blue + 64 red stained glass panes and a stack of each spare filter into the main inventory.</w:t>
+      </w:r>
+    </w:p>
+    <w:p>
+      <w:pPr>
+        <w:pStyle w:val="Nadpis2"/>
+      </w:pPr>
+      <w:bookmarkStart w:id="9" w:name="_Toc234365188"/>
+      <w:r>
+        <w:t>3.2 Single items — keep your inventory</w:t>
+      </w:r>
+      <w:bookmarkEnd w:id="9"/>
+    </w:p>
+    <w:p>
+      <w:r>
+        <w:rPr>
+          <w:rFonts w:ascii="Consolas" w:hAnsi="Consolas" w:cs="Consolas"/>
+          <w:color w:val="1F4E79"/>
+          <w:sz w:val="20"/>
+          <w:szCs w:val="20"/>
+        </w:rPr>
+        <w:t>/qacraft item &lt;name&gt;</w:t>
+      </w:r>
+      <w:r>
+        <w:t xml:space="preserve"> adds one tool </w:t>
+      </w:r>
+      <w:r>
+        <w:rPr>
+          <w:b/>
+        </w:rPr>
+        <w:t>without clearing anything</w:t>
+      </w:r>
+      <w:r>
+        <w:t xml:space="preserve"> (tab-completion suggests the names):</w:t>
+      </w:r>
+    </w:p>
+    <w:p>
+      <w:pPr>
+        <w:shd w:val="clear" w:color="auto" w:fill="F2F2F2"/>
+        <w:spacing w:before="20" w:after="20"/>
+        <w:ind w:left="284"/>
+      </w:pPr>
+      <w:r>
+        <w:rPr>
+          <w:rFonts w:ascii="Consolas" w:hAnsi="Consolas" w:cs="Consolas"/>
+          <w:color w:val="1F4E79"/>
+          <w:sz w:val="20"/>
+          <w:szCs w:val="20"/>
+        </w:rPr>
         <w:t>rectilinear · diagonal · circular · source · cable · parking · sender · gate · setup · placechests · operator · observer · reset · epr · alice · bob · eraser · plasma-summon · plasma-remove · red-glass · blue-glass</w:t>
       </w:r>
     </w:p>
@@ -3166,11 +3569,11 @@
       <w:pPr>
         <w:pStyle w:val="Nadpis2"/>
       </w:pPr>
-      <w:bookmarkStart w:id="6" w:name="_Toc234332861"/>
-      <w:r>
-        <w:t>2.3 The Quantum Eraser</w:t>
-      </w:r>
-      <w:bookmarkEnd w:id="6"/>
+      <w:bookmarkStart w:id="10" w:name="_Toc234365189"/>
+      <w:r>
+        <w:t>3.3 The Quantum Eraser</w:t>
+      </w:r>
+      <w:bookmarkEnd w:id="10"/>
     </w:p>
     <w:tbl>
       <w:tblPr>
@@ -3273,7 +3676,7 @@
                 <w:noProof/>
               </w:rPr>
               <w:drawing>
-                <wp:inline distT="0" distB="0" distL="0" distR="0" wp14:anchorId="7623C307" wp14:editId="54FDE29F">
+                <wp:inline distT="0" distB="0" distL="0" distR="0" wp14:anchorId="58FA60A4" wp14:editId="185A4601">
                   <wp:extent cx="457200" cy="457200"/>
                   <wp:effectExtent l="0" t="0" r="0" b="0"/>
                   <wp:docPr id="1001" name="brush.png"/>
@@ -3355,11 +3758,11 @@
       <w:pPr>
         <w:pStyle w:val="Nadpis1"/>
       </w:pPr>
-      <w:bookmarkStart w:id="7" w:name="_Toc234332862"/>
-      <w:r>
-        <w:t>3. BB84 — Quantum Key Distribution</w:t>
-      </w:r>
-      <w:bookmarkEnd w:id="7"/>
+      <w:bookmarkStart w:id="11" w:name="_Toc234365190"/>
+      <w:r>
+        <w:t>4. BB84 — Quantum Key Distribution</w:t>
+      </w:r>
+      <w:bookmarkEnd w:id="11"/>
     </w:p>
     <w:p>
       <w:r>
@@ -3411,11 +3814,11 @@
       <w:pPr>
         <w:pStyle w:val="Nadpis2"/>
       </w:pPr>
-      <w:bookmarkStart w:id="8" w:name="_Toc234332863"/>
-      <w:r>
-        <w:t>3.1 Tools and items</w:t>
-      </w:r>
-      <w:bookmarkEnd w:id="8"/>
+      <w:bookmarkStart w:id="12" w:name="_Toc234365191"/>
+      <w:r>
+        <w:t>4.1 Tools and items</w:t>
+      </w:r>
+      <w:bookmarkEnd w:id="12"/>
     </w:p>
     <w:tbl>
       <w:tblPr>
@@ -3518,7 +3921,7 @@
                 <w:noProof/>
               </w:rPr>
               <w:drawing>
-                <wp:inline distT="0" distB="0" distL="0" distR="0" wp14:anchorId="2AEBCA00" wp14:editId="32B12C7B">
+                <wp:inline distT="0" distB="0" distL="0" distR="0" wp14:anchorId="5A3C4058" wp14:editId="547D61B5">
                   <wp:extent cx="457200" cy="457200"/>
                   <wp:effectExtent l="0" t="0" r="0" b="0"/>
                   <wp:docPr id="1002" name="compass.png"/>
@@ -3606,7 +4009,7 @@
                 <w:noProof/>
               </w:rPr>
               <w:drawing>
-                <wp:inline distT="0" distB="0" distL="0" distR="0" wp14:anchorId="5204334A" wp14:editId="0630781A">
+                <wp:inline distT="0" distB="0" distL="0" distR="0" wp14:anchorId="691A529D" wp14:editId="31E04686">
                   <wp:extent cx="457200" cy="457200"/>
                   <wp:effectExtent l="0" t="0" r="0" b="0"/>
                   <wp:docPr id="1003" name="recovery_compass.png"/>
@@ -3694,7 +4097,7 @@
                 <w:noProof/>
               </w:rPr>
               <w:drawing>
-                <wp:inline distT="0" distB="0" distL="0" distR="0" wp14:anchorId="0C7C253C" wp14:editId="11AD3396">
+                <wp:inline distT="0" distB="0" distL="0" distR="0" wp14:anchorId="03FE5554" wp14:editId="4F1C3867">
                   <wp:extent cx="457200" cy="457200"/>
                   <wp:effectExtent l="0" t="0" r="0" b="0"/>
                   <wp:docPr id="1004" name="snowball.png"/>
@@ -3782,7 +4185,7 @@
                 <w:noProof/>
               </w:rPr>
               <w:drawing>
-                <wp:inline distT="0" distB="0" distL="0" distR="0" wp14:anchorId="3CA0AB3A" wp14:editId="7AD5B093">
+                <wp:inline distT="0" distB="0" distL="0" distR="0" wp14:anchorId="08ACACCD" wp14:editId="636DDEBB">
                   <wp:extent cx="457200" cy="457200"/>
                   <wp:effectExtent l="0" t="0" r="0" b="0"/>
                   <wp:docPr id="1005" name="carrot_on_a_stick.png"/>
@@ -3870,7 +4273,7 @@
                 <w:noProof/>
               </w:rPr>
               <w:drawing>
-                <wp:inline distT="0" distB="0" distL="0" distR="0" wp14:anchorId="72E3F5CE" wp14:editId="2E59CA29">
+                <wp:inline distT="0" distB="0" distL="0" distR="0" wp14:anchorId="090696DC" wp14:editId="5CD6311D">
                   <wp:extent cx="457200" cy="457200"/>
                   <wp:effectExtent l="0" t="0" r="0" b="0"/>
                   <wp:docPr id="1006" name="warped_fungus_on_a_stick.png"/>
@@ -3958,7 +4361,7 @@
                 <w:noProof/>
               </w:rPr>
               <w:drawing>
-                <wp:inline distT="0" distB="0" distL="0" distR="0" wp14:anchorId="45AD5725" wp14:editId="25F4EE86">
+                <wp:inline distT="0" distB="0" distL="0" distR="0" wp14:anchorId="20271269" wp14:editId="15F9F6B3">
                   <wp:extent cx="457200" cy="457200"/>
                   <wp:effectExtent l="0" t="0" r="0" b="0"/>
                   <wp:docPr id="1007" name="nether_star.png"/>
@@ -4046,7 +4449,7 @@
                 <w:noProof/>
               </w:rPr>
               <w:drawing>
-                <wp:inline distT="0" distB="0" distL="0" distR="0" wp14:anchorId="406F5A7B" wp14:editId="0AEEE552">
+                <wp:inline distT="0" distB="0" distL="0" distR="0" wp14:anchorId="3179FF7A" wp14:editId="304ACBFB">
                   <wp:extent cx="457200" cy="457200"/>
                   <wp:effectExtent l="0" t="0" r="0" b="0"/>
                   <wp:docPr id="1008" name="ender_eye.png"/>
@@ -4134,7 +4537,7 @@
                 <w:noProof/>
               </w:rPr>
               <w:drawing>
-                <wp:inline distT="0" distB="0" distL="0" distR="0" wp14:anchorId="09E03CF4" wp14:editId="7A8F1F06">
+                <wp:inline distT="0" distB="0" distL="0" distR="0" wp14:anchorId="40801BCC" wp14:editId="0DB7431E">
                   <wp:extent cx="457200" cy="457200"/>
                   <wp:effectExtent l="0" t="0" r="0" b="0"/>
                   <wp:docPr id="1009" name="chest.png"/>
@@ -4216,7 +4619,7 @@
                 <w:noProof/>
               </w:rPr>
               <w:drawing>
-                <wp:inline distT="0" distB="0" distL="0" distR="0" wp14:anchorId="5FA626D5" wp14:editId="042CAAC0">
+                <wp:inline distT="0" distB="0" distL="0" distR="0" wp14:anchorId="4A969FDA" wp14:editId="0F7F52C1">
                   <wp:extent cx="457200" cy="457200"/>
                   <wp:effectExtent l="0" t="0" r="0" b="0"/>
                   <wp:docPr id="1010" name="blue_glass.png"/>
@@ -4307,7 +4710,7 @@
                 <w:noProof/>
               </w:rPr>
               <w:drawing>
-                <wp:inline distT="0" distB="0" distL="0" distR="0" wp14:anchorId="409F3468" wp14:editId="36AA5D83">
+                <wp:inline distT="0" distB="0" distL="0" distR="0" wp14:anchorId="22966073" wp14:editId="7DFEE74D">
                   <wp:extent cx="457200" cy="457200"/>
                   <wp:effectExtent l="0" t="0" r="0" b="0"/>
                   <wp:docPr id="1011" name="red_glass.png"/>
@@ -4398,7 +4801,7 @@
                 <w:noProof/>
               </w:rPr>
               <w:drawing>
-                <wp:inline distT="0" distB="0" distL="0" distR="0" wp14:anchorId="40D23B5D" wp14:editId="5C3C3148">
+                <wp:inline distT="0" distB="0" distL="0" distR="0" wp14:anchorId="36FC78C6" wp14:editId="0EB20AE4">
                   <wp:extent cx="457200" cy="457200"/>
                   <wp:effectExtent l="0" t="0" r="0" b="0"/>
                   <wp:docPr id="1012" name="brush.png"/>
@@ -4480,11 +4883,11 @@
       <w:pPr>
         <w:pStyle w:val="Nadpis2"/>
       </w:pPr>
-      <w:bookmarkStart w:id="9" w:name="_Toc234332864"/>
-      <w:r>
-        <w:t>3.2 How the double chests work</w:t>
-      </w:r>
-      <w:bookmarkEnd w:id="9"/>
+      <w:bookmarkStart w:id="13" w:name="_Toc234365192"/>
+      <w:r>
+        <w:t>4.2 How the double chests work</w:t>
+      </w:r>
+      <w:bookmarkEnd w:id="13"/>
     </w:p>
     <w:p>
       <w:r>
@@ -4525,7 +4928,7 @@
           <w:noProof/>
         </w:rPr>
         <w:drawing>
-          <wp:inline distT="0" distB="0" distL="0" distR="0" wp14:anchorId="0C3B7079" wp14:editId="5F569936">
+          <wp:inline distT="0" distB="0" distL="0" distR="0" wp14:anchorId="5F5880D4" wp14:editId="6153211A">
             <wp:extent cx="3352800" cy="2590800"/>
             <wp:effectExtent l="0" t="0" r="0" b="0"/>
             <wp:docPr id="1013" name="sender_chest.png"/>
@@ -4606,7 +5009,7 @@
           <w:noProof/>
         </w:rPr>
         <w:drawing>
-          <wp:inline distT="0" distB="0" distL="0" distR="0" wp14:anchorId="1840A2DB" wp14:editId="02B4772A">
+          <wp:inline distT="0" distB="0" distL="0" distR="0" wp14:anchorId="4D29C55A" wp14:editId="5684DE8B">
             <wp:extent cx="3352800" cy="2590800"/>
             <wp:effectExtent l="0" t="0" r="0" b="0"/>
             <wp:docPr id="1014" name="gate_chest.png"/>
@@ -4661,11 +5064,11 @@
       <w:pPr>
         <w:pStyle w:val="Nadpis2"/>
       </w:pPr>
-      <w:bookmarkStart w:id="10" w:name="_Toc234332865"/>
-      <w:r>
-        <w:t>3.3 Step by step</w:t>
-      </w:r>
-      <w:bookmarkEnd w:id="10"/>
+      <w:bookmarkStart w:id="14" w:name="_Toc234365193"/>
+      <w:r>
+        <w:t>4.3 Step by step</w:t>
+      </w:r>
+      <w:bookmarkEnd w:id="14"/>
     </w:p>
     <w:p>
       <w:pPr>
@@ -4934,11 +5337,11 @@
       <w:pPr>
         <w:pStyle w:val="Nadpis2"/>
       </w:pPr>
-      <w:bookmarkStart w:id="11" w:name="_Toc234332866"/>
-      <w:r>
-        <w:t>3.4 Manual experiments</w:t>
-      </w:r>
-      <w:bookmarkEnd w:id="11"/>
+      <w:bookmarkStart w:id="15" w:name="_Toc234365194"/>
+      <w:r>
+        <w:t>4.4 Manual experiments</w:t>
+      </w:r>
+      <w:bookmarkEnd w:id="15"/>
     </w:p>
     <w:p>
       <w:pPr>
@@ -5112,11 +5515,11 @@
       <w:pPr>
         <w:pStyle w:val="Nadpis1"/>
       </w:pPr>
-      <w:bookmarkStart w:id="12" w:name="_Toc234332867"/>
-      <w:r>
-        <w:t>4. Grover's Search Algorithm</w:t>
-      </w:r>
-      <w:bookmarkEnd w:id="12"/>
+      <w:bookmarkStart w:id="16" w:name="_Toc234365195"/>
+      <w:r>
+        <w:t>5. Grover's Search Algorithm</w:t>
+      </w:r>
+      <w:bookmarkEnd w:id="16"/>
     </w:p>
     <w:p>
       <w:r>
@@ -5349,11 +5752,11 @@
       <w:pPr>
         <w:pStyle w:val="Nadpis2"/>
       </w:pPr>
-      <w:bookmarkStart w:id="13" w:name="_Toc234332868"/>
-      <w:r>
-        <w:t>4.1 Tools and items</w:t>
-      </w:r>
-      <w:bookmarkEnd w:id="13"/>
+      <w:bookmarkStart w:id="17" w:name="_Toc234365196"/>
+      <w:r>
+        <w:t>5.1 Tools and items</w:t>
+      </w:r>
+      <w:bookmarkEnd w:id="17"/>
     </w:p>
     <w:tbl>
       <w:tblPr>
@@ -5456,7 +5859,7 @@
                 <w:noProof/>
               </w:rPr>
               <w:drawing>
-                <wp:inline distT="0" distB="0" distL="0" distR="0" wp14:anchorId="604C444C" wp14:editId="68E500BC">
+                <wp:inline distT="0" distB="0" distL="0" distR="0" wp14:anchorId="425A53F6" wp14:editId="1E53D990">
                   <wp:extent cx="457200" cy="457200"/>
                   <wp:effectExtent l="0" t="0" r="0" b="0"/>
                   <wp:docPr id="1015" name="fire_charge.png"/>
@@ -5544,7 +5947,7 @@
                 <w:noProof/>
               </w:rPr>
               <w:drawing>
-                <wp:inline distT="0" distB="0" distL="0" distR="0" wp14:anchorId="345A1712" wp14:editId="7F33E128">
+                <wp:inline distT="0" distB="0" distL="0" distR="0" wp14:anchorId="11CE30F2" wp14:editId="2E388044">
                   <wp:extent cx="457200" cy="457200"/>
                   <wp:effectExtent l="0" t="0" r="0" b="0"/>
                   <wp:docPr id="1016" name="conduit.png"/>
@@ -5632,7 +6035,7 @@
                 <w:noProof/>
               </w:rPr>
               <w:drawing>
-                <wp:inline distT="0" distB="0" distL="0" distR="0" wp14:anchorId="0451B0A6" wp14:editId="4CF2802F">
+                <wp:inline distT="0" distB="0" distL="0" distR="0" wp14:anchorId="489D8E10" wp14:editId="5F5FE217">
                   <wp:extent cx="457200" cy="457200"/>
                   <wp:effectExtent l="0" t="0" r="0" b="0"/>
                   <wp:docPr id="1017" name="wind_charge.png"/>
@@ -5720,7 +6123,7 @@
                 <w:noProof/>
               </w:rPr>
               <w:drawing>
-                <wp:inline distT="0" distB="0" distL="0" distR="0" wp14:anchorId="0E2C678A" wp14:editId="588CD227">
+                <wp:inline distT="0" distB="0" distL="0" distR="0" wp14:anchorId="7C7163DE" wp14:editId="251141D9">
                   <wp:extent cx="457200" cy="457200"/>
                   <wp:effectExtent l="0" t="0" r="0" b="0"/>
                   <wp:docPr id="1018" name="spyglass.png"/>
@@ -5808,7 +6211,7 @@
                 <w:noProof/>
               </w:rPr>
               <w:drawing>
-                <wp:inline distT="0" distB="0" distL="0" distR="0" wp14:anchorId="2D6704C6" wp14:editId="642EFB44">
+                <wp:inline distT="0" distB="0" distL="0" distR="0" wp14:anchorId="2217E199" wp14:editId="0936742A">
                   <wp:extent cx="457200" cy="457200"/>
                   <wp:effectExtent l="0" t="0" r="0" b="0"/>
                   <wp:docPr id="1019" name="tnt.png"/>
@@ -5896,7 +6299,7 @@
                 <w:noProof/>
               </w:rPr>
               <w:drawing>
-                <wp:inline distT="0" distB="0" distL="0" distR="0" wp14:anchorId="796A49A6" wp14:editId="7D985F5C">
+                <wp:inline distT="0" distB="0" distL="0" distR="0" wp14:anchorId="091330F9" wp14:editId="404A7F66">
                   <wp:extent cx="457200" cy="457200"/>
                   <wp:effectExtent l="0" t="0" r="0" b="0"/>
                   <wp:docPr id="1020" name="brush.png"/>
@@ -5978,11 +6381,11 @@
       <w:pPr>
         <w:pStyle w:val="Nadpis2"/>
       </w:pPr>
-      <w:bookmarkStart w:id="14" w:name="_Toc234332869"/>
-      <w:r>
-        <w:t>4.2 Multiple grids at once</w:t>
-      </w:r>
-      <w:bookmarkEnd w:id="14"/>
+      <w:bookmarkStart w:id="18" w:name="_Toc234365197"/>
+      <w:r>
+        <w:t>5.2 Multiple grids at once</w:t>
+      </w:r>
+      <w:bookmarkEnd w:id="18"/>
     </w:p>
     <w:p>
       <w:r>
@@ -6035,11 +6438,11 @@
       <w:pPr>
         <w:pStyle w:val="Nadpis2"/>
       </w:pPr>
-      <w:bookmarkStart w:id="15" w:name="_Toc234332870"/>
-      <w:r>
-        <w:t>4.3 Step by step</w:t>
-      </w:r>
-      <w:bookmarkEnd w:id="15"/>
+      <w:bookmarkStart w:id="19" w:name="_Toc234365198"/>
+      <w:r>
+        <w:t>5.3 Step by step</w:t>
+      </w:r>
+      <w:bookmarkEnd w:id="19"/>
     </w:p>
     <w:p>
       <w:pPr>
@@ -6288,11 +6691,11 @@
       <w:pPr>
         <w:pStyle w:val="Nadpis2"/>
       </w:pPr>
-      <w:bookmarkStart w:id="16" w:name="_Toc234332871"/>
-      <w:r>
-        <w:t>4.4 Visualisation rules</w:t>
-      </w:r>
-      <w:bookmarkEnd w:id="16"/>
+      <w:bookmarkStart w:id="20" w:name="_Toc234365199"/>
+      <w:r>
+        <w:t>5.4 Visualisation rules</w:t>
+      </w:r>
+      <w:bookmarkEnd w:id="20"/>
     </w:p>
     <w:p>
       <w:pPr>
@@ -6365,11 +6768,11 @@
       <w:pPr>
         <w:pStyle w:val="Nadpis1"/>
       </w:pPr>
-      <w:bookmarkStart w:id="17" w:name="_Toc234332872"/>
-      <w:r>
-        <w:t>5. E91 — Entanglement Protocol</w:t>
-      </w:r>
-      <w:bookmarkEnd w:id="17"/>
+      <w:bookmarkStart w:id="21" w:name="_Toc234365200"/>
+      <w:r>
+        <w:t>6. E91 — Entanglement Protocol</w:t>
+      </w:r>
+      <w:bookmarkEnd w:id="21"/>
     </w:p>
     <w:p>
       <w:r>
@@ -6457,11 +6860,11 @@
       <w:pPr>
         <w:pStyle w:val="Nadpis2"/>
       </w:pPr>
-      <w:bookmarkStart w:id="18" w:name="_Toc234332873"/>
-      <w:r>
-        <w:t>5.1 Tools and items</w:t>
-      </w:r>
-      <w:bookmarkEnd w:id="18"/>
+      <w:bookmarkStart w:id="22" w:name="_Toc234365201"/>
+      <w:r>
+        <w:t>6.1 Tools and items</w:t>
+      </w:r>
+      <w:bookmarkEnd w:id="22"/>
     </w:p>
     <w:tbl>
       <w:tblPr>
@@ -6564,7 +6967,7 @@
                 <w:noProof/>
               </w:rPr>
               <w:drawing>
-                <wp:inline distT="0" distB="0" distL="0" distR="0" wp14:anchorId="598F4894" wp14:editId="68E02EDA">
+                <wp:inline distT="0" distB="0" distL="0" distR="0" wp14:anchorId="050635B7" wp14:editId="5A474FCC">
                   <wp:extent cx="457200" cy="457200"/>
                   <wp:effectExtent l="0" t="0" r="0" b="0"/>
                   <wp:docPr id="1021" name="amethyst_shard.png"/>
@@ -6652,7 +7055,7 @@
                 <w:noProof/>
               </w:rPr>
               <w:drawing>
-                <wp:inline distT="0" distB="0" distL="0" distR="0" wp14:anchorId="7B726045" wp14:editId="6DE439AA">
+                <wp:inline distT="0" distB="0" distL="0" distR="0" wp14:anchorId="7CCD264A" wp14:editId="6542D546">
                   <wp:extent cx="457200" cy="457200"/>
                   <wp:effectExtent l="0" t="0" r="0" b="0"/>
                   <wp:docPr id="1022" name="compass.png"/>
@@ -6740,7 +7143,7 @@
                 <w:noProof/>
               </w:rPr>
               <w:drawing>
-                <wp:inline distT="0" distB="0" distL="0" distR="0" wp14:anchorId="67851FAC" wp14:editId="791CFF7E">
+                <wp:inline distT="0" distB="0" distL="0" distR="0" wp14:anchorId="4FFCC9F3" wp14:editId="2FDC6238">
                   <wp:extent cx="457200" cy="457200"/>
                   <wp:effectExtent l="0" t="0" r="0" b="0"/>
                   <wp:docPr id="1023" name="recovery_compass.png"/>
@@ -6828,7 +7231,7 @@
                 <w:noProof/>
               </w:rPr>
               <w:drawing>
-                <wp:inline distT="0" distB="0" distL="0" distR="0" wp14:anchorId="68828832" wp14:editId="72AFD714">
+                <wp:inline distT="0" distB="0" distL="0" distR="0" wp14:anchorId="34B0CA3F" wp14:editId="7D4BACCC">
                   <wp:extent cx="457200" cy="457200"/>
                   <wp:effectExtent l="0" t="0" r="0" b="0"/>
                   <wp:docPr id="1024" name="clock.png"/>
@@ -6916,7 +7319,7 @@
                 <w:noProof/>
               </w:rPr>
               <w:drawing>
-                <wp:inline distT="0" distB="0" distL="0" distR="0" wp14:anchorId="5EDB1034" wp14:editId="15097123">
+                <wp:inline distT="0" distB="0" distL="0" distR="0" wp14:anchorId="5B310D1D" wp14:editId="03D0E6E2">
                   <wp:extent cx="457200" cy="457200"/>
                   <wp:effectExtent l="0" t="0" r="0" b="0"/>
                   <wp:docPr id="1025" name="diamond_axe.png"/>
@@ -7004,7 +7407,7 @@
                 <w:noProof/>
               </w:rPr>
               <w:drawing>
-                <wp:inline distT="0" distB="0" distL="0" distR="0" wp14:anchorId="264601D1" wp14:editId="66C067F2">
+                <wp:inline distT="0" distB="0" distL="0" distR="0" wp14:anchorId="00361B50" wp14:editId="36C269CF">
                   <wp:extent cx="457200" cy="457200"/>
                   <wp:effectExtent l="0" t="0" r="0" b="0"/>
                   <wp:docPr id="1026" name="golden_axe.png"/>
@@ -7092,7 +7495,7 @@
                 <w:noProof/>
               </w:rPr>
               <w:drawing>
-                <wp:inline distT="0" distB="0" distL="0" distR="0" wp14:anchorId="7E609184" wp14:editId="59BB76A7">
+                <wp:inline distT="0" distB="0" distL="0" distR="0" wp14:anchorId="5B62084F" wp14:editId="5AE5AC51">
                   <wp:extent cx="457200" cy="457200"/>
                   <wp:effectExtent l="0" t="0" r="0" b="0"/>
                   <wp:docPr id="1027" name="brush.png"/>
@@ -7174,11 +7577,11 @@
       <w:pPr>
         <w:pStyle w:val="Nadpis2"/>
       </w:pPr>
-      <w:bookmarkStart w:id="19" w:name="_Toc234332874"/>
-      <w:r>
-        <w:t>5.2 Step by step</w:t>
-      </w:r>
-      <w:bookmarkEnd w:id="19"/>
+      <w:bookmarkStart w:id="23" w:name="_Toc234365202"/>
+      <w:r>
+        <w:t>6.2 Step by step</w:t>
+      </w:r>
+      <w:bookmarkEnd w:id="23"/>
     </w:p>
     <w:p>
       <w:pPr>
@@ -7504,11 +7907,11 @@
       <w:pPr>
         <w:pStyle w:val="Nadpis2"/>
       </w:pPr>
-      <w:bookmarkStart w:id="20" w:name="_Toc234332875"/>
-      <w:r>
-        <w:t>5.3 The physics behind it</w:t>
-      </w:r>
-      <w:bookmarkEnd w:id="20"/>
+      <w:bookmarkStart w:id="24" w:name="_Toc234365203"/>
+      <w:r>
+        <w:t>6.3 The physics behind it</w:t>
+      </w:r>
+      <w:bookmarkEnd w:id="24"/>
     </w:p>
     <w:p>
       <w:pPr>
@@ -7558,11 +7961,11 @@
       <w:pPr>
         <w:pStyle w:val="Nadpis1"/>
       </w:pPr>
-      <w:bookmarkStart w:id="21" w:name="_Toc234332876"/>
-      <w:r>
-        <w:t>6. Plasma — the Lobby Effect</w:t>
-      </w:r>
-      <w:bookmarkEnd w:id="21"/>
+      <w:bookmarkStart w:id="25" w:name="_Toc234365204"/>
+      <w:r>
+        <w:t>7. Plasma — the Lobby Effect</w:t>
+      </w:r>
+      <w:bookmarkEnd w:id="25"/>
     </w:p>
     <w:p>
       <w:r>
@@ -7573,11 +7976,11 @@
       <w:pPr>
         <w:pStyle w:val="Nadpis2"/>
       </w:pPr>
-      <w:bookmarkStart w:id="22" w:name="_Toc234332877"/>
-      <w:r>
-        <w:t>6.1 Tools and commands</w:t>
-      </w:r>
-      <w:bookmarkEnd w:id="22"/>
+      <w:bookmarkStart w:id="26" w:name="_Toc234365205"/>
+      <w:r>
+        <w:t>7.1 Tools and commands</w:t>
+      </w:r>
+      <w:bookmarkEnd w:id="26"/>
     </w:p>
     <w:tbl>
       <w:tblPr>
@@ -7680,7 +8083,7 @@
                 <w:noProof/>
               </w:rPr>
               <w:drawing>
-                <wp:inline distT="0" distB="0" distL="0" distR="0" wp14:anchorId="07C3CEB2" wp14:editId="7DDD36F6">
+                <wp:inline distT="0" distB="0" distL="0" distR="0" wp14:anchorId="381095AA" wp14:editId="6F4A665C">
                   <wp:extent cx="457200" cy="457200"/>
                   <wp:effectExtent l="0" t="0" r="0" b="0"/>
                   <wp:docPr id="1028" name="heart_of_the_sea.png"/>
@@ -7768,7 +8171,7 @@
                 <w:noProof/>
               </w:rPr>
               <w:drawing>
-                <wp:inline distT="0" distB="0" distL="0" distR="0" wp14:anchorId="2A927354" wp14:editId="4F5F3003">
+                <wp:inline distT="0" distB="0" distL="0" distR="0" wp14:anchorId="1445BBD4" wp14:editId="524376C7">
                   <wp:extent cx="457200" cy="457200"/>
                   <wp:effectExtent l="0" t="0" r="0" b="0"/>
                   <wp:docPr id="1029" name="echo_shard.png"/>
@@ -7882,51 +8285,16 @@
       <w:pPr>
         <w:pStyle w:val="Nadpis1"/>
       </w:pPr>
-      <w:bookmarkStart w:id="23" w:name="_Toc234332878"/>
-      <w:r>
-        <w:t>7. Tutorial Hall and Guided Walkthrough</w:t>
-      </w:r>
-      <w:bookmarkEnd w:id="23"/>
-    </w:p>
-    <w:p>
-      <w:r>
-        <w:t xml:space="preserve">The plugin can build a complete, decorated </w:t>
-      </w:r>
-      <w:r>
-        <w:rPr>
-          <w:b/>
-        </w:rPr>
-        <w:t>tutorial hall</w:t>
-      </w:r>
-      <w:r>
-        <w:t xml:space="preserve"> and then run a gated, step-by-step </w:t>
-      </w:r>
-      <w:r>
-        <w:rPr>
-          <w:b/>
-        </w:rPr>
-        <w:t>interactive tutorial</w:t>
-      </w:r>
-      <w:r>
-        <w:t xml:space="preserve"> inside it — ideal for workshops with students.</w:t>
-      </w:r>
-    </w:p>
-    <w:p>
-      <w:pPr>
-        <w:pStyle w:val="Nadpis2"/>
-      </w:pPr>
-      <w:bookmarkStart w:id="24" w:name="_Toc234332879"/>
-      <w:r>
-        <w:t>7.1 Building the hall</w:t>
-      </w:r>
-      <w:bookmarkEnd w:id="24"/>
-    </w:p>
-    <w:p>
-      <w:pPr>
-        <w:shd w:val="clear" w:color="auto" w:fill="F2F2F2"/>
-        <w:spacing w:before="20" w:after="20"/>
-        <w:ind w:left="284"/>
-      </w:pPr>
+      <w:bookmarkStart w:id="27" w:name="_Toc234365206"/>
+      <w:r>
+        <w:t>8. Command Reference</w:t>
+      </w:r>
+      <w:bookmarkEnd w:id="27"/>
+    </w:p>
+    <w:p>
+      <w:r>
+        <w:t xml:space="preserve">Prefix </w:t>
+      </w:r>
       <w:r>
         <w:rPr>
           <w:rFonts w:ascii="Consolas" w:hAnsi="Consolas" w:cs="Consolas"/>
@@ -7934,15 +8302,11 @@
           <w:sz w:val="20"/>
           <w:szCs w:val="20"/>
         </w:rPr>
-        <w:t>/qacraft world build    — builds the hall in front of you (needs flat space ≈64×11 blocks)</w:t>
-      </w:r>
-    </w:p>
-    <w:p>
-      <w:pPr>
-        <w:shd w:val="clear" w:color="auto" w:fill="F2F2F2"/>
-        <w:spacing w:before="20" w:after="20"/>
-        <w:ind w:left="284"/>
-      </w:pPr>
+        <w:t>/qacraft</w:t>
+      </w:r>
+      <w:r>
+        <w:t xml:space="preserve"> (aliases </w:t>
+      </w:r>
       <w:r>
         <w:rPr>
           <w:rFonts w:ascii="Consolas" w:hAnsi="Consolas" w:cs="Consolas"/>
@@ -7950,75 +8314,11 @@
           <w:sz w:val="20"/>
           <w:szCs w:val="20"/>
         </w:rPr>
-        <w:t>/qacraft world clear    — removes the hall and restores the terrain</w:t>
-      </w:r>
-    </w:p>
-    <w:p>
-      <w:r>
-        <w:t xml:space="preserve">The hall has four zones in a row: </w:t>
-      </w:r>
-      <w:r>
-        <w:rPr>
-          <w:b/>
-        </w:rPr>
-        <w:t>Lobby</w:t>
+        <w:t>/q</w:t>
       </w:r>
       <w:r>
         <w:t xml:space="preserve">, </w:t>
       </w:r>
-      <w:r>
-        <w:rPr>
-          <w:b/>
-        </w:rPr>
-        <w:t>BB84</w:t>
-      </w:r>
-      <w:r>
-        <w:t xml:space="preserve">, </w:t>
-      </w:r>
-      <w:r>
-        <w:rPr>
-          <w:b/>
-        </w:rPr>
-        <w:t>Grover</w:t>
-      </w:r>
-      <w:r>
-        <w:t xml:space="preserve"> and </w:t>
-      </w:r>
-      <w:r>
-        <w:rPr>
-          <w:b/>
-        </w:rPr>
-        <w:t>E91</w:t>
-      </w:r>
-      <w:r>
-        <w:t xml:space="preserve">. Every protocol room contains: coloured floor and wall panels with explanations, item showcases on quartz pillars (the room's tools with name plaques), marked floor spots for the apparatus, and a glowing </w:t>
-      </w:r>
-      <w:r>
-        <w:rPr>
-          <w:b/>
-        </w:rPr>
-        <w:t>Tools button</w:t>
-      </w:r>
-      <w:r>
-        <w:t xml:space="preserve"> that hands out the room's tool set. The E91 room has Alice / Bob billboards.</w:t>
-      </w:r>
-    </w:p>
-    <w:p>
-      <w:pPr>
-        <w:pStyle w:val="Nadpis2"/>
-      </w:pPr>
-      <w:bookmarkStart w:id="25" w:name="_Toc234332880"/>
-      <w:r>
-        <w:t>7.2 Running the tutorial</w:t>
-      </w:r>
-      <w:bookmarkEnd w:id="25"/>
-    </w:p>
-    <w:p>
-      <w:pPr>
-        <w:shd w:val="clear" w:color="auto" w:fill="F2F2F2"/>
-        <w:spacing w:before="20" w:after="20"/>
-        <w:ind w:left="284"/>
-      </w:pPr>
       <w:r>
         <w:rPr>
           <w:rFonts w:ascii="Consolas" w:hAnsi="Consolas" w:cs="Consolas"/>
@@ -8026,15 +8326,11 @@
           <w:sz w:val="20"/>
           <w:szCs w:val="20"/>
         </w:rPr>
-        <w:t>/qacraft tutorial start — starts the guided run (one run at a time, for the whole server)</w:t>
-      </w:r>
-    </w:p>
-    <w:p>
-      <w:pPr>
-        <w:shd w:val="clear" w:color="auto" w:fill="F2F2F2"/>
-        <w:spacing w:before="20" w:after="20"/>
-        <w:ind w:left="284"/>
-      </w:pPr>
+        <w:t>/qa</w:t>
+      </w:r>
+      <w:r>
+        <w:t xml:space="preserve">, </w:t>
+      </w:r>
       <w:r>
         <w:rPr>
           <w:rFonts w:ascii="Consolas" w:hAnsi="Consolas" w:cs="Consolas"/>
@@ -8042,308 +8338,17 @@
           <w:sz w:val="20"/>
           <w:szCs w:val="20"/>
         </w:rPr>
-        <w:t>/qacraft tutorial stop  — aborts it</w:t>
-      </w:r>
-    </w:p>
-    <w:p>
-      <w:r>
-        <w:t>What the tutorial does:</w:t>
-      </w:r>
-    </w:p>
-    <w:p>
-      <w:pPr>
-        <w:numPr>
-          <w:ilvl w:val="0"/>
-          <w:numId w:val="1"/>
-        </w:numPr>
-      </w:pPr>
-      <w:r>
-        <w:t>Teleports you to the lobby, empties your hands and bars the entrance — the rooms are connected by iron-bar doors that open only as you progress.</w:t>
-      </w:r>
-    </w:p>
-    <w:p>
-      <w:pPr>
-        <w:numPr>
-          <w:ilvl w:val="0"/>
-          <w:numId w:val="1"/>
-        </w:numPr>
-      </w:pPr>
-      <w:r>
-        <w:t>Each room shows floating instructions, one step at a time, with the exact target spot highlighted ("Sender here", "Double chest here" …).</w:t>
-      </w:r>
-    </w:p>
-    <w:p>
-      <w:pPr>
-        <w:numPr>
-          <w:ilvl w:val="0"/>
-          <w:numId w:val="1"/>
-        </w:numPr>
-      </w:pPr>
-      <w:r>
-        <w:t xml:space="preserve">Steps complete </w:t>
-      </w:r>
-      <w:r>
-        <w:rPr>
-          <w:b/>
-        </w:rPr>
-        <w:t>automatically</w:t>
-      </w:r>
-      <w:r>
-        <w:t xml:space="preserve"> when the world matches (apparatus placed, chest filled…). Undoing a step brings its instruction back — the tutorial constantly re-checks everything.</w:t>
-      </w:r>
-    </w:p>
-    <w:p>
-      <w:pPr>
-        <w:numPr>
-          <w:ilvl w:val="0"/>
-          <w:numId w:val="1"/>
-        </w:numPr>
-      </w:pPr>
-      <w:r>
-        <w:t xml:space="preserve">When a room is complete, a </w:t>
-      </w:r>
-      <w:r>
-        <w:rPr>
-          <w:b/>
-        </w:rPr>
-        <w:t>Next room</w:t>
-      </w:r>
-      <w:r>
-        <w:t xml:space="preserve"> button appears; only pressing it opens the door. Walls and doors are indestructible while the tutorial runs.</w:t>
-      </w:r>
-    </w:p>
-    <w:p>
-      <w:pPr>
-        <w:numPr>
-          <w:ilvl w:val="0"/>
-          <w:numId w:val="1"/>
-        </w:numPr>
-      </w:pPr>
-      <w:r>
-        <w:t>The last step of every room has a ~10-second pause so you can watch the result (the 27 photons, the probability columns, the entangled flash).</w:t>
-      </w:r>
-    </w:p>
-    <w:p>
-      <w:pPr>
-        <w:numPr>
-          <w:ilvl w:val="0"/>
-          <w:numId w:val="1"/>
-        </w:numPr>
-      </w:pPr>
-      <w:r>
-        <w:t xml:space="preserve">The E91 room ends with a </w:t>
-      </w:r>
-      <w:r>
-        <w:rPr>
-          <w:b/>
-        </w:rPr>
-        <w:t>Finish</w:t>
-      </w:r>
-      <w:r>
-        <w:t xml:space="preserve"> button: it teleports you back to the lobby, launches fireworks and cleans up the apparatus.</w:t>
+        <w:t>/qac</w:t>
+      </w:r>
+      <w:r>
+        <w:t>). Tab-completion works for every subcommand, item names and active Grover ids.</w:t>
       </w:r>
     </w:p>
     <w:p>
       <w:pPr>
         <w:pStyle w:val="Nadpis2"/>
       </w:pPr>
-      <w:bookmarkStart w:id="26" w:name="_Toc234332881"/>
-      <w:r>
-        <w:t>7.3 What you will do in each room</w:t>
-      </w:r>
-      <w:bookmarkEnd w:id="26"/>
-    </w:p>
-    <w:p>
-      <w:pPr>
-        <w:numPr>
-          <w:ilvl w:val="0"/>
-          <w:numId w:val="1"/>
-        </w:numPr>
-      </w:pPr>
-      <w:r>
-        <w:rPr>
-          <w:b/>
-        </w:rPr>
-        <w:t>BB84:</w:t>
-      </w:r>
-      <w:r>
-        <w:t xml:space="preserve"> place the Sender on the marked spot → build its double chest → </w:t>
-      </w:r>
-      <w:r>
-        <w:rPr>
-          <w:rFonts w:ascii="Consolas" w:hAnsi="Consolas" w:cs="Consolas"/>
-          <w:color w:val="1F4E79"/>
-          <w:sz w:val="20"/>
-          <w:szCs w:val="20"/>
-        </w:rPr>
-        <w:t>/q sender fill</w:t>
-      </w:r>
-      <w:r>
-        <w:t xml:space="preserve"> + lay bit glass panes → place the Gate → build its chest → fill it with Compasses → place the Quantum Cable → </w:t>
-      </w:r>
-      <w:r>
-        <w:rPr>
-          <w:rFonts w:ascii="Consolas" w:hAnsi="Consolas" w:cs="Consolas"/>
-          <w:color w:val="1F4E79"/>
-          <w:sz w:val="20"/>
-          <w:szCs w:val="20"/>
-        </w:rPr>
-        <w:t>/q sender start</w:t>
-      </w:r>
-      <w:r>
-        <w:t xml:space="preserve"> and watch all 27 photons.</w:t>
-      </w:r>
-    </w:p>
-    <w:p>
-      <w:pPr>
-        <w:numPr>
-          <w:ilvl w:val="0"/>
-          <w:numId w:val="1"/>
-        </w:numPr>
-      </w:pPr>
-      <w:r>
-        <w:rPr>
-          <w:b/>
-        </w:rPr>
-        <w:t>Grover:</w:t>
-      </w:r>
-      <w:r>
-        <w:t xml:space="preserve"> stand on the centre spot → </w:t>
-      </w:r>
-      <w:r>
-        <w:rPr>
-          <w:rFonts w:ascii="Consolas" w:hAnsi="Consolas" w:cs="Consolas"/>
-          <w:color w:val="1F4E79"/>
-          <w:sz w:val="20"/>
-          <w:szCs w:val="20"/>
-        </w:rPr>
-        <w:t>/q grover setup 1</w:t>
-      </w:r>
-      <w:r>
-        <w:t xml:space="preserve"> → </w:t>
-      </w:r>
-      <w:r>
-        <w:rPr>
-          <w:rFonts w:ascii="Consolas" w:hAnsi="Consolas" w:cs="Consolas"/>
-          <w:color w:val="1F4E79"/>
-          <w:sz w:val="20"/>
-          <w:szCs w:val="20"/>
-        </w:rPr>
-        <w:t>/q grover placechests 1</w:t>
-      </w:r>
-      <w:r>
-        <w:t xml:space="preserve"> → </w:t>
-      </w:r>
-      <w:r>
-        <w:rPr>
-          <w:rFonts w:ascii="Consolas" w:hAnsi="Consolas" w:cs="Consolas"/>
-          <w:color w:val="1F4E79"/>
-          <w:sz w:val="20"/>
-          <w:szCs w:val="20"/>
-        </w:rPr>
-        <w:t>/q grover fillwool 1</w:t>
-      </w:r>
-      <w:r>
-        <w:t xml:space="preserve"> → spyglass + wool in offhand, throw the Wind Charge and watch the columns.</w:t>
-      </w:r>
-    </w:p>
-    <w:p>
-      <w:pPr>
-        <w:numPr>
-          <w:ilvl w:val="0"/>
-          <w:numId w:val="1"/>
-        </w:numPr>
-      </w:pPr>
-      <w:r>
-        <w:rPr>
-          <w:b/>
-        </w:rPr>
-        <w:t>E91:</w:t>
-      </w:r>
-      <w:r>
-        <w:t xml:space="preserve"> place the EPR Source on the marked spot → place Alice's and Bob's pads on the cyan/orange spots → </w:t>
-      </w:r>
-      <w:r>
-        <w:rPr>
-          <w:rFonts w:ascii="Consolas" w:hAnsi="Consolas" w:cs="Consolas"/>
-          <w:color w:val="1F4E79"/>
-          <w:sz w:val="20"/>
-          <w:szCs w:val="20"/>
-        </w:rPr>
-        <w:t>/q e91 generate</w:t>
-      </w:r>
-      <w:r>
-        <w:t xml:space="preserve"> → measure a photon with a filter.</w:t>
-      </w:r>
-    </w:p>
-    <w:p>
-      <w:pPr>
-        <w:pStyle w:val="Nadpis1"/>
-      </w:pPr>
-      <w:bookmarkStart w:id="27" w:name="_Toc234332882"/>
-      <w:r>
-        <w:t>8. Command Reference</w:t>
-      </w:r>
-      <w:bookmarkEnd w:id="27"/>
-    </w:p>
-    <w:p>
-      <w:r>
-        <w:t xml:space="preserve">Prefix </w:t>
-      </w:r>
-      <w:r>
-        <w:rPr>
-          <w:rFonts w:ascii="Consolas" w:hAnsi="Consolas" w:cs="Consolas"/>
-          <w:color w:val="1F4E79"/>
-          <w:sz w:val="20"/>
-          <w:szCs w:val="20"/>
-        </w:rPr>
-        <w:t>/qacraft</w:t>
-      </w:r>
-      <w:r>
-        <w:t xml:space="preserve"> (aliases </w:t>
-      </w:r>
-      <w:r>
-        <w:rPr>
-          <w:rFonts w:ascii="Consolas" w:hAnsi="Consolas" w:cs="Consolas"/>
-          <w:color w:val="1F4E79"/>
-          <w:sz w:val="20"/>
-          <w:szCs w:val="20"/>
-        </w:rPr>
-        <w:t>/q</w:t>
-      </w:r>
-      <w:r>
-        <w:t xml:space="preserve">, </w:t>
-      </w:r>
-      <w:r>
-        <w:rPr>
-          <w:rFonts w:ascii="Consolas" w:hAnsi="Consolas" w:cs="Consolas"/>
-          <w:color w:val="1F4E79"/>
-          <w:sz w:val="20"/>
-          <w:szCs w:val="20"/>
-        </w:rPr>
-        <w:t>/qa</w:t>
-      </w:r>
-      <w:r>
-        <w:t xml:space="preserve">, </w:t>
-      </w:r>
-      <w:r>
-        <w:rPr>
-          <w:rFonts w:ascii="Consolas" w:hAnsi="Consolas" w:cs="Consolas"/>
-          <w:color w:val="1F4E79"/>
-          <w:sz w:val="20"/>
-          <w:szCs w:val="20"/>
-        </w:rPr>
-        <w:t>/qac</w:t>
-      </w:r>
-      <w:r>
-        <w:t>). Tab-completion works for every subcommand, item names and active Grover ids.</w:t>
-      </w:r>
-    </w:p>
-    <w:p>
-      <w:pPr>
-        <w:pStyle w:val="Nadpis2"/>
-      </w:pPr>
-      <w:bookmarkStart w:id="28" w:name="_Toc234332883"/>
+      <w:bookmarkStart w:id="28" w:name="_Toc234365207"/>
       <w:r>
         <w:t>8.1 General</w:t>
       </w:r>
@@ -8512,7 +8517,7 @@
               <w:spacing w:after="0"/>
             </w:pPr>
             <w:r>
-              <w:t>Adds a single tool without clearing (chapter 2.2)</w:t>
+              <w:t>Adds a single tool without clearing (chapter 3.2)</w:t>
             </w:r>
           </w:p>
         </w:tc>
@@ -8561,7 +8566,7 @@
       <w:pPr>
         <w:pStyle w:val="Nadpis2"/>
       </w:pPr>
-      <w:bookmarkStart w:id="29" w:name="_Toc234332884"/>
+      <w:bookmarkStart w:id="29" w:name="_Toc234365208"/>
       <w:r>
         <w:t>8.2 BB84</w:t>
       </w:r>
@@ -9063,7 +9068,7 @@
       <w:pPr>
         <w:pStyle w:val="Nadpis2"/>
       </w:pPr>
-      <w:bookmarkStart w:id="30" w:name="_Toc234332885"/>
+      <w:bookmarkStart w:id="30" w:name="_Toc234365209"/>
       <w:r>
         <w:t>8.3 Grover ([id] optional with a single grid)</w:t>
       </w:r>
@@ -9419,7 +9424,7 @@
       <w:pPr>
         <w:pStyle w:val="Nadpis2"/>
       </w:pPr>
-      <w:bookmarkStart w:id="31" w:name="_Toc234332886"/>
+      <w:bookmarkStart w:id="31" w:name="_Toc234365210"/>
       <w:r>
         <w:t>8.4 E91</w:t>
       </w:r>
@@ -9785,7 +9790,7 @@
       <w:pPr>
         <w:pStyle w:val="Nadpis2"/>
       </w:pPr>
-      <w:bookmarkStart w:id="32" w:name="_Toc234332887"/>
+      <w:bookmarkStart w:id="32" w:name="_Toc234365211"/>
       <w:r>
         <w:t>8.5 Plasma, hall and tutorial</w:t>
       </w:r>
@@ -10071,7 +10076,7 @@
       <w:pPr>
         <w:pStyle w:val="Nadpis1"/>
       </w:pPr>
-      <w:bookmarkStart w:id="33" w:name="_Toc234332888"/>
+      <w:bookmarkStart w:id="33" w:name="_Toc234365212"/>
       <w:r>
         <w:t>9. Technical Notes</w:t>
       </w:r>
@@ -10389,9 +10394,9 @@
 <file path=word/numbering.xml><?xml version="1.0" encoding="utf-8"?>
 <w:numbering xmlns:wpc="http://schemas.microsoft.com/office/word/2010/wordprocessingCanvas" xmlns:cx="http://schemas.microsoft.com/office/drawing/2014/chartex" xmlns:cx1="http://schemas.microsoft.com/office/drawing/2015/9/8/chartex" xmlns:cx2="http://schemas.microsoft.com/office/drawing/2015/10/21/chartex" xmlns:cx3="http://schemas.microsoft.com/office/drawing/2016/5/9/chartex" xmlns:cx4="http://schemas.microsoft.com/office/drawing/2016/5/10/chartex" xmlns:cx5="http://schemas.microsoft.com/office/drawing/2016/5/11/chartex" xmlns:cx6="http://schemas.microsoft.com/office/drawing/2016/5/12/chartex" xmlns:cx7="http://schemas.microsoft.com/office/drawing/2016/5/13/chartex" xmlns:cx8="http://schemas.microsoft.com/office/drawing/2016/5/14/chartex" xmlns:mc="http://schemas.openxmlformats.org/markup-compatibility/2006" xmlns:aink="http://schemas.microsoft.com/office/drawing/2016/ink" xmlns:am3d="http://schemas.microsoft.com/office/drawing/2017/model3d" xmlns:o="urn:schemas-microsoft-com:office:office" xmlns:oel="http://schemas.microsoft.com/office/2019/extlst" xmlns:r="http://schemas.openxmlformats.org/officeDocument/2006/relationships" xmlns:m="http://schemas.openxmlformats.org/officeDocument/2006/math" xmlns:v="urn:schemas-microsoft-com:vml" xmlns:wp14="http://schemas.microsoft.com/office/word/2010/wordprocessingDrawing" xmlns:wp="http://schemas.openxmlformats.org/drawingml/2006/wordprocessingDrawing" xmlns:w10="urn:schemas-microsoft-com:office:word" xmlns:w="http://schemas.openxmlformats.org/wordprocessingml/2006/main" xmlns:w14="http://schemas.microsoft.com/office/word/2010/wordml" xmlns:w15="http://schemas.microsoft.com/office/word/2012/wordml" xmlns:w16cex="http://schemas.microsoft.com/office/word/2018/wordml/cex" xmlns:w16cid="http://schemas.microsoft.com/office/word/2016/wordml/cid" xmlns:w16="http://schemas.microsoft.com/office/word/2018/wordml" xmlns:w16du="http://schemas.microsoft.com/office/word/2023/wordml/word16du" xmlns:w16sdtdh="http://schemas.microsoft.com/office/word/2020/wordml/sdtdatahash" xmlns:w16sdtfl="http://schemas.microsoft.com/office/word/2024/wordml/sdtformatlock" xmlns:w16se="http://schemas.microsoft.com/office/word/2015/wordml/symex" xmlns:wpg="http://schemas.microsoft.com/office/word/2010/wordprocessingGroup" xmlns:wpi="http://schemas.microsoft.com/office/word/2010/wordprocessingInk" xmlns:wne="http://schemas.microsoft.com/office/word/2006/wordml" xmlns:wps="http://schemas.microsoft.com/office/word/2010/wordprocessingShape" mc:Ignorable="w14 w15 w16se w16cid w16 w16cex w16sdtdh w16sdtfl w16du wp14">
   <w:abstractNum w:abstractNumId="0" w15:restartNumberingAfterBreak="0">
-    <w:nsid w:val="0C7F0C20"/>
+    <w:nsid w:val="2A913ABD"/>
     <w:multiLevelType w:val="singleLevel"/>
-    <w:tmpl w:val="D1EE121E"/>
+    <w:tmpl w:val="631EFA8E"/>
     <w:lvl w:ilvl="0">
       <w:start w:val="1"/>
       <w:numFmt w:val="decimal"/>
@@ -10403,9 +10408,9 @@
     </w:lvl>
   </w:abstractNum>
   <w:abstractNum w:abstractNumId="1" w15:restartNumberingAfterBreak="0">
-    <w:nsid w:val="35C15A76"/>
+    <w:nsid w:val="5F6200FA"/>
     <w:multiLevelType w:val="singleLevel"/>
-    <w:tmpl w:val="F37EE5FE"/>
+    <w:tmpl w:val="86980D22"/>
     <w:lvl w:ilvl="0">
       <w:start w:val="1"/>
       <w:numFmt w:val="bullet"/>
@@ -10419,22 +10424,22 @@
       </w:rPr>
     </w:lvl>
   </w:abstractNum>
-  <w:num w:numId="1" w16cid:durableId="488979101">
+  <w:num w:numId="1" w16cid:durableId="1660887899">
     <w:abstractNumId w:val="1"/>
   </w:num>
-  <w:num w:numId="2" w16cid:durableId="1105923522">
+  <w:num w:numId="2" w16cid:durableId="462507770">
     <w:abstractNumId w:val="0"/>
     <w:lvlOverride w:ilvl="0">
       <w:startOverride w:val="1"/>
     </w:lvlOverride>
   </w:num>
-  <w:num w:numId="3" w16cid:durableId="1155024343">
+  <w:num w:numId="3" w16cid:durableId="1199976200">
     <w:abstractNumId w:val="0"/>
     <w:lvlOverride w:ilvl="0">
       <w:startOverride w:val="1"/>
     </w:lvlOverride>
   </w:num>
-  <w:num w:numId="4" w16cid:durableId="461192657">
+  <w:num w:numId="4" w16cid:durableId="509025478">
     <w:abstractNumId w:val="0"/>
     <w:lvlOverride w:ilvl="0">
       <w:startOverride w:val="1"/>

</xml_diff>

<commit_message>
Build targets, project README and user guide
pom.xml — Maven build definition: Paper 26.1.2 API
  (26.1.2.build.74-stable), Java 25.
src/main/resources/plugin.yml — plugin manifest: the /qacraft command,
  aliases, permissions, api-version 26.1.
README.md — project overview: requirements, build, a try-it-on-your-own
  quickstart, command tables, tools and documentation.
docs/QAcraft-Guide.docx — the full English user guide.
</commit_message>
<xml_diff>
--- a/docs/QAcraft-Guide.docx
+++ b/docs/QAcraft-Guide.docx
@@ -104,7 +104,7 @@
           <w:sz w:val="20"/>
           <w:szCs w:val="20"/>
         </w:rPr>
-        <w:t>Version 1.0 · Paper 1.21.4+</w:t>
+        <w:t>Version 1.0 · Paper 26.1.2+</w:t>
       </w:r>
     </w:p>
     <w:p>
@@ -150,7 +150,7 @@
       <w:r>
         <w:fldChar w:fldCharType="separate"/>
       </w:r>
-      <w:hyperlink w:anchor="_Toc234366191" w:history="1">
+      <w:hyperlink w:anchor="_Toc235442160" w:history="1">
         <w:r>
           <w:rPr>
             <w:rStyle w:val="Hypertextovodkaz"/>
@@ -177,7 +177,7 @@
             <w:noProof/>
             <w:webHidden/>
           </w:rPr>
-          <w:instrText xml:space="preserve"> PAGEREF _Toc234366191 \h </w:instrText>
+          <w:instrText xml:space="preserve"> PAGEREF _Toc235442160 \h </w:instrText>
         </w:r>
         <w:r>
           <w:rPr>
@@ -223,7 +223,7 @@
           <w14:ligatures w14:val="standardContextual"/>
         </w:rPr>
       </w:pPr>
-      <w:hyperlink w:anchor="_Toc234366192" w:history="1">
+      <w:hyperlink w:anchor="_Toc235442161" w:history="1">
         <w:r>
           <w:rPr>
             <w:rStyle w:val="Hypertextovodkaz"/>
@@ -250,7 +250,7 @@
             <w:noProof/>
             <w:webHidden/>
           </w:rPr>
-          <w:instrText xml:space="preserve"> PAGEREF _Toc234366192 \h </w:instrText>
+          <w:instrText xml:space="preserve"> PAGEREF _Toc235442161 \h </w:instrText>
         </w:r>
         <w:r>
           <w:rPr>
@@ -296,7 +296,7 @@
           <w14:ligatures w14:val="standardContextual"/>
         </w:rPr>
       </w:pPr>
-      <w:hyperlink w:anchor="_Toc234366193" w:history="1">
+      <w:hyperlink w:anchor="_Toc235442162" w:history="1">
         <w:r>
           <w:rPr>
             <w:rStyle w:val="Hypertextovodkaz"/>
@@ -323,7 +323,7 @@
             <w:noProof/>
             <w:webHidden/>
           </w:rPr>
-          <w:instrText xml:space="preserve"> PAGEREF _Toc234366193 \h </w:instrText>
+          <w:instrText xml:space="preserve"> PAGEREF _Toc235442162 \h </w:instrText>
         </w:r>
         <w:r>
           <w:rPr>
@@ -369,7 +369,7 @@
           <w14:ligatures w14:val="standardContextual"/>
         </w:rPr>
       </w:pPr>
-      <w:hyperlink w:anchor="_Toc234366194" w:history="1">
+      <w:hyperlink w:anchor="_Toc235442163" w:history="1">
         <w:r>
           <w:rPr>
             <w:rStyle w:val="Hypertextovodkaz"/>
@@ -396,7 +396,7 @@
             <w:noProof/>
             <w:webHidden/>
           </w:rPr>
-          <w:instrText xml:space="preserve"> PAGEREF _Toc234366194 \h </w:instrText>
+          <w:instrText xml:space="preserve"> PAGEREF _Toc235442163 \h </w:instrText>
         </w:r>
         <w:r>
           <w:rPr>
@@ -442,7 +442,7 @@
           <w14:ligatures w14:val="standardContextual"/>
         </w:rPr>
       </w:pPr>
-      <w:hyperlink w:anchor="_Toc234366195" w:history="1">
+      <w:hyperlink w:anchor="_Toc235442164" w:history="1">
         <w:r>
           <w:rPr>
             <w:rStyle w:val="Hypertextovodkaz"/>
@@ -469,7 +469,7 @@
             <w:noProof/>
             <w:webHidden/>
           </w:rPr>
-          <w:instrText xml:space="preserve"> PAGEREF _Toc234366195 \h </w:instrText>
+          <w:instrText xml:space="preserve"> PAGEREF _Toc235442164 \h </w:instrText>
         </w:r>
         <w:r>
           <w:rPr>
@@ -515,7 +515,7 @@
           <w14:ligatures w14:val="standardContextual"/>
         </w:rPr>
       </w:pPr>
-      <w:hyperlink w:anchor="_Toc234366196" w:history="1">
+      <w:hyperlink w:anchor="_Toc235442165" w:history="1">
         <w:r>
           <w:rPr>
             <w:rStyle w:val="Hypertextovodkaz"/>
@@ -542,7 +542,7 @@
             <w:noProof/>
             <w:webHidden/>
           </w:rPr>
-          <w:instrText xml:space="preserve"> PAGEREF _Toc234366196 \h </w:instrText>
+          <w:instrText xml:space="preserve"> PAGEREF _Toc235442165 \h </w:instrText>
         </w:r>
         <w:r>
           <w:rPr>
@@ -588,7 +588,7 @@
           <w14:ligatures w14:val="standardContextual"/>
         </w:rPr>
       </w:pPr>
-      <w:hyperlink w:anchor="_Toc234366197" w:history="1">
+      <w:hyperlink w:anchor="_Toc235442166" w:history="1">
         <w:r>
           <w:rPr>
             <w:rStyle w:val="Hypertextovodkaz"/>
@@ -615,7 +615,7 @@
             <w:noProof/>
             <w:webHidden/>
           </w:rPr>
-          <w:instrText xml:space="preserve"> PAGEREF _Toc234366197 \h </w:instrText>
+          <w:instrText xml:space="preserve"> PAGEREF _Toc235442166 \h </w:instrText>
         </w:r>
         <w:r>
           <w:rPr>
@@ -661,7 +661,7 @@
           <w14:ligatures w14:val="standardContextual"/>
         </w:rPr>
       </w:pPr>
-      <w:hyperlink w:anchor="_Toc234366198" w:history="1">
+      <w:hyperlink w:anchor="_Toc235442167" w:history="1">
         <w:r>
           <w:rPr>
             <w:rStyle w:val="Hypertextovodkaz"/>
@@ -688,7 +688,7 @@
             <w:noProof/>
             <w:webHidden/>
           </w:rPr>
-          <w:instrText xml:space="preserve"> PAGEREF _Toc234366198 \h </w:instrText>
+          <w:instrText xml:space="preserve"> PAGEREF _Toc235442167 \h </w:instrText>
         </w:r>
         <w:r>
           <w:rPr>
@@ -734,7 +734,7 @@
           <w14:ligatures w14:val="standardContextual"/>
         </w:rPr>
       </w:pPr>
-      <w:hyperlink w:anchor="_Toc234366199" w:history="1">
+      <w:hyperlink w:anchor="_Toc235442168" w:history="1">
         <w:r>
           <w:rPr>
             <w:rStyle w:val="Hypertextovodkaz"/>
@@ -761,7 +761,7 @@
             <w:noProof/>
             <w:webHidden/>
           </w:rPr>
-          <w:instrText xml:space="preserve"> PAGEREF _Toc234366199 \h </w:instrText>
+          <w:instrText xml:space="preserve"> PAGEREF _Toc235442168 \h </w:instrText>
         </w:r>
         <w:r>
           <w:rPr>
@@ -807,7 +807,7 @@
           <w14:ligatures w14:val="standardContextual"/>
         </w:rPr>
       </w:pPr>
-      <w:hyperlink w:anchor="_Toc234366200" w:history="1">
+      <w:hyperlink w:anchor="_Toc235442169" w:history="1">
         <w:r>
           <w:rPr>
             <w:rStyle w:val="Hypertextovodkaz"/>
@@ -834,7 +834,7 @@
             <w:noProof/>
             <w:webHidden/>
           </w:rPr>
-          <w:instrText xml:space="preserve"> PAGEREF _Toc234366200 \h </w:instrText>
+          <w:instrText xml:space="preserve"> PAGEREF _Toc235442169 \h </w:instrText>
         </w:r>
         <w:r>
           <w:rPr>
@@ -880,7 +880,7 @@
           <w14:ligatures w14:val="standardContextual"/>
         </w:rPr>
       </w:pPr>
-      <w:hyperlink w:anchor="_Toc234366201" w:history="1">
+      <w:hyperlink w:anchor="_Toc235442170" w:history="1">
         <w:r>
           <w:rPr>
             <w:rStyle w:val="Hypertextovodkaz"/>
@@ -907,7 +907,7 @@
             <w:noProof/>
             <w:webHidden/>
           </w:rPr>
-          <w:instrText xml:space="preserve"> PAGEREF _Toc234366201 \h </w:instrText>
+          <w:instrText xml:space="preserve"> PAGEREF _Toc235442170 \h </w:instrText>
         </w:r>
         <w:r>
           <w:rPr>
@@ -953,7 +953,7 @@
           <w14:ligatures w14:val="standardContextual"/>
         </w:rPr>
       </w:pPr>
-      <w:hyperlink w:anchor="_Toc234366202" w:history="1">
+      <w:hyperlink w:anchor="_Toc235442171" w:history="1">
         <w:r>
           <w:rPr>
             <w:rStyle w:val="Hypertextovodkaz"/>
@@ -980,7 +980,7 @@
             <w:noProof/>
             <w:webHidden/>
           </w:rPr>
-          <w:instrText xml:space="preserve"> PAGEREF _Toc234366202 \h </w:instrText>
+          <w:instrText xml:space="preserve"> PAGEREF _Toc235442171 \h </w:instrText>
         </w:r>
         <w:r>
           <w:rPr>
@@ -1026,7 +1026,7 @@
           <w14:ligatures w14:val="standardContextual"/>
         </w:rPr>
       </w:pPr>
-      <w:hyperlink w:anchor="_Toc234366203" w:history="1">
+      <w:hyperlink w:anchor="_Toc235442172" w:history="1">
         <w:r>
           <w:rPr>
             <w:rStyle w:val="Hypertextovodkaz"/>
@@ -1053,7 +1053,7 @@
             <w:noProof/>
             <w:webHidden/>
           </w:rPr>
-          <w:instrText xml:space="preserve"> PAGEREF _Toc234366203 \h </w:instrText>
+          <w:instrText xml:space="preserve"> PAGEREF _Toc235442172 \h </w:instrText>
         </w:r>
         <w:r>
           <w:rPr>
@@ -1099,7 +1099,7 @@
           <w14:ligatures w14:val="standardContextual"/>
         </w:rPr>
       </w:pPr>
-      <w:hyperlink w:anchor="_Toc234366204" w:history="1">
+      <w:hyperlink w:anchor="_Toc235442173" w:history="1">
         <w:r>
           <w:rPr>
             <w:rStyle w:val="Hypertextovodkaz"/>
@@ -1126,7 +1126,7 @@
             <w:noProof/>
             <w:webHidden/>
           </w:rPr>
-          <w:instrText xml:space="preserve"> PAGEREF _Toc234366204 \h </w:instrText>
+          <w:instrText xml:space="preserve"> PAGEREF _Toc235442173 \h </w:instrText>
         </w:r>
         <w:r>
           <w:rPr>
@@ -1172,7 +1172,7 @@
           <w14:ligatures w14:val="standardContextual"/>
         </w:rPr>
       </w:pPr>
-      <w:hyperlink w:anchor="_Toc234366205" w:history="1">
+      <w:hyperlink w:anchor="_Toc235442174" w:history="1">
         <w:r>
           <w:rPr>
             <w:rStyle w:val="Hypertextovodkaz"/>
@@ -1199,7 +1199,7 @@
             <w:noProof/>
             <w:webHidden/>
           </w:rPr>
-          <w:instrText xml:space="preserve"> PAGEREF _Toc234366205 \h </w:instrText>
+          <w:instrText xml:space="preserve"> PAGEREF _Toc235442174 \h </w:instrText>
         </w:r>
         <w:r>
           <w:rPr>
@@ -1245,7 +1245,7 @@
           <w14:ligatures w14:val="standardContextual"/>
         </w:rPr>
       </w:pPr>
-      <w:hyperlink w:anchor="_Toc234366206" w:history="1">
+      <w:hyperlink w:anchor="_Toc235442175" w:history="1">
         <w:r>
           <w:rPr>
             <w:rStyle w:val="Hypertextovodkaz"/>
@@ -1272,7 +1272,7 @@
             <w:noProof/>
             <w:webHidden/>
           </w:rPr>
-          <w:instrText xml:space="preserve"> PAGEREF _Toc234366206 \h </w:instrText>
+          <w:instrText xml:space="preserve"> PAGEREF _Toc235442175 \h </w:instrText>
         </w:r>
         <w:r>
           <w:rPr>
@@ -1318,7 +1318,7 @@
           <w14:ligatures w14:val="standardContextual"/>
         </w:rPr>
       </w:pPr>
-      <w:hyperlink w:anchor="_Toc234366207" w:history="1">
+      <w:hyperlink w:anchor="_Toc235442176" w:history="1">
         <w:r>
           <w:rPr>
             <w:rStyle w:val="Hypertextovodkaz"/>
@@ -1345,7 +1345,7 @@
             <w:noProof/>
             <w:webHidden/>
           </w:rPr>
-          <w:instrText xml:space="preserve"> PAGEREF _Toc234366207 \h </w:instrText>
+          <w:instrText xml:space="preserve"> PAGEREF _Toc235442176 \h </w:instrText>
         </w:r>
         <w:r>
           <w:rPr>
@@ -1391,7 +1391,7 @@
           <w14:ligatures w14:val="standardContextual"/>
         </w:rPr>
       </w:pPr>
-      <w:hyperlink w:anchor="_Toc234366208" w:history="1">
+      <w:hyperlink w:anchor="_Toc235442177" w:history="1">
         <w:r>
           <w:rPr>
             <w:rStyle w:val="Hypertextovodkaz"/>
@@ -1418,7 +1418,7 @@
             <w:noProof/>
             <w:webHidden/>
           </w:rPr>
-          <w:instrText xml:space="preserve"> PAGEREF _Toc234366208 \h </w:instrText>
+          <w:instrText xml:space="preserve"> PAGEREF _Toc235442177 \h </w:instrText>
         </w:r>
         <w:r>
           <w:rPr>
@@ -1464,7 +1464,7 @@
           <w14:ligatures w14:val="standardContextual"/>
         </w:rPr>
       </w:pPr>
-      <w:hyperlink w:anchor="_Toc234366209" w:history="1">
+      <w:hyperlink w:anchor="_Toc235442178" w:history="1">
         <w:r>
           <w:rPr>
             <w:rStyle w:val="Hypertextovodkaz"/>
@@ -1491,7 +1491,7 @@
             <w:noProof/>
             <w:webHidden/>
           </w:rPr>
-          <w:instrText xml:space="preserve"> PAGEREF _Toc234366209 \h </w:instrText>
+          <w:instrText xml:space="preserve"> PAGEREF _Toc235442178 \h </w:instrText>
         </w:r>
         <w:r>
           <w:rPr>
@@ -1537,7 +1537,7 @@
           <w14:ligatures w14:val="standardContextual"/>
         </w:rPr>
       </w:pPr>
-      <w:hyperlink w:anchor="_Toc234366210" w:history="1">
+      <w:hyperlink w:anchor="_Toc235442179" w:history="1">
         <w:r>
           <w:rPr>
             <w:rStyle w:val="Hypertextovodkaz"/>
@@ -1564,7 +1564,7 @@
             <w:noProof/>
             <w:webHidden/>
           </w:rPr>
-          <w:instrText xml:space="preserve"> PAGEREF _Toc234366210 \h </w:instrText>
+          <w:instrText xml:space="preserve"> PAGEREF _Toc235442179 \h </w:instrText>
         </w:r>
         <w:r>
           <w:rPr>
@@ -1610,7 +1610,7 @@
           <w14:ligatures w14:val="standardContextual"/>
         </w:rPr>
       </w:pPr>
-      <w:hyperlink w:anchor="_Toc234366211" w:history="1">
+      <w:hyperlink w:anchor="_Toc235442180" w:history="1">
         <w:r>
           <w:rPr>
             <w:rStyle w:val="Hypertextovodkaz"/>
@@ -1637,7 +1637,7 @@
             <w:noProof/>
             <w:webHidden/>
           </w:rPr>
-          <w:instrText xml:space="preserve"> PAGEREF _Toc234366211 \h </w:instrText>
+          <w:instrText xml:space="preserve"> PAGEREF _Toc235442180 \h </w:instrText>
         </w:r>
         <w:r>
           <w:rPr>
@@ -1683,7 +1683,7 @@
           <w14:ligatures w14:val="standardContextual"/>
         </w:rPr>
       </w:pPr>
-      <w:hyperlink w:anchor="_Toc234366212" w:history="1">
+      <w:hyperlink w:anchor="_Toc235442181" w:history="1">
         <w:r>
           <w:rPr>
             <w:rStyle w:val="Hypertextovodkaz"/>
@@ -1710,7 +1710,7 @@
             <w:noProof/>
             <w:webHidden/>
           </w:rPr>
-          <w:instrText xml:space="preserve"> PAGEREF _Toc234366212 \h </w:instrText>
+          <w:instrText xml:space="preserve"> PAGEREF _Toc235442181 \h </w:instrText>
         </w:r>
         <w:r>
           <w:rPr>
@@ -1756,7 +1756,7 @@
           <w14:ligatures w14:val="standardContextual"/>
         </w:rPr>
       </w:pPr>
-      <w:hyperlink w:anchor="_Toc234366213" w:history="1">
+      <w:hyperlink w:anchor="_Toc235442182" w:history="1">
         <w:r>
           <w:rPr>
             <w:rStyle w:val="Hypertextovodkaz"/>
@@ -1783,7 +1783,7 @@
             <w:noProof/>
             <w:webHidden/>
           </w:rPr>
-          <w:instrText xml:space="preserve"> PAGEREF _Toc234366213 \h </w:instrText>
+          <w:instrText xml:space="preserve"> PAGEREF _Toc235442182 \h </w:instrText>
         </w:r>
         <w:r>
           <w:rPr>
@@ -1829,7 +1829,7 @@
           <w14:ligatures w14:val="standardContextual"/>
         </w:rPr>
       </w:pPr>
-      <w:hyperlink w:anchor="_Toc234366214" w:history="1">
+      <w:hyperlink w:anchor="_Toc235442183" w:history="1">
         <w:r>
           <w:rPr>
             <w:rStyle w:val="Hypertextovodkaz"/>
@@ -1856,7 +1856,7 @@
             <w:noProof/>
             <w:webHidden/>
           </w:rPr>
-          <w:instrText xml:space="preserve"> PAGEREF _Toc234366214 \h </w:instrText>
+          <w:instrText xml:space="preserve"> PAGEREF _Toc235442183 \h </w:instrText>
         </w:r>
         <w:r>
           <w:rPr>
@@ -1902,7 +1902,7 @@
           <w14:ligatures w14:val="standardContextual"/>
         </w:rPr>
       </w:pPr>
-      <w:hyperlink w:anchor="_Toc234366215" w:history="1">
+      <w:hyperlink w:anchor="_Toc235442184" w:history="1">
         <w:r>
           <w:rPr>
             <w:rStyle w:val="Hypertextovodkaz"/>
@@ -1929,7 +1929,7 @@
             <w:noProof/>
             <w:webHidden/>
           </w:rPr>
-          <w:instrText xml:space="preserve"> PAGEREF _Toc234366215 \h </w:instrText>
+          <w:instrText xml:space="preserve"> PAGEREF _Toc235442184 \h </w:instrText>
         </w:r>
         <w:r>
           <w:rPr>
@@ -1975,7 +1975,7 @@
           <w14:ligatures w14:val="standardContextual"/>
         </w:rPr>
       </w:pPr>
-      <w:hyperlink w:anchor="_Toc234366216" w:history="1">
+      <w:hyperlink w:anchor="_Toc235442185" w:history="1">
         <w:r>
           <w:rPr>
             <w:rStyle w:val="Hypertextovodkaz"/>
@@ -2002,7 +2002,7 @@
             <w:noProof/>
             <w:webHidden/>
           </w:rPr>
-          <w:instrText xml:space="preserve"> PAGEREF _Toc234366216 \h </w:instrText>
+          <w:instrText xml:space="preserve"> PAGEREF _Toc235442185 \h </w:instrText>
         </w:r>
         <w:r>
           <w:rPr>
@@ -2048,7 +2048,7 @@
           <w14:ligatures w14:val="standardContextual"/>
         </w:rPr>
       </w:pPr>
-      <w:hyperlink w:anchor="_Toc234366217" w:history="1">
+      <w:hyperlink w:anchor="_Toc235442186" w:history="1">
         <w:r>
           <w:rPr>
             <w:rStyle w:val="Hypertextovodkaz"/>
@@ -2075,7 +2075,7 @@
             <w:noProof/>
             <w:webHidden/>
           </w:rPr>
-          <w:instrText xml:space="preserve"> PAGEREF _Toc234366217 \h </w:instrText>
+          <w:instrText xml:space="preserve"> PAGEREF _Toc235442186 \h </w:instrText>
         </w:r>
         <w:r>
           <w:rPr>
@@ -2121,7 +2121,7 @@
           <w14:ligatures w14:val="standardContextual"/>
         </w:rPr>
       </w:pPr>
-      <w:hyperlink w:anchor="_Toc234366218" w:history="1">
+      <w:hyperlink w:anchor="_Toc235442187" w:history="1">
         <w:r>
           <w:rPr>
             <w:rStyle w:val="Hypertextovodkaz"/>
@@ -2148,7 +2148,7 @@
             <w:noProof/>
             <w:webHidden/>
           </w:rPr>
-          <w:instrText xml:space="preserve"> PAGEREF _Toc234366218 \h </w:instrText>
+          <w:instrText xml:space="preserve"> PAGEREF _Toc235442187 \h </w:instrText>
         </w:r>
         <w:r>
           <w:rPr>
@@ -2194,7 +2194,7 @@
           <w14:ligatures w14:val="standardContextual"/>
         </w:rPr>
       </w:pPr>
-      <w:hyperlink w:anchor="_Toc234366219" w:history="1">
+      <w:hyperlink w:anchor="_Toc235442188" w:history="1">
         <w:r>
           <w:rPr>
             <w:rStyle w:val="Hypertextovodkaz"/>
@@ -2221,7 +2221,7 @@
             <w:noProof/>
             <w:webHidden/>
           </w:rPr>
-          <w:instrText xml:space="preserve"> PAGEREF _Toc234366219 \h </w:instrText>
+          <w:instrText xml:space="preserve"> PAGEREF _Toc235442188 \h </w:instrText>
         </w:r>
         <w:r>
           <w:rPr>
@@ -2267,7 +2267,7 @@
           <w14:ligatures w14:val="standardContextual"/>
         </w:rPr>
       </w:pPr>
-      <w:hyperlink w:anchor="_Toc234366220" w:history="1">
+      <w:hyperlink w:anchor="_Toc235442189" w:history="1">
         <w:r>
           <w:rPr>
             <w:rStyle w:val="Hypertextovodkaz"/>
@@ -2294,7 +2294,7 @@
             <w:noProof/>
             <w:webHidden/>
           </w:rPr>
-          <w:instrText xml:space="preserve"> PAGEREF _Toc234366220 \h </w:instrText>
+          <w:instrText xml:space="preserve"> PAGEREF _Toc235442189 \h </w:instrText>
         </w:r>
         <w:r>
           <w:rPr>
@@ -2340,7 +2340,7 @@
           <w14:ligatures w14:val="standardContextual"/>
         </w:rPr>
       </w:pPr>
-      <w:hyperlink w:anchor="_Toc234366221" w:history="1">
+      <w:hyperlink w:anchor="_Toc235442190" w:history="1">
         <w:r>
           <w:rPr>
             <w:rStyle w:val="Hypertextovodkaz"/>
@@ -2367,7 +2367,7 @@
             <w:noProof/>
             <w:webHidden/>
           </w:rPr>
-          <w:instrText xml:space="preserve"> PAGEREF _Toc234366221 \h </w:instrText>
+          <w:instrText xml:space="preserve"> PAGEREF _Toc235442190 \h </w:instrText>
         </w:r>
         <w:r>
           <w:rPr>
@@ -2413,7 +2413,7 @@
           <w14:ligatures w14:val="standardContextual"/>
         </w:rPr>
       </w:pPr>
-      <w:hyperlink w:anchor="_Toc234366222" w:history="1">
+      <w:hyperlink w:anchor="_Toc235442191" w:history="1">
         <w:r>
           <w:rPr>
             <w:rStyle w:val="Hypertextovodkaz"/>
@@ -2440,7 +2440,7 @@
             <w:noProof/>
             <w:webHidden/>
           </w:rPr>
-          <w:instrText xml:space="preserve"> PAGEREF _Toc234366222 \h </w:instrText>
+          <w:instrText xml:space="preserve"> PAGEREF _Toc235442191 \h </w:instrText>
         </w:r>
         <w:r>
           <w:rPr>
@@ -2486,7 +2486,7 @@
           <w14:ligatures w14:val="standardContextual"/>
         </w:rPr>
       </w:pPr>
-      <w:hyperlink w:anchor="_Toc234366223" w:history="1">
+      <w:hyperlink w:anchor="_Toc235442192" w:history="1">
         <w:r>
           <w:rPr>
             <w:rStyle w:val="Hypertextovodkaz"/>
@@ -2513,7 +2513,7 @@
             <w:noProof/>
             <w:webHidden/>
           </w:rPr>
-          <w:instrText xml:space="preserve"> PAGEREF _Toc234366223 \h </w:instrText>
+          <w:instrText xml:space="preserve"> PAGEREF _Toc235442192 \h </w:instrText>
         </w:r>
         <w:r>
           <w:rPr>
@@ -2559,7 +2559,7 @@
           <w14:ligatures w14:val="standardContextual"/>
         </w:rPr>
       </w:pPr>
-      <w:hyperlink w:anchor="_Toc234366224" w:history="1">
+      <w:hyperlink w:anchor="_Toc235442193" w:history="1">
         <w:r>
           <w:rPr>
             <w:rStyle w:val="Hypertextovodkaz"/>
@@ -2586,7 +2586,7 @@
             <w:noProof/>
             <w:webHidden/>
           </w:rPr>
-          <w:instrText xml:space="preserve"> PAGEREF _Toc234366224 \h </w:instrText>
+          <w:instrText xml:space="preserve"> PAGEREF _Toc235442193 \h </w:instrText>
         </w:r>
         <w:r>
           <w:rPr>
@@ -2626,7 +2626,7 @@
       <w:pPr>
         <w:pStyle w:val="Nadpis1"/>
       </w:pPr>
-      <w:bookmarkStart w:id="0" w:name="_Toc234366191"/>
+      <w:bookmarkStart w:id="0" w:name="_Toc235442160"/>
       <w:r>
         <w:t>1. Introduction</w:t>
       </w:r>
@@ -2697,7 +2697,7 @@
       <w:pPr>
         <w:pStyle w:val="Nadpis2"/>
       </w:pPr>
-      <w:bookmarkStart w:id="1" w:name="_Toc234366192"/>
+      <w:bookmarkStart w:id="1" w:name="_Toc235442161"/>
       <w:r>
         <w:t>1.1 Requirements and installation</w:t>
       </w:r>
@@ -2717,10 +2717,10 @@
         <w:rPr>
           <w:b/>
         </w:rPr>
-        <w:t>Paper 1.21.4 or newer</w:t>
-      </w:r>
-      <w:r>
-        <w:t xml:space="preserve"> (the plugin is forward-compatible with later Paper versions).</w:t>
+        <w:t>Paper 26.1.2 or newer</w:t>
+      </w:r>
+      <w:r>
+        <w:t xml:space="preserve"> (Minecraft's 2026 versioning; players join with matching 26.1.x clients).</w:t>
       </w:r>
     </w:p>
     <w:p>
@@ -2737,7 +2737,7 @@
         <w:rPr>
           <w:b/>
         </w:rPr>
-        <w:t>Java 21</w:t>
+        <w:t>Java 25</w:t>
       </w:r>
       <w:r>
         <w:t xml:space="preserve"> installed — </w:t>
@@ -2828,7 +2828,7 @@
       <w:pPr>
         <w:pStyle w:val="Nadpis2"/>
       </w:pPr>
-      <w:bookmarkStart w:id="2" w:name="_Toc234366193"/>
+      <w:bookmarkStart w:id="2" w:name="_Toc235442162"/>
       <w:r>
         <w:t>1.2 Commands, aliases and permissions</w:t>
       </w:r>
@@ -2991,7 +2991,7 @@
       <w:pPr>
         <w:pStyle w:val="Nadpis1"/>
       </w:pPr>
-      <w:bookmarkStart w:id="3" w:name="_Toc234366194"/>
+      <w:bookmarkStart w:id="3" w:name="_Toc235442163"/>
       <w:r>
         <w:t>2. Try the Plugin on Your Own — the Tutorial Hall</w:t>
       </w:r>
@@ -3024,7 +3024,7 @@
       <w:pPr>
         <w:pStyle w:val="Nadpis2"/>
       </w:pPr>
-      <w:bookmarkStart w:id="4" w:name="_Toc234366195"/>
+      <w:bookmarkStart w:id="4" w:name="_Toc235442164"/>
       <w:r>
         <w:t>2.1 Building the hall</w:t>
       </w:r>
@@ -3125,7 +3125,7 @@
       <w:pPr>
         <w:pStyle w:val="Nadpis2"/>
       </w:pPr>
-      <w:bookmarkStart w:id="5" w:name="_Toc234366196"/>
+      <w:bookmarkStart w:id="5" w:name="_Toc235442165"/>
       <w:r>
         <w:t>2.2 Running the tutorial</w:t>
       </w:r>
@@ -3279,7 +3279,7 @@
       <w:pPr>
         <w:pStyle w:val="Nadpis2"/>
       </w:pPr>
-      <w:bookmarkStart w:id="6" w:name="_Toc234366197"/>
+      <w:bookmarkStart w:id="6" w:name="_Toc235442166"/>
       <w:r>
         <w:t>2.3 What you will do in each room</w:t>
       </w:r>
@@ -3412,7 +3412,7 @@
       <w:pPr>
         <w:pStyle w:val="Nadpis1"/>
       </w:pPr>
-      <w:bookmarkStart w:id="7" w:name="_Toc234366198"/>
+      <w:bookmarkStart w:id="7" w:name="_Toc235442167"/>
       <w:r>
         <w:t>3. Getting Tools and Items</w:t>
       </w:r>
@@ -3436,7 +3436,7 @@
       <w:pPr>
         <w:pStyle w:val="Nadpis2"/>
       </w:pPr>
-      <w:bookmarkStart w:id="8" w:name="_Toc234366199"/>
+      <w:bookmarkStart w:id="8" w:name="_Toc235442168"/>
       <w:r>
         <w:t>3.1 Tool sets</w:t>
       </w:r>
@@ -3543,7 +3543,7 @@
       <w:pPr>
         <w:pStyle w:val="Nadpis2"/>
       </w:pPr>
-      <w:bookmarkStart w:id="9" w:name="_Toc234366200"/>
+      <w:bookmarkStart w:id="9" w:name="_Toc235442169"/>
       <w:r>
         <w:t>3.2 Single items — keep your inventory</w:t>
       </w:r>
@@ -3592,7 +3592,7 @@
       <w:pPr>
         <w:pStyle w:val="Nadpis2"/>
       </w:pPr>
-      <w:bookmarkStart w:id="10" w:name="_Toc234366201"/>
+      <w:bookmarkStart w:id="10" w:name="_Toc235442170"/>
       <w:r>
         <w:t>3.3 The Quantum Eraser</w:t>
       </w:r>
@@ -3699,7 +3699,7 @@
                 <w:noProof/>
               </w:rPr>
               <w:drawing>
-                <wp:inline distT="0" distB="0" distL="0" distR="0" wp14:anchorId="1E903F2F" wp14:editId="1ED4A8E5">
+                <wp:inline distT="0" distB="0" distL="0" distR="0" wp14:anchorId="3CFAC525" wp14:editId="7B69F800">
                   <wp:extent cx="457200" cy="457200"/>
                   <wp:effectExtent l="0" t="0" r="0" b="0"/>
                   <wp:docPr id="1001" name="brush.png"/>
@@ -3781,7 +3781,7 @@
       <w:pPr>
         <w:pStyle w:val="Nadpis1"/>
       </w:pPr>
-      <w:bookmarkStart w:id="11" w:name="_Toc234366202"/>
+      <w:bookmarkStart w:id="11" w:name="_Toc235442171"/>
       <w:r>
         <w:t>4. BB84 — Quantum Key Distribution</w:t>
       </w:r>
@@ -3837,7 +3837,7 @@
       <w:pPr>
         <w:pStyle w:val="Nadpis2"/>
       </w:pPr>
-      <w:bookmarkStart w:id="12" w:name="_Toc234366203"/>
+      <w:bookmarkStart w:id="12" w:name="_Toc235442172"/>
       <w:r>
         <w:t>4.1 Tools and items</w:t>
       </w:r>
@@ -3944,7 +3944,7 @@
                 <w:noProof/>
               </w:rPr>
               <w:drawing>
-                <wp:inline distT="0" distB="0" distL="0" distR="0" wp14:anchorId="5F602EB8" wp14:editId="07ED4305">
+                <wp:inline distT="0" distB="0" distL="0" distR="0" wp14:anchorId="2B5C16DB" wp14:editId="06E596F8">
                   <wp:extent cx="457200" cy="457200"/>
                   <wp:effectExtent l="0" t="0" r="0" b="0"/>
                   <wp:docPr id="1002" name="compass.png"/>
@@ -4032,7 +4032,7 @@
                 <w:noProof/>
               </w:rPr>
               <w:drawing>
-                <wp:inline distT="0" distB="0" distL="0" distR="0" wp14:anchorId="3430BD7B" wp14:editId="4CE1E708">
+                <wp:inline distT="0" distB="0" distL="0" distR="0" wp14:anchorId="30DD5F8B" wp14:editId="37A71ADC">
                   <wp:extent cx="457200" cy="457200"/>
                   <wp:effectExtent l="0" t="0" r="0" b="0"/>
                   <wp:docPr id="1003" name="recovery_compass.png"/>
@@ -4120,7 +4120,7 @@
                 <w:noProof/>
               </w:rPr>
               <w:drawing>
-                <wp:inline distT="0" distB="0" distL="0" distR="0" wp14:anchorId="11690576" wp14:editId="05033465">
+                <wp:inline distT="0" distB="0" distL="0" distR="0" wp14:anchorId="20BE28B7" wp14:editId="3A2CB033">
                   <wp:extent cx="457200" cy="457200"/>
                   <wp:effectExtent l="0" t="0" r="0" b="0"/>
                   <wp:docPr id="1004" name="snowball.png"/>
@@ -4208,7 +4208,7 @@
                 <w:noProof/>
               </w:rPr>
               <w:drawing>
-                <wp:inline distT="0" distB="0" distL="0" distR="0" wp14:anchorId="66FDC6D4" wp14:editId="30C19F70">
+                <wp:inline distT="0" distB="0" distL="0" distR="0" wp14:anchorId="5F706573" wp14:editId="75F0CD35">
                   <wp:extent cx="457200" cy="457200"/>
                   <wp:effectExtent l="0" t="0" r="0" b="0"/>
                   <wp:docPr id="1005" name="carrot_on_a_stick.png"/>
@@ -4296,7 +4296,7 @@
                 <w:noProof/>
               </w:rPr>
               <w:drawing>
-                <wp:inline distT="0" distB="0" distL="0" distR="0" wp14:anchorId="0F0E5F29" wp14:editId="356568B5">
+                <wp:inline distT="0" distB="0" distL="0" distR="0" wp14:anchorId="31FD61B1" wp14:editId="60998B74">
                   <wp:extent cx="457200" cy="457200"/>
                   <wp:effectExtent l="0" t="0" r="0" b="0"/>
                   <wp:docPr id="1006" name="warped_fungus_on_a_stick.png"/>
@@ -4384,7 +4384,7 @@
                 <w:noProof/>
               </w:rPr>
               <w:drawing>
-                <wp:inline distT="0" distB="0" distL="0" distR="0" wp14:anchorId="0E6EC62B" wp14:editId="4AB50E00">
+                <wp:inline distT="0" distB="0" distL="0" distR="0" wp14:anchorId="7D87DE44" wp14:editId="6066E3F1">
                   <wp:extent cx="457200" cy="457200"/>
                   <wp:effectExtent l="0" t="0" r="0" b="0"/>
                   <wp:docPr id="1007" name="nether_star.png"/>
@@ -4472,7 +4472,7 @@
                 <w:noProof/>
               </w:rPr>
               <w:drawing>
-                <wp:inline distT="0" distB="0" distL="0" distR="0" wp14:anchorId="1EE7008D" wp14:editId="1F0CDFF1">
+                <wp:inline distT="0" distB="0" distL="0" distR="0" wp14:anchorId="66437D86" wp14:editId="463369E0">
                   <wp:extent cx="457200" cy="457200"/>
                   <wp:effectExtent l="0" t="0" r="0" b="0"/>
                   <wp:docPr id="1008" name="ender_eye.png"/>
@@ -4560,7 +4560,7 @@
                 <w:noProof/>
               </w:rPr>
               <w:drawing>
-                <wp:inline distT="0" distB="0" distL="0" distR="0" wp14:anchorId="4BF7D54D" wp14:editId="7DBEC003">
+                <wp:inline distT="0" distB="0" distL="0" distR="0" wp14:anchorId="3D719B4E" wp14:editId="4A5FCC83">
                   <wp:extent cx="457200" cy="457200"/>
                   <wp:effectExtent l="0" t="0" r="0" b="0"/>
                   <wp:docPr id="1009" name="chest.png"/>
@@ -4642,7 +4642,7 @@
                 <w:noProof/>
               </w:rPr>
               <w:drawing>
-                <wp:inline distT="0" distB="0" distL="0" distR="0" wp14:anchorId="19D93984" wp14:editId="3D802B56">
+                <wp:inline distT="0" distB="0" distL="0" distR="0" wp14:anchorId="58359AE0" wp14:editId="1B8362B0">
                   <wp:extent cx="457200" cy="457200"/>
                   <wp:effectExtent l="0" t="0" r="0" b="0"/>
                   <wp:docPr id="1010" name="blue_glass.png"/>
@@ -4733,7 +4733,7 @@
                 <w:noProof/>
               </w:rPr>
               <w:drawing>
-                <wp:inline distT="0" distB="0" distL="0" distR="0" wp14:anchorId="790B466C" wp14:editId="4099A8AD">
+                <wp:inline distT="0" distB="0" distL="0" distR="0" wp14:anchorId="1A6DAF37" wp14:editId="7CE78A13">
                   <wp:extent cx="457200" cy="457200"/>
                   <wp:effectExtent l="0" t="0" r="0" b="0"/>
                   <wp:docPr id="1011" name="red_glass.png"/>
@@ -4824,7 +4824,7 @@
                 <w:noProof/>
               </w:rPr>
               <w:drawing>
-                <wp:inline distT="0" distB="0" distL="0" distR="0" wp14:anchorId="61E8D009" wp14:editId="3B81C548">
+                <wp:inline distT="0" distB="0" distL="0" distR="0" wp14:anchorId="59A8E47A" wp14:editId="3F51F39D">
                   <wp:extent cx="457200" cy="457200"/>
                   <wp:effectExtent l="0" t="0" r="0" b="0"/>
                   <wp:docPr id="1012" name="brush.png"/>
@@ -4906,7 +4906,7 @@
       <w:pPr>
         <w:pStyle w:val="Nadpis2"/>
       </w:pPr>
-      <w:bookmarkStart w:id="13" w:name="_Toc234366204"/>
+      <w:bookmarkStart w:id="13" w:name="_Toc235442173"/>
       <w:r>
         <w:t>4.2 How the double chests work</w:t>
       </w:r>
@@ -4951,7 +4951,7 @@
           <w:noProof/>
         </w:rPr>
         <w:drawing>
-          <wp:inline distT="0" distB="0" distL="0" distR="0" wp14:anchorId="7C7A3717" wp14:editId="77A068AF">
+          <wp:inline distT="0" distB="0" distL="0" distR="0" wp14:anchorId="45FB98F7" wp14:editId="602807C8">
             <wp:extent cx="3352800" cy="2590800"/>
             <wp:effectExtent l="0" t="0" r="0" b="0"/>
             <wp:docPr id="1013" name="sender_chest.png"/>
@@ -5032,7 +5032,7 @@
           <w:noProof/>
         </w:rPr>
         <w:drawing>
-          <wp:inline distT="0" distB="0" distL="0" distR="0" wp14:anchorId="5FDD012D" wp14:editId="3C830213">
+          <wp:inline distT="0" distB="0" distL="0" distR="0" wp14:anchorId="7ABF6B81" wp14:editId="1C8C2AA1">
             <wp:extent cx="3352800" cy="2590800"/>
             <wp:effectExtent l="0" t="0" r="0" b="0"/>
             <wp:docPr id="1014" name="gate_chest.png"/>
@@ -5087,7 +5087,7 @@
       <w:pPr>
         <w:pStyle w:val="Nadpis2"/>
       </w:pPr>
-      <w:bookmarkStart w:id="14" w:name="_Toc234366205"/>
+      <w:bookmarkStart w:id="14" w:name="_Toc235442174"/>
       <w:r>
         <w:t>4.3 Step by step</w:t>
       </w:r>
@@ -5360,7 +5360,7 @@
       <w:pPr>
         <w:pStyle w:val="Nadpis2"/>
       </w:pPr>
-      <w:bookmarkStart w:id="15" w:name="_Toc234366206"/>
+      <w:bookmarkStart w:id="15" w:name="_Toc235442175"/>
       <w:r>
         <w:t>4.4 Manual experiments</w:t>
       </w:r>
@@ -5538,7 +5538,7 @@
       <w:pPr>
         <w:pStyle w:val="Nadpis1"/>
       </w:pPr>
-      <w:bookmarkStart w:id="16" w:name="_Toc234366207"/>
+      <w:bookmarkStart w:id="16" w:name="_Toc235442176"/>
       <w:r>
         <w:t>5. Grover's Search Algorithm</w:t>
       </w:r>
@@ -5775,7 +5775,7 @@
       <w:pPr>
         <w:pStyle w:val="Nadpis2"/>
       </w:pPr>
-      <w:bookmarkStart w:id="17" w:name="_Toc234366208"/>
+      <w:bookmarkStart w:id="17" w:name="_Toc235442177"/>
       <w:r>
         <w:t>5.1 Tools and items</w:t>
       </w:r>
@@ -5882,7 +5882,7 @@
                 <w:noProof/>
               </w:rPr>
               <w:drawing>
-                <wp:inline distT="0" distB="0" distL="0" distR="0" wp14:anchorId="08F36DDE" wp14:editId="7DCAA4C0">
+                <wp:inline distT="0" distB="0" distL="0" distR="0" wp14:anchorId="484C1238" wp14:editId="2963BCDF">
                   <wp:extent cx="457200" cy="457200"/>
                   <wp:effectExtent l="0" t="0" r="0" b="0"/>
                   <wp:docPr id="1015" name="fire_charge.png"/>
@@ -5970,7 +5970,7 @@
                 <w:noProof/>
               </w:rPr>
               <w:drawing>
-                <wp:inline distT="0" distB="0" distL="0" distR="0" wp14:anchorId="621F6869" wp14:editId="69F57E5A">
+                <wp:inline distT="0" distB="0" distL="0" distR="0" wp14:anchorId="72517846" wp14:editId="3A7FF749">
                   <wp:extent cx="457200" cy="457200"/>
                   <wp:effectExtent l="0" t="0" r="0" b="0"/>
                   <wp:docPr id="1016" name="conduit.png"/>
@@ -6058,7 +6058,7 @@
                 <w:noProof/>
               </w:rPr>
               <w:drawing>
-                <wp:inline distT="0" distB="0" distL="0" distR="0" wp14:anchorId="09FD265B" wp14:editId="4FB51480">
+                <wp:inline distT="0" distB="0" distL="0" distR="0" wp14:anchorId="5A3E8E0D" wp14:editId="2CDC5D18">
                   <wp:extent cx="457200" cy="457200"/>
                   <wp:effectExtent l="0" t="0" r="0" b="0"/>
                   <wp:docPr id="1017" name="wind_charge.png"/>
@@ -6146,7 +6146,7 @@
                 <w:noProof/>
               </w:rPr>
               <w:drawing>
-                <wp:inline distT="0" distB="0" distL="0" distR="0" wp14:anchorId="70E0491D" wp14:editId="6761DCD6">
+                <wp:inline distT="0" distB="0" distL="0" distR="0" wp14:anchorId="1CEC296D" wp14:editId="2AFE0DEB">
                   <wp:extent cx="457200" cy="457200"/>
                   <wp:effectExtent l="0" t="0" r="0" b="0"/>
                   <wp:docPr id="1018" name="spyglass.png"/>
@@ -6234,7 +6234,7 @@
                 <w:noProof/>
               </w:rPr>
               <w:drawing>
-                <wp:inline distT="0" distB="0" distL="0" distR="0" wp14:anchorId="3061EEF6" wp14:editId="38191874">
+                <wp:inline distT="0" distB="0" distL="0" distR="0" wp14:anchorId="6F68C99C" wp14:editId="220B4C53">
                   <wp:extent cx="457200" cy="457200"/>
                   <wp:effectExtent l="0" t="0" r="0" b="0"/>
                   <wp:docPr id="1019" name="tnt.png"/>
@@ -6322,7 +6322,7 @@
                 <w:noProof/>
               </w:rPr>
               <w:drawing>
-                <wp:inline distT="0" distB="0" distL="0" distR="0" wp14:anchorId="35CBDFC0" wp14:editId="695398C5">
+                <wp:inline distT="0" distB="0" distL="0" distR="0" wp14:anchorId="267BE04C" wp14:editId="79589CC5">
                   <wp:extent cx="457200" cy="457200"/>
                   <wp:effectExtent l="0" t="0" r="0" b="0"/>
                   <wp:docPr id="1020" name="brush.png"/>
@@ -6404,7 +6404,7 @@
       <w:pPr>
         <w:pStyle w:val="Nadpis2"/>
       </w:pPr>
-      <w:bookmarkStart w:id="18" w:name="_Toc234366209"/>
+      <w:bookmarkStart w:id="18" w:name="_Toc235442178"/>
       <w:r>
         <w:t>5.2 Multiple grids at once</w:t>
       </w:r>
@@ -6461,7 +6461,7 @@
       <w:pPr>
         <w:pStyle w:val="Nadpis2"/>
       </w:pPr>
-      <w:bookmarkStart w:id="19" w:name="_Toc234366210"/>
+      <w:bookmarkStart w:id="19" w:name="_Toc235442179"/>
       <w:r>
         <w:t>5.3 Step by step</w:t>
       </w:r>
@@ -6723,7 +6723,7 @@
       <w:pPr>
         <w:pStyle w:val="Nadpis2"/>
       </w:pPr>
-      <w:bookmarkStart w:id="20" w:name="_Toc234366211"/>
+      <w:bookmarkStart w:id="20" w:name="_Toc235442180"/>
       <w:r>
         <w:t>5.4 Visualisation rules</w:t>
       </w:r>
@@ -6800,7 +6800,7 @@
       <w:pPr>
         <w:pStyle w:val="Nadpis1"/>
       </w:pPr>
-      <w:bookmarkStart w:id="21" w:name="_Toc234366212"/>
+      <w:bookmarkStart w:id="21" w:name="_Toc235442181"/>
       <w:r>
         <w:t>6. E91 — Entanglement Protocol</w:t>
       </w:r>
@@ -6892,7 +6892,7 @@
       <w:pPr>
         <w:pStyle w:val="Nadpis2"/>
       </w:pPr>
-      <w:bookmarkStart w:id="22" w:name="_Toc234366213"/>
+      <w:bookmarkStart w:id="22" w:name="_Toc235442182"/>
       <w:r>
         <w:t>6.1 Tools and items</w:t>
       </w:r>
@@ -6999,7 +6999,7 @@
                 <w:noProof/>
               </w:rPr>
               <w:drawing>
-                <wp:inline distT="0" distB="0" distL="0" distR="0" wp14:anchorId="4718BD78" wp14:editId="1B2980C2">
+                <wp:inline distT="0" distB="0" distL="0" distR="0" wp14:anchorId="5783379D" wp14:editId="5FF95A39">
                   <wp:extent cx="457200" cy="457200"/>
                   <wp:effectExtent l="0" t="0" r="0" b="0"/>
                   <wp:docPr id="1021" name="amethyst_shard.png"/>
@@ -7087,7 +7087,7 @@
                 <w:noProof/>
               </w:rPr>
               <w:drawing>
-                <wp:inline distT="0" distB="0" distL="0" distR="0" wp14:anchorId="223D55FD" wp14:editId="261897A3">
+                <wp:inline distT="0" distB="0" distL="0" distR="0" wp14:anchorId="7C0734E3" wp14:editId="3B84F628">
                   <wp:extent cx="457200" cy="457200"/>
                   <wp:effectExtent l="0" t="0" r="0" b="0"/>
                   <wp:docPr id="1022" name="compass.png"/>
@@ -7175,7 +7175,7 @@
                 <w:noProof/>
               </w:rPr>
               <w:drawing>
-                <wp:inline distT="0" distB="0" distL="0" distR="0" wp14:anchorId="187E220E" wp14:editId="39ED44C2">
+                <wp:inline distT="0" distB="0" distL="0" distR="0" wp14:anchorId="76E42296" wp14:editId="290FCE54">
                   <wp:extent cx="457200" cy="457200"/>
                   <wp:effectExtent l="0" t="0" r="0" b="0"/>
                   <wp:docPr id="1023" name="recovery_compass.png"/>
@@ -7263,7 +7263,7 @@
                 <w:noProof/>
               </w:rPr>
               <w:drawing>
-                <wp:inline distT="0" distB="0" distL="0" distR="0" wp14:anchorId="5E739FDD" wp14:editId="14C8D5E0">
+                <wp:inline distT="0" distB="0" distL="0" distR="0" wp14:anchorId="5E6B2D7A" wp14:editId="50BC8DAA">
                   <wp:extent cx="457200" cy="457200"/>
                   <wp:effectExtent l="0" t="0" r="0" b="0"/>
                   <wp:docPr id="1024" name="clock.png"/>
@@ -7351,7 +7351,7 @@
                 <w:noProof/>
               </w:rPr>
               <w:drawing>
-                <wp:inline distT="0" distB="0" distL="0" distR="0" wp14:anchorId="77C1BE20" wp14:editId="5EA7C3F7">
+                <wp:inline distT="0" distB="0" distL="0" distR="0" wp14:anchorId="6C93A59F" wp14:editId="7745B00E">
                   <wp:extent cx="457200" cy="457200"/>
                   <wp:effectExtent l="0" t="0" r="0" b="0"/>
                   <wp:docPr id="1025" name="diamond_axe.png"/>
@@ -7439,7 +7439,7 @@
                 <w:noProof/>
               </w:rPr>
               <w:drawing>
-                <wp:inline distT="0" distB="0" distL="0" distR="0" wp14:anchorId="6515BBC3" wp14:editId="0DD10A4D">
+                <wp:inline distT="0" distB="0" distL="0" distR="0" wp14:anchorId="47800D7C" wp14:editId="16922664">
                   <wp:extent cx="457200" cy="457200"/>
                   <wp:effectExtent l="0" t="0" r="0" b="0"/>
                   <wp:docPr id="1026" name="golden_axe.png"/>
@@ -7527,7 +7527,7 @@
                 <w:noProof/>
               </w:rPr>
               <w:drawing>
-                <wp:inline distT="0" distB="0" distL="0" distR="0" wp14:anchorId="2784D303" wp14:editId="2D9FE5EB">
+                <wp:inline distT="0" distB="0" distL="0" distR="0" wp14:anchorId="7FD783B8" wp14:editId="09E52F4B">
                   <wp:extent cx="457200" cy="457200"/>
                   <wp:effectExtent l="0" t="0" r="0" b="0"/>
                   <wp:docPr id="1027" name="brush.png"/>
@@ -7609,7 +7609,7 @@
       <w:pPr>
         <w:pStyle w:val="Nadpis2"/>
       </w:pPr>
-      <w:bookmarkStart w:id="23" w:name="_Toc234366214"/>
+      <w:bookmarkStart w:id="23" w:name="_Toc235442183"/>
       <w:r>
         <w:t>6.2 Step by step</w:t>
       </w:r>
@@ -7939,7 +7939,7 @@
       <w:pPr>
         <w:pStyle w:val="Nadpis2"/>
       </w:pPr>
-      <w:bookmarkStart w:id="24" w:name="_Toc234366215"/>
+      <w:bookmarkStart w:id="24" w:name="_Toc235442184"/>
       <w:r>
         <w:t>6.3 The physics behind it</w:t>
       </w:r>
@@ -7993,7 +7993,7 @@
       <w:pPr>
         <w:pStyle w:val="Nadpis1"/>
       </w:pPr>
-      <w:bookmarkStart w:id="25" w:name="_Toc234366216"/>
+      <w:bookmarkStart w:id="25" w:name="_Toc235442185"/>
       <w:r>
         <w:t>7. Plasma — the Lobby Effect</w:t>
       </w:r>
@@ -8008,7 +8008,7 @@
       <w:pPr>
         <w:pStyle w:val="Nadpis2"/>
       </w:pPr>
-      <w:bookmarkStart w:id="26" w:name="_Toc234366217"/>
+      <w:bookmarkStart w:id="26" w:name="_Toc235442186"/>
       <w:r>
         <w:t>7.1 Tools and commands</w:t>
       </w:r>
@@ -8115,7 +8115,7 @@
                 <w:noProof/>
               </w:rPr>
               <w:drawing>
-                <wp:inline distT="0" distB="0" distL="0" distR="0" wp14:anchorId="6A443B51" wp14:editId="56A46F30">
+                <wp:inline distT="0" distB="0" distL="0" distR="0" wp14:anchorId="3854170E" wp14:editId="0D054084">
                   <wp:extent cx="457200" cy="457200"/>
                   <wp:effectExtent l="0" t="0" r="0" b="0"/>
                   <wp:docPr id="1028" name="heart_of_the_sea.png"/>
@@ -8203,7 +8203,7 @@
                 <w:noProof/>
               </w:rPr>
               <w:drawing>
-                <wp:inline distT="0" distB="0" distL="0" distR="0" wp14:anchorId="7D4A5954" wp14:editId="2851E401">
+                <wp:inline distT="0" distB="0" distL="0" distR="0" wp14:anchorId="1D88C5EC" wp14:editId="231DAA87">
                   <wp:extent cx="457200" cy="457200"/>
                   <wp:effectExtent l="0" t="0" r="0" b="0"/>
                   <wp:docPr id="1029" name="echo_shard.png"/>
@@ -8317,7 +8317,7 @@
       <w:pPr>
         <w:pStyle w:val="Nadpis1"/>
       </w:pPr>
-      <w:bookmarkStart w:id="27" w:name="_Toc234366218"/>
+      <w:bookmarkStart w:id="27" w:name="_Toc235442187"/>
       <w:r>
         <w:t>8. Command Reference</w:t>
       </w:r>
@@ -8380,7 +8380,7 @@
       <w:pPr>
         <w:pStyle w:val="Nadpis2"/>
       </w:pPr>
-      <w:bookmarkStart w:id="28" w:name="_Toc234366219"/>
+      <w:bookmarkStart w:id="28" w:name="_Toc235442188"/>
       <w:r>
         <w:t>8.1 General</w:t>
       </w:r>
@@ -8598,7 +8598,7 @@
       <w:pPr>
         <w:pStyle w:val="Nadpis2"/>
       </w:pPr>
-      <w:bookmarkStart w:id="29" w:name="_Toc234366220"/>
+      <w:bookmarkStart w:id="29" w:name="_Toc235442189"/>
       <w:r>
         <w:t>8.2 BB84</w:t>
       </w:r>
@@ -9100,7 +9100,7 @@
       <w:pPr>
         <w:pStyle w:val="Nadpis2"/>
       </w:pPr>
-      <w:bookmarkStart w:id="30" w:name="_Toc234366221"/>
+      <w:bookmarkStart w:id="30" w:name="_Toc235442190"/>
       <w:r>
         <w:t>8.3 Grover ([id] optional with a single grid)</w:t>
       </w:r>
@@ -9456,7 +9456,7 @@
       <w:pPr>
         <w:pStyle w:val="Nadpis2"/>
       </w:pPr>
-      <w:bookmarkStart w:id="31" w:name="_Toc234366222"/>
+      <w:bookmarkStart w:id="31" w:name="_Toc235442191"/>
       <w:r>
         <w:t>8.4 E91</w:t>
       </w:r>
@@ -9822,7 +9822,7 @@
       <w:pPr>
         <w:pStyle w:val="Nadpis2"/>
       </w:pPr>
-      <w:bookmarkStart w:id="32" w:name="_Toc234366223"/>
+      <w:bookmarkStart w:id="32" w:name="_Toc235442192"/>
       <w:r>
         <w:t>8.5 Plasma, hall and tutorial</w:t>
       </w:r>
@@ -10108,7 +10108,7 @@
       <w:pPr>
         <w:pStyle w:val="Nadpis1"/>
       </w:pPr>
-      <w:bookmarkStart w:id="33" w:name="_Toc234366224"/>
+      <w:bookmarkStart w:id="33" w:name="_Toc235442193"/>
       <w:r>
         <w:t>9. Technical Notes</w:t>
       </w:r>
@@ -10128,7 +10128,7 @@
         <w:t>Versions:</w:t>
       </w:r>
       <w:r>
-        <w:t xml:space="preserve"> built against the Paper 1.21.4 API, Java 21; runs on newer Paper servers unchanged.</w:t>
+        <w:t xml:space="preserve"> built against the Paper 26.1.2 API, Java 25; requires Paper 26.1.2 or newer and matching 26.1.x clients.</w:t>
       </w:r>
     </w:p>
     <w:p>
@@ -10426,9 +10426,9 @@
 <file path=word/numbering.xml><?xml version="1.0" encoding="utf-8"?>
 <w:numbering xmlns:wpc="http://schemas.microsoft.com/office/word/2010/wordprocessingCanvas" xmlns:cx="http://schemas.microsoft.com/office/drawing/2014/chartex" xmlns:cx1="http://schemas.microsoft.com/office/drawing/2015/9/8/chartex" xmlns:cx2="http://schemas.microsoft.com/office/drawing/2015/10/21/chartex" xmlns:cx3="http://schemas.microsoft.com/office/drawing/2016/5/9/chartex" xmlns:cx4="http://schemas.microsoft.com/office/drawing/2016/5/10/chartex" xmlns:cx5="http://schemas.microsoft.com/office/drawing/2016/5/11/chartex" xmlns:cx6="http://schemas.microsoft.com/office/drawing/2016/5/12/chartex" xmlns:cx7="http://schemas.microsoft.com/office/drawing/2016/5/13/chartex" xmlns:cx8="http://schemas.microsoft.com/office/drawing/2016/5/14/chartex" xmlns:mc="http://schemas.openxmlformats.org/markup-compatibility/2006" xmlns:aink="http://schemas.microsoft.com/office/drawing/2016/ink" xmlns:am3d="http://schemas.microsoft.com/office/drawing/2017/model3d" xmlns:o="urn:schemas-microsoft-com:office:office" xmlns:oel="http://schemas.microsoft.com/office/2019/extlst" xmlns:r="http://schemas.openxmlformats.org/officeDocument/2006/relationships" xmlns:m="http://schemas.openxmlformats.org/officeDocument/2006/math" xmlns:v="urn:schemas-microsoft-com:vml" xmlns:wp14="http://schemas.microsoft.com/office/word/2010/wordprocessingDrawing" xmlns:wp="http://schemas.openxmlformats.org/drawingml/2006/wordprocessingDrawing" xmlns:w10="urn:schemas-microsoft-com:office:word" xmlns:w="http://schemas.openxmlformats.org/wordprocessingml/2006/main" xmlns:w14="http://schemas.microsoft.com/office/word/2010/wordml" xmlns:w15="http://schemas.microsoft.com/office/word/2012/wordml" xmlns:w16cex="http://schemas.microsoft.com/office/word/2018/wordml/cex" xmlns:w16cid="http://schemas.microsoft.com/office/word/2016/wordml/cid" xmlns:w16="http://schemas.microsoft.com/office/word/2018/wordml" xmlns:w16du="http://schemas.microsoft.com/office/word/2023/wordml/word16du" xmlns:w16sdtdh="http://schemas.microsoft.com/office/word/2020/wordml/sdtdatahash" xmlns:w16sdtfl="http://schemas.microsoft.com/office/word/2024/wordml/sdtformatlock" xmlns:w16se="http://schemas.microsoft.com/office/word/2015/wordml/symex" xmlns:wpg="http://schemas.microsoft.com/office/word/2010/wordprocessingGroup" xmlns:wpi="http://schemas.microsoft.com/office/word/2010/wordprocessingInk" xmlns:wne="http://schemas.microsoft.com/office/word/2006/wordml" xmlns:wps="http://schemas.microsoft.com/office/word/2010/wordprocessingShape" mc:Ignorable="w14 w15 w16se w16cid w16 w16cex w16sdtdh w16sdtfl w16du wp14">
   <w:abstractNum w:abstractNumId="0" w15:restartNumberingAfterBreak="0">
-    <w:nsid w:val="03F91C83"/>
+    <w:nsid w:val="27191CD5"/>
     <w:multiLevelType w:val="singleLevel"/>
-    <w:tmpl w:val="F9909FC0"/>
+    <w:tmpl w:val="84B472BA"/>
     <w:lvl w:ilvl="0">
       <w:start w:val="1"/>
       <w:numFmt w:val="decimal"/>
@@ -10440,9 +10440,9 @@
     </w:lvl>
   </w:abstractNum>
   <w:abstractNum w:abstractNumId="1" w15:restartNumberingAfterBreak="0">
-    <w:nsid w:val="2EAD6173"/>
+    <w:nsid w:val="67882BAE"/>
     <w:multiLevelType w:val="singleLevel"/>
-    <w:tmpl w:val="8110A7D8"/>
+    <w:tmpl w:val="FBA2028A"/>
     <w:lvl w:ilvl="0">
       <w:start w:val="1"/>
       <w:numFmt w:val="bullet"/>
@@ -10456,22 +10456,22 @@
       </w:rPr>
     </w:lvl>
   </w:abstractNum>
-  <w:num w:numId="1" w16cid:durableId="913467553">
+  <w:num w:numId="1" w16cid:durableId="1715083309">
     <w:abstractNumId w:val="1"/>
   </w:num>
-  <w:num w:numId="2" w16cid:durableId="1990865347">
+  <w:num w:numId="2" w16cid:durableId="280839999">
     <w:abstractNumId w:val="0"/>
     <w:lvlOverride w:ilvl="0">
       <w:startOverride w:val="1"/>
     </w:lvlOverride>
   </w:num>
-  <w:num w:numId="3" w16cid:durableId="1528720025">
+  <w:num w:numId="3" w16cid:durableId="1991980572">
     <w:abstractNumId w:val="0"/>
     <w:lvlOverride w:ilvl="0">
       <w:startOverride w:val="1"/>
     </w:lvlOverride>
   </w:num>
-  <w:num w:numId="4" w16cid:durableId="1784034749">
+  <w:num w:numId="4" w16cid:durableId="1925335578">
     <w:abstractNumId w:val="0"/>
     <w:lvlOverride w:ilvl="0">
       <w:startOverride w:val="1"/>

</xml_diff>